<commit_message>
Resolve #26: Remove detalhes visuais dos casos de uso de aluguel e pagamento
</commit_message>
<xml_diff>
--- a/Requisitos/Documentos de Casos de Uso/CSU05-Manter Aluguel Imóvel.docx
+++ b/Requisitos/Documentos de Casos de Uso/CSU05-Manter Aluguel Imóvel.docx
@@ -1,13 +1,14 @@
 
 <file path=word/document.xml><?xml version="1.0" encoding="utf-8"?>
-<w:document xmlns:mc="http://schemas.openxmlformats.org/markup-compatibility/2006" xmlns:o="urn:schemas-microsoft-com:office:office" xmlns:r="http://schemas.openxmlformats.org/officeDocument/2006/relationships" xmlns:m="http://schemas.openxmlformats.org/officeDocument/2006/math" xmlns:v="urn:schemas-microsoft-com:vml" xmlns:wp="http://schemas.openxmlformats.org/drawingml/2006/wordprocessingDrawing" xmlns:w10="urn:schemas-microsoft-com:office:word" xmlns:w="http://schemas.openxmlformats.org/wordprocessingml/2006/main" xmlns:wne="http://schemas.microsoft.com/office/word/2006/wordml" xmlns:sl="http://schemas.openxmlformats.org/schemaLibrary/2006/main" xmlns:a="http://schemas.openxmlformats.org/drawingml/2006/main" xmlns:pic="http://schemas.openxmlformats.org/drawingml/2006/picture" xmlns:c="http://schemas.openxmlformats.org/drawingml/2006/chart" xmlns:lc="http://schemas.openxmlformats.org/drawingml/2006/lockedCanvas" xmlns:dgm="http://schemas.openxmlformats.org/drawingml/2006/diagram" xmlns:wps="http://schemas.microsoft.com/office/word/2010/wordprocessingShape" xmlns:wpg="http://schemas.microsoft.com/office/word/2010/wordprocessingGroup" xmlns:w14="http://schemas.microsoft.com/office/word/2010/wordml" xmlns:w15="http://schemas.microsoft.com/office/word/2012/wordml" xmlns:w16="http://schemas.microsoft.com/office/word/2018/wordml" xmlns:w16cex="http://schemas.microsoft.com/office/word/2018/wordml/cex" xmlns:w16cid="http://schemas.microsoft.com/office/word/2016/wordml/cid" xmlns="http://schemas.microsoft.com/office/tasks/2019/documenttasks" xmlns:cr="http://schemas.microsoft.com/office/comments/2020/reactions">
+<w:document xmlns:wp14="http://schemas.microsoft.com/office/word/2010/wordprocessingDrawing" xmlns:mc="http://schemas.openxmlformats.org/markup-compatibility/2006" xmlns:o="urn:schemas-microsoft-com:office:office" xmlns:r="http://schemas.openxmlformats.org/officeDocument/2006/relationships" xmlns:m="http://schemas.openxmlformats.org/officeDocument/2006/math" xmlns:v="urn:schemas-microsoft-com:vml" xmlns:wp="http://schemas.openxmlformats.org/drawingml/2006/wordprocessingDrawing" xmlns:w10="urn:schemas-microsoft-com:office:word" xmlns:w="http://schemas.openxmlformats.org/wordprocessingml/2006/main" xmlns:wne="http://schemas.microsoft.com/office/word/2006/wordml" xmlns:sl="http://schemas.openxmlformats.org/schemaLibrary/2006/main" xmlns:a="http://schemas.openxmlformats.org/drawingml/2006/main" xmlns:pic="http://schemas.openxmlformats.org/drawingml/2006/picture" xmlns:c="http://schemas.openxmlformats.org/drawingml/2006/chart" xmlns:lc="http://schemas.openxmlformats.org/drawingml/2006/lockedCanvas" xmlns:dgm="http://schemas.openxmlformats.org/drawingml/2006/diagram" xmlns:wps="http://schemas.microsoft.com/office/word/2010/wordprocessingShape" xmlns:wpg="http://schemas.microsoft.com/office/word/2010/wordprocessingGroup" xmlns:w14="http://schemas.microsoft.com/office/word/2010/wordml" xmlns:w15="http://schemas.microsoft.com/office/word/2012/wordml" xmlns:w16="http://schemas.microsoft.com/office/word/2018/wordml" xmlns:w16cex="http://schemas.microsoft.com/office/word/2018/wordml/cex" xmlns:w16cid="http://schemas.microsoft.com/office/word/2016/wordml/cid" xmlns="http://schemas.microsoft.com/office/tasks/2019/documenttasks" xmlns:cr="http://schemas.microsoft.com/office/comments/2020/reactions" mc:Ignorable="wp14">
   <w:body>
-    <w:p>
+    <w:p xmlns:wp14="http://schemas.microsoft.com/office/word/2010/wordml" wp14:textId="77777777">
       <w:pPr>
         <w:jc w:val="center"/>
         <w:rPr>
           <w:sz w:val="36"/>
           <w:szCs w:val="36"/>
+          <w:lang w:val="en-US"/>
         </w:rPr>
       </w:pPr>
       <w:r>
@@ -17,7 +18,7 @@
           <w:color w:val="ff0000"/>
           <w:sz w:val="36"/>
           <w:szCs w:val="36"/>
-          <w:rtl w:val="0"/>
+          <w:lang w:val="en-US"/>
         </w:rPr>
         <w:t xml:space="preserve">CSU05: </w:t>
       </w:r>
@@ -27,7 +28,7 @@
           <w:bCs w:val="1"/>
           <w:sz w:val="36"/>
           <w:szCs w:val="36"/>
-          <w:rtl w:val="0"/>
+          <w:lang w:val="en-US"/>
         </w:rPr>
         <w:t xml:space="preserve">Manter aluguel de Imóveis</w:t>
       </w:r>
@@ -37,7 +38,7 @@
         </w:rPr>
       </w:r>
     </w:p>
-    <w:p>
+    <w:p xmlns:wp14="http://schemas.microsoft.com/office/word/2010/wordml" wp14:textId="77777777">
       <w:pPr>
         <w:rPr>
           <w:sz w:val="28"/>
@@ -50,14 +51,13 @@
         </w:rPr>
       </w:r>
     </w:p>
-    <w:p>
+    <w:p xmlns:wp14="http://schemas.microsoft.com/office/word/2010/wordml" wp14:textId="77777777">
       <w:pPr>
         <w:pStyle w:val="Heading1"/>
-        <w:rPr/>
       </w:pPr>
       <w:r>
         <w:rPr>
-          <w:rtl w:val="0"/>
+          <w:lang w:val="en-US"/>
         </w:rPr>
         <w:t xml:space="preserve">Seção: </w:t>
       </w:r>
@@ -65,7 +65,7 @@
         <w:rPr>
           <w:b w:val="0"/>
           <w:bCs w:val="0"/>
-          <w:rtl w:val="0"/>
+          <w:lang w:val="en-US"/>
         </w:rPr>
         <w:t xml:space="preserve">Principal</w:t>
       </w:r>
@@ -78,44 +78,43 @@
     <w:tbl>
       <w:tblPr>
         <w:tblStyle w:val="Table1"/>
-        <w:tblW w:w="10330.0" w:type="dxa"/>
+        <w:tblW w:w="10330" w:type="dxa"/>
         <w:jc w:val="left"/>
         <w:tblInd w:w="-70.0" w:type="dxa"/>
         <w:tblBorders>
-          <w:top w:color="000000" w:space="0" w:sz="4" w:val="single"/>
-          <w:left w:color="000000" w:space="0" w:sz="4" w:val="single"/>
-          <w:bottom w:color="000000" w:space="0" w:sz="4" w:val="single"/>
-          <w:right w:color="000000" w:space="0" w:sz="4" w:val="single"/>
-          <w:insideH w:color="000000" w:space="0" w:sz="4" w:val="single"/>
-          <w:insideV w:color="000000" w:space="0" w:sz="4" w:val="single"/>
+          <w:top w:val="single" w:color="000000" w:sz="4" w:space="0"/>
+          <w:left w:val="single" w:color="000000" w:sz="4" w:space="0"/>
+          <w:bottom w:val="single" w:color="000000" w:sz="4" w:space="0"/>
+          <w:right w:val="single" w:color="000000" w:sz="4" w:space="0"/>
+          <w:insideH w:val="single" w:color="000000" w:sz="4" w:space="0"/>
+          <w:insideV w:val="single" w:color="000000" w:sz="4" w:space="0"/>
         </w:tblBorders>
         <w:tblLayout w:type="fixed"/>
         <w:tblLook w:val="0000"/>
+        <w:tblPrChange w:author="" w:id="240801317">
+          <w:tblPr/>
+        </w:tblPrChange>
       </w:tblPr>
       <w:tblGrid>
         <w:gridCol w:w="2905"/>
         <w:gridCol w:w="7425"/>
-        <w:tblGridChange w:id="0">
-          <w:tblGrid>
-            <w:gridCol w:w="2905"/>
-            <w:gridCol w:w="7425"/>
-          </w:tblGrid>
-        </w:tblGridChange>
       </w:tblGrid>
-      <w:tr>
+      <w:tr xmlns:wp14="http://schemas.microsoft.com/office/word/2010/wordml" wp14:textId="77777777">
         <w:trPr>
           <w:cantSplit w:val="0"/>
           <w:tblHeader w:val="0"/>
         </w:trPr>
         <w:tc>
           <w:tcPr>
-            <w:vAlign w:val="top"/>
-          </w:tcPr>
-          <w:p>
-            <w:pPr>
-              <w:rPr>
-                <w:sz w:val="28"/>
-                <w:szCs w:val="28"/>
+            <w:tcMar/>
+            <w:vAlign w:val="top"/>
+          </w:tcPr>
+          <w:p wp14:textId="77777777">
+            <w:pPr>
+              <w:rPr>
+                <w:sz w:val="28"/>
+                <w:szCs w:val="28"/>
+                <w:lang w:val="en-US"/>
               </w:rPr>
             </w:pPr>
             <w:r>
@@ -124,7 +123,7 @@
                 <w:bCs w:val="1"/>
                 <w:sz w:val="28"/>
                 <w:szCs w:val="28"/>
-                <w:rtl w:val="0"/>
+                <w:lang w:val="en-US"/>
               </w:rPr>
               <w:t xml:space="preserve">Importância</w:t>
             </w:r>
@@ -137,27 +136,29 @@
         </w:tc>
         <w:tc>
           <w:tcPr>
-            <w:vAlign w:val="top"/>
-          </w:tcPr>
-          <w:p>
+            <w:tcMar/>
+            <w:vAlign w:val="top"/>
+          </w:tcPr>
+          <w:p wp14:textId="77777777">
             <w:pPr>
               <w:pStyle w:val="Heading1"/>
               <w:rPr>
                 <w:b w:val="0"/>
                 <w:bCs w:val="0"/>
+                <w:lang w:val="en-US"/>
               </w:rPr>
             </w:pPr>
             <w:r>
               <w:rPr>
                 <w:b w:val="0"/>
                 <w:bCs w:val="0"/>
-                <w:rtl w:val="0"/>
+                <w:lang w:val="en-US"/>
               </w:rPr>
               <w:t xml:space="preserve">85 (</w:t>
             </w:r>
             <w:r>
               <w:rPr>
-                <w:rtl w:val="0"/>
+                <w:lang w:val="en-US"/>
               </w:rPr>
               <w:t xml:space="preserve">Risco Médio e Prioridade Alta)</w:t>
             </w:r>
@@ -169,20 +170,22 @@
           </w:p>
         </w:tc>
       </w:tr>
-      <w:tr>
+      <w:tr xmlns:wp14="http://schemas.microsoft.com/office/word/2010/wordml" wp14:textId="77777777">
         <w:trPr>
           <w:cantSplit w:val="0"/>
           <w:tblHeader w:val="0"/>
         </w:trPr>
         <w:tc>
           <w:tcPr>
-            <w:vAlign w:val="top"/>
-          </w:tcPr>
-          <w:p>
-            <w:pPr>
-              <w:rPr>
-                <w:sz w:val="28"/>
-                <w:szCs w:val="28"/>
+            <w:tcMar/>
+            <w:vAlign w:val="top"/>
+          </w:tcPr>
+          <w:p wp14:textId="77777777">
+            <w:pPr>
+              <w:rPr>
+                <w:sz w:val="28"/>
+                <w:szCs w:val="28"/>
+                <w:lang w:val="en-US"/>
               </w:rPr>
             </w:pPr>
             <w:r>
@@ -191,7 +194,7 @@
                 <w:bCs w:val="1"/>
                 <w:sz w:val="28"/>
                 <w:szCs w:val="28"/>
-                <w:rtl w:val="0"/>
+                <w:lang w:val="en-US"/>
               </w:rPr>
               <w:t xml:space="preserve">Sumário</w:t>
             </w:r>
@@ -205,10 +208,10 @@
         <w:tc>
           <w:tcPr>
             <w:tcBorders>
-              <w:top w:color="000000" w:space="0" w:sz="6" w:val="single"/>
-              <w:left w:color="000000" w:space="0" w:sz="6" w:val="single"/>
-              <w:bottom w:color="000000" w:space="0" w:sz="6" w:val="single"/>
-              <w:right w:color="000000" w:space="0" w:sz="6" w:val="single"/>
+              <w:top w:val="single" w:color="000000" w:themeColor="text1" w:sz="6" w:space="0"/>
+              <w:left w:val="single" w:color="000000" w:themeColor="text1" w:sz="6" w:space="0"/>
+              <w:bottom w:val="single" w:color="000000" w:themeColor="text1" w:sz="6" w:space="0"/>
+              <w:right w:val="single" w:color="000000" w:themeColor="text1" w:sz="6" w:space="0"/>
             </w:tcBorders>
             <w:tcMar>
               <w:top w:w="0.0" w:type="dxa"/>
@@ -218,39 +221,42 @@
             </w:tcMar>
             <w:vAlign w:val="top"/>
           </w:tcPr>
-          <w:p>
+          <w:p wp14:textId="77777777">
             <w:pPr>
               <w:ind w:left="-60" w:firstLine="0"/>
               <w:rPr>
                 <w:sz w:val="28"/>
                 <w:szCs w:val="28"/>
-              </w:rPr>
-            </w:pPr>
-            <w:r>
-              <w:rPr>
-                <w:sz w:val="28"/>
-                <w:szCs w:val="28"/>
-                <w:rtl w:val="0"/>
-              </w:rPr>
-              <w:t xml:space="preserve">O proprietário precisa criar, editar, excluir e visualizar aluguel de imóveis.</w:t>
+                <w:lang w:val="en-US"/>
+              </w:rPr>
+            </w:pPr>
+            <w:r>
+              <w:rPr>
+                <w:sz w:val="28"/>
+                <w:szCs w:val="28"/>
+                <w:lang w:val="en-US"/>
+              </w:rPr>
+              <w:t>O proprietário precisa criar, editar, excluir e visualizar aluguel de imóveis.</w:t>
             </w:r>
           </w:p>
         </w:tc>
       </w:tr>
-      <w:tr>
+      <w:tr xmlns:wp14="http://schemas.microsoft.com/office/word/2010/wordml" wp14:textId="77777777">
         <w:trPr>
           <w:cantSplit w:val="0"/>
           <w:tblHeader w:val="0"/>
         </w:trPr>
         <w:tc>
           <w:tcPr>
-            <w:vAlign w:val="top"/>
-          </w:tcPr>
-          <w:p>
-            <w:pPr>
-              <w:rPr>
-                <w:sz w:val="28"/>
-                <w:szCs w:val="28"/>
+            <w:tcMar/>
+            <w:vAlign w:val="top"/>
+          </w:tcPr>
+          <w:p wp14:textId="77777777">
+            <w:pPr>
+              <w:rPr>
+                <w:sz w:val="28"/>
+                <w:szCs w:val="28"/>
+                <w:lang w:val="en-US"/>
               </w:rPr>
             </w:pPr>
             <w:r>
@@ -259,7 +265,7 @@
                 <w:bCs w:val="1"/>
                 <w:sz w:val="28"/>
                 <w:szCs w:val="28"/>
-                <w:rtl w:val="0"/>
+                <w:lang w:val="en-US"/>
               </w:rPr>
               <w:t xml:space="preserve">Ator Primário</w:t>
             </w:r>
@@ -272,40 +278,44 @@
         </w:tc>
         <w:tc>
           <w:tcPr>
-            <w:vAlign w:val="top"/>
-          </w:tcPr>
-          <w:p>
-            <w:pPr>
-              <w:rPr>
-                <w:sz w:val="28"/>
-                <w:szCs w:val="28"/>
-              </w:rPr>
-            </w:pPr>
-            <w:r>
-              <w:rPr>
-                <w:sz w:val="28"/>
-                <w:szCs w:val="28"/>
-                <w:rtl w:val="0"/>
-              </w:rPr>
-              <w:t xml:space="preserve">Proprietário</w:t>
+            <w:tcMar/>
+            <w:vAlign w:val="top"/>
+          </w:tcPr>
+          <w:p wp14:textId="77777777">
+            <w:pPr>
+              <w:rPr>
+                <w:sz w:val="28"/>
+                <w:szCs w:val="28"/>
+                <w:lang w:val="en-US"/>
+              </w:rPr>
+            </w:pPr>
+            <w:r>
+              <w:rPr>
+                <w:sz w:val="28"/>
+                <w:szCs w:val="28"/>
+                <w:lang w:val="en-US"/>
+              </w:rPr>
+              <w:t>Proprietário</w:t>
             </w:r>
           </w:p>
         </w:tc>
       </w:tr>
-      <w:tr>
+      <w:tr xmlns:wp14="http://schemas.microsoft.com/office/word/2010/wordml" wp14:textId="77777777">
         <w:trPr>
           <w:cantSplit w:val="0"/>
           <w:tblHeader w:val="0"/>
         </w:trPr>
         <w:tc>
           <w:tcPr>
-            <w:vAlign w:val="top"/>
-          </w:tcPr>
-          <w:p>
-            <w:pPr>
-              <w:rPr>
-                <w:sz w:val="28"/>
-                <w:szCs w:val="28"/>
+            <w:tcMar/>
+            <w:vAlign w:val="top"/>
+          </w:tcPr>
+          <w:p wp14:textId="77777777">
+            <w:pPr>
+              <w:rPr>
+                <w:sz w:val="28"/>
+                <w:szCs w:val="28"/>
+                <w:lang w:val="en-US"/>
               </w:rPr>
             </w:pPr>
             <w:r>
@@ -314,7 +324,7 @@
                 <w:bCs w:val="1"/>
                 <w:sz w:val="28"/>
                 <w:szCs w:val="28"/>
-                <w:rtl w:val="0"/>
+                <w:lang w:val="en-US"/>
               </w:rPr>
               <w:t xml:space="preserve">Ator Secundário</w:t>
             </w:r>
@@ -327,9 +337,10 @@
         </w:tc>
         <w:tc>
           <w:tcPr>
-            <w:vAlign w:val="top"/>
-          </w:tcPr>
-          <w:p>
+            <w:tcMar/>
+            <w:vAlign w:val="top"/>
+          </w:tcPr>
+          <w:p wp14:textId="77777777">
             <w:pPr>
               <w:rPr>
                 <w:sz w:val="28"/>
@@ -347,20 +358,22 @@
           </w:p>
         </w:tc>
       </w:tr>
-      <w:tr>
+      <w:tr xmlns:wp14="http://schemas.microsoft.com/office/word/2010/wordml" wp14:textId="77777777">
         <w:trPr>
           <w:cantSplit w:val="0"/>
           <w:tblHeader w:val="0"/>
         </w:trPr>
         <w:tc>
           <w:tcPr>
-            <w:vAlign w:val="top"/>
-          </w:tcPr>
-          <w:p>
-            <w:pPr>
-              <w:rPr>
-                <w:sz w:val="28"/>
-                <w:szCs w:val="28"/>
+            <w:tcMar/>
+            <w:vAlign w:val="top"/>
+          </w:tcPr>
+          <w:p wp14:textId="77777777">
+            <w:pPr>
+              <w:rPr>
+                <w:sz w:val="28"/>
+                <w:szCs w:val="28"/>
+                <w:lang w:val="en-US"/>
               </w:rPr>
             </w:pPr>
             <w:r>
@@ -369,7 +382,7 @@
                 <w:bCs w:val="1"/>
                 <w:sz w:val="28"/>
                 <w:szCs w:val="28"/>
-                <w:rtl w:val="0"/>
+                <w:lang w:val="en-US"/>
               </w:rPr>
               <w:t xml:space="preserve">Pré-Condição</w:t>
             </w:r>
@@ -382,57 +395,61 @@
         </w:tc>
         <w:tc>
           <w:tcPr>
-            <w:vAlign w:val="top"/>
-          </w:tcPr>
-          <w:p>
-            <w:pPr>
-              <w:rPr>
-                <w:sz w:val="28"/>
-                <w:szCs w:val="28"/>
-              </w:rPr>
-            </w:pPr>
-            <w:r>
-              <w:rPr>
-                <w:sz w:val="28"/>
-                <w:szCs w:val="28"/>
-                <w:rtl w:val="0"/>
+            <w:tcMar/>
+            <w:vAlign w:val="top"/>
+          </w:tcPr>
+          <w:p wp14:textId="77777777">
+            <w:pPr>
+              <w:rPr>
+                <w:sz w:val="28"/>
+                <w:szCs w:val="28"/>
+                <w:lang w:val="en-US"/>
+              </w:rPr>
+            </w:pPr>
+            <w:r>
+              <w:rPr>
+                <w:sz w:val="28"/>
+                <w:szCs w:val="28"/>
+                <w:lang w:val="en-US"/>
               </w:rPr>
               <w:t xml:space="preserve">O proprietário fez a rotina de autenticação no sistema conforme </w:t>
             </w:r>
             <w:r>
               <w:rPr>
-                <w:color w:val="ff0000"/>
-                <w:sz w:val="28"/>
-                <w:szCs w:val="28"/>
-                <w:rtl w:val="0"/>
-              </w:rPr>
-              <w:t xml:space="preserve">CSU01-Autenticar Usuario</w:t>
-            </w:r>
-            <w:r>
-              <w:rPr>
-                <w:sz w:val="28"/>
-                <w:szCs w:val="28"/>
-                <w:rtl w:val="0"/>
-              </w:rPr>
-              <w:t xml:space="preserve">.</w:t>
+                <w:color w:val="FF0000"/>
+                <w:sz w:val="28"/>
+                <w:szCs w:val="28"/>
+                <w:lang w:val="en-US"/>
+              </w:rPr>
+              <w:t>CSU01-Autenticar Usuario</w:t>
+            </w:r>
+            <w:r>
+              <w:rPr>
+                <w:sz w:val="28"/>
+                <w:szCs w:val="28"/>
+                <w:lang w:val="en-US"/>
+              </w:rPr>
+              <w:t>.</w:t>
             </w:r>
           </w:p>
         </w:tc>
       </w:tr>
-      <w:tr>
+      <w:tr xmlns:wp14="http://schemas.microsoft.com/office/word/2010/wordml" wp14:textId="77777777">
         <w:trPr>
           <w:cantSplit w:val="0"/>
           <w:tblHeader w:val="0"/>
         </w:trPr>
         <w:tc>
           <w:tcPr>
-            <w:vAlign w:val="top"/>
-          </w:tcPr>
-          <w:p>
-            <w:pPr>
-              <w:rPr>
-                <w:sz w:val="28"/>
-                <w:szCs w:val="28"/>
+            <w:tcMar/>
+            <w:vAlign w:val="top"/>
+          </w:tcPr>
+          <w:p wp14:textId="77777777">
+            <w:pPr>
+              <w:rPr>
+                <w:sz w:val="28"/>
+                <w:szCs w:val="28"/>
+                <w:lang w:val="en-US"/>
               </w:rPr>
             </w:pPr>
             <w:r>
@@ -441,7 +458,7 @@
                 <w:bCs w:val="1"/>
                 <w:sz w:val="28"/>
                 <w:szCs w:val="28"/>
-                <w:rtl w:val="0"/>
+                <w:lang w:val="en-US"/>
               </w:rPr>
               <w:t xml:space="preserve">Pós-Condição</w:t>
             </w:r>
@@ -454,9 +471,10 @@
         </w:tc>
         <w:tc>
           <w:tcPr>
-            <w:vAlign w:val="top"/>
-          </w:tcPr>
-          <w:p>
+            <w:tcMar/>
+            <w:vAlign w:val="top"/>
+          </w:tcPr>
+          <w:p wp14:textId="77777777">
             <w:pPr>
               <w:rPr>
                 <w:sz w:val="28"/>
@@ -474,7 +492,7 @@
           </w:p>
         </w:tc>
       </w:tr>
-      <w:tr>
+      <w:tr xmlns:wp14="http://schemas.microsoft.com/office/word/2010/wordml" wp14:textId="77777777">
         <w:trPr>
           <w:cantSplit w:val="1"/>
           <w:trHeight w:val="422" w:hRule="atLeast"/>
@@ -483,18 +501,18 @@
         <w:tc>
           <w:tcPr>
             <w:gridSpan w:val="2"/>
-            <w:vAlign w:val="top"/>
-          </w:tcPr>
-          <w:p>
+            <w:tcMar/>
+            <w:vAlign w:val="top"/>
+          </w:tcPr>
+          <w:p wp14:textId="77777777">
             <w:pPr>
               <w:pStyle w:val="Heading2"/>
-              <w:rPr/>
             </w:pPr>
             <w:r>
               <w:rPr>
                 <w:b w:val="1"/>
                 <w:bCs w:val="1"/>
-                <w:rtl w:val="0"/>
+                <w:lang w:val="en-US"/>
               </w:rPr>
               <w:t xml:space="preserve">Fluxo Principal</w:t>
             </w:r>
@@ -506,7 +524,7 @@
           </w:p>
         </w:tc>
       </w:tr>
-      <w:tr>
+      <w:tr xmlns:wp14="http://schemas.microsoft.com/office/word/2010/wordml" wp14:textId="77777777">
         <w:trPr>
           <w:cantSplit w:val="0"/>
           <w:trHeight w:val="1615" w:hRule="atLeast"/>
@@ -515,9 +533,10 @@
         <w:tc>
           <w:tcPr>
             <w:gridSpan w:val="2"/>
-            <w:vAlign w:val="top"/>
-          </w:tcPr>
-          <w:p>
+            <w:tcMar/>
+            <w:vAlign w:val="top"/>
+          </w:tcPr>
+          <w:p wp14:textId="77777777">
             <w:pPr>
               <w:numPr>
                 <w:ilvl w:val="0"/>
@@ -527,13 +546,14 @@
               <w:rPr>
                 <w:sz w:val="28"/>
                 <w:szCs w:val="28"/>
+                <w:lang w:val="en-US"/>
               </w:rPr>
             </w:pPr>
             <w:r>
               <w:rPr>
                 <w:sz w:val="14"/>
                 <w:szCs w:val="14"/>
-                <w:rtl w:val="0"/>
+                <w:lang w:val="en-US"/>
               </w:rPr>
               <w:t xml:space="preserve"> </w:t>
             </w:r>
@@ -541,46 +561,46 @@
               <w:rPr>
                 <w:sz w:val="28"/>
                 <w:szCs w:val="28"/>
-                <w:rtl w:val="0"/>
-              </w:rPr>
-              <w:t xml:space="preserve">Ator seleciona a opção do menu do sistema (ícone com três linhas horizontais) (</w:t>
-            </w:r>
-            <w:r>
-              <w:rPr>
-                <w:color w:val="ff0000"/>
-                <w:sz w:val="28"/>
-                <w:szCs w:val="28"/>
-                <w:rtl w:val="0"/>
-              </w:rPr>
-              <w:t xml:space="preserve">Tela_001</w:t>
-            </w:r>
-            <w:r>
-              <w:rPr>
-                <w:sz w:val="28"/>
-                <w:szCs w:val="28"/>
-                <w:rtl w:val="0"/>
-              </w:rPr>
-              <w:t xml:space="preserve">) e, em seguida, seleciona a opção "Gestão de Imóveis" (</w:t>
-            </w:r>
-            <w:r>
-              <w:rPr>
-                <w:color w:val="ff0000"/>
-                <w:sz w:val="28"/>
-                <w:szCs w:val="28"/>
-                <w:rtl w:val="0"/>
-              </w:rPr>
-              <w:t xml:space="preserve">Tela_001.1</w:t>
-            </w:r>
-            <w:r>
-              <w:rPr>
-                <w:sz w:val="28"/>
-                <w:szCs w:val="28"/>
-                <w:rtl w:val="0"/>
+                <w:lang w:val="en-US"/>
+              </w:rPr>
+              <w:t>Ator seleciona a opção do menu do sistema (ícone com três linhas horizontais) (</w:t>
+            </w:r>
+            <w:r>
+              <w:rPr>
+                <w:color w:val="FF0000"/>
+                <w:sz w:val="28"/>
+                <w:szCs w:val="28"/>
+                <w:lang w:val="en-US"/>
+              </w:rPr>
+              <w:t>Tela_001</w:t>
+            </w:r>
+            <w:r>
+              <w:rPr>
+                <w:sz w:val="28"/>
+                <w:szCs w:val="28"/>
+                <w:lang w:val="en-US"/>
+              </w:rPr>
+              <w:t>) e, em seguida, seleciona a opção "Gestão de Imóveis" (</w:t>
+            </w:r>
+            <w:r>
+              <w:rPr>
+                <w:color w:val="FF0000"/>
+                <w:sz w:val="28"/>
+                <w:szCs w:val="28"/>
+                <w:lang w:val="en-US"/>
+              </w:rPr>
+              <w:t>Tela_001.1</w:t>
+            </w:r>
+            <w:r>
+              <w:rPr>
+                <w:sz w:val="28"/>
+                <w:szCs w:val="28"/>
+                <w:lang w:val="en-US"/>
               </w:rPr>
               <w:t xml:space="preserve">). </w:t>
             </w:r>
           </w:p>
-          <w:p>
+          <w:p wp14:textId="77777777">
             <w:pPr>
               <w:numPr>
                 <w:ilvl w:val="0"/>
@@ -590,35 +610,36 @@
               <w:rPr>
                 <w:sz w:val="28"/>
                 <w:szCs w:val="28"/>
-              </w:rPr>
-            </w:pPr>
-            <w:r>
-              <w:rPr>
-                <w:sz w:val="28"/>
-                <w:szCs w:val="28"/>
-                <w:rtl w:val="0"/>
-              </w:rPr>
-              <w:t xml:space="preserve">Sistema exibe tela listando todos os anúncios de imóveis cadastrados pelo proprietário, com opção de busca (</w:t>
-            </w:r>
-            <w:r>
-              <w:rPr>
-                <w:color w:val="ff0000"/>
-                <w:sz w:val="28"/>
-                <w:szCs w:val="28"/>
-                <w:rtl w:val="0"/>
-              </w:rPr>
-              <w:t xml:space="preserve">Tela_010</w:t>
-            </w:r>
-            <w:r>
-              <w:rPr>
-                <w:sz w:val="28"/>
-                <w:szCs w:val="28"/>
-                <w:rtl w:val="0"/>
+                <w:lang w:val="en-US"/>
+              </w:rPr>
+            </w:pPr>
+            <w:r>
+              <w:rPr>
+                <w:sz w:val="28"/>
+                <w:szCs w:val="28"/>
+                <w:lang w:val="en-US"/>
+              </w:rPr>
+              <w:t>Sistema exibe tela listando todos os anúncios de imóveis cadastrados pelo proprietário, com opção de busca (</w:t>
+            </w:r>
+            <w:r>
+              <w:rPr>
+                <w:color w:val="FF0000"/>
+                <w:sz w:val="28"/>
+                <w:szCs w:val="28"/>
+                <w:lang w:val="en-US"/>
+              </w:rPr>
+              <w:t>Tela_010</w:t>
+            </w:r>
+            <w:r>
+              <w:rPr>
+                <w:sz w:val="28"/>
+                <w:szCs w:val="28"/>
+                <w:lang w:val="en-US"/>
               </w:rPr>
               <w:t xml:space="preserve">). </w:t>
             </w:r>
           </w:p>
-          <w:p>
+          <w:p wp14:textId="77777777">
             <w:pPr>
               <w:numPr>
                 <w:ilvl w:val="0"/>
@@ -628,18 +649,19 @@
               <w:rPr>
                 <w:sz w:val="28"/>
                 <w:szCs w:val="28"/>
-              </w:rPr>
-            </w:pPr>
-            <w:r>
-              <w:rPr>
-                <w:sz w:val="28"/>
-                <w:szCs w:val="28"/>
-                <w:rtl w:val="0"/>
-              </w:rPr>
-              <w:t xml:space="preserve">Ator seleciona uma das opções disponibilizadas pelo sistema para o imóvel escolhido: vincular inquilino, ver aluguel, editar aluguel ou cancelar aluguel.</w:t>
-            </w:r>
-          </w:p>
-          <w:p>
+                <w:lang w:val="en-US"/>
+              </w:rPr>
+            </w:pPr>
+            <w:r>
+              <w:rPr>
+                <w:sz w:val="28"/>
+                <w:szCs w:val="28"/>
+                <w:lang w:val="en-US"/>
+              </w:rPr>
+              <w:t>Ator seleciona uma das opções disponibilizadas pelo sistema para o imóvel escolhido: vincular inquilino, ver aluguel, editar aluguel ou cancelar aluguel.</w:t>
+            </w:r>
+          </w:p>
+          <w:p wp14:textId="77777777">
             <w:pPr>
               <w:numPr>
                 <w:ilvl w:val="0"/>
@@ -649,30 +671,32 @@
               <w:rPr>
                 <w:sz w:val="28"/>
                 <w:szCs w:val="28"/>
-              </w:rPr>
-            </w:pPr>
-            <w:r>
-              <w:rPr>
-                <w:sz w:val="28"/>
-                <w:szCs w:val="28"/>
-                <w:rtl w:val="0"/>
-              </w:rPr>
-              <w:t xml:space="preserve">4. Caso a opção seja:</w:t>
-            </w:r>
-          </w:p>
-          <w:p>
+                <w:lang w:val="en-US"/>
+              </w:rPr>
+            </w:pPr>
+            <w:r>
+              <w:rPr>
+                <w:sz w:val="28"/>
+                <w:szCs w:val="28"/>
+                <w:lang w:val="en-US"/>
+              </w:rPr>
+              <w:t>4. Caso a opção seja:</w:t>
+            </w:r>
+          </w:p>
+          <w:p wp14:textId="77777777">
             <w:pPr>
               <w:ind w:left="360" w:firstLine="0"/>
               <w:rPr>
                 <w:sz w:val="28"/>
                 <w:szCs w:val="28"/>
-              </w:rPr>
-            </w:pPr>
-            <w:r>
-              <w:rPr>
-                <w:sz w:val="28"/>
-                <w:szCs w:val="28"/>
-                <w:rtl w:val="0"/>
+                <w:lang w:val="en-US"/>
+              </w:rPr>
+            </w:pPr>
+            <w:r>
+              <w:rPr>
+                <w:sz w:val="28"/>
+                <w:szCs w:val="28"/>
+                <w:lang w:val="en-US"/>
               </w:rPr>
               <w:t xml:space="preserve">a) </w:t>
             </w:r>
@@ -682,50 +706,51 @@
                 <w:bCs w:val="1"/>
                 <w:sz w:val="28"/>
                 <w:szCs w:val="28"/>
-                <w:rtl w:val="0"/>
-              </w:rPr>
-              <w:t xml:space="preserve">Alugar:</w:t>
-            </w:r>
-            <w:r>
-              <w:rPr>
-                <w:sz w:val="28"/>
-                <w:szCs w:val="28"/>
-                <w:rtl w:val="0"/>
+                <w:lang w:val="en-US"/>
+              </w:rPr>
+              <w:t>Alugar:</w:t>
+            </w:r>
+            <w:r>
+              <w:rPr>
+                <w:sz w:val="28"/>
+                <w:szCs w:val="28"/>
+                <w:lang w:val="en-US"/>
               </w:rPr>
               <w:t xml:space="preserve"> Ator pressiona o botão referente ao imóvel disponível escolhido, e o sistema exibe a tela de vínculo do inquilino (</w:t>
             </w:r>
             <w:r>
               <w:rPr>
+                <w:color w:val="FF0000"/>
+                <w:sz w:val="28"/>
+                <w:szCs w:val="28"/>
+                <w:lang w:val="en-US"/>
+              </w:rPr>
+              <w:t>Tela_011</w:t>
+            </w:r>
+            <w:r>
+              <w:rPr>
+                <w:sz w:val="28"/>
+                <w:szCs w:val="28"/>
+                <w:lang w:val="en-US"/>
+              </w:rPr>
+              <w:t xml:space="preserve">); </w:t>
+            </w:r>
+          </w:p>
+          <w:p wp14:textId="77777777">
+            <w:pPr>
+              <w:ind w:left="360" w:firstLine="0"/>
+              <w:rPr>
                 <w:color w:val="ff0000"/>
                 <w:sz w:val="28"/>
                 <w:szCs w:val="28"/>
-                <w:rtl w:val="0"/>
-              </w:rPr>
-              <w:t xml:space="preserve">Tela_011</w:t>
-            </w:r>
-            <w:r>
-              <w:rPr>
-                <w:sz w:val="28"/>
-                <w:szCs w:val="28"/>
-                <w:rtl w:val="0"/>
-              </w:rPr>
-              <w:t xml:space="preserve">); </w:t>
-            </w:r>
-          </w:p>
-          <w:p>
-            <w:pPr>
-              <w:ind w:left="360" w:firstLine="0"/>
-              <w:rPr>
-                <w:color w:val="ff0000"/>
-                <w:sz w:val="28"/>
-                <w:szCs w:val="28"/>
-              </w:rPr>
-            </w:pPr>
-            <w:r>
-              <w:rPr>
-                <w:sz w:val="28"/>
-                <w:szCs w:val="28"/>
-                <w:rtl w:val="0"/>
+                <w:lang w:val="en-US"/>
+              </w:rPr>
+            </w:pPr>
+            <w:r>
+              <w:rPr>
+                <w:sz w:val="28"/>
+                <w:szCs w:val="28"/>
+                <w:lang w:val="en-US"/>
               </w:rPr>
               <w:t xml:space="preserve">b) </w:t>
             </w:r>
@@ -735,7 +760,7 @@
                 <w:bCs w:val="1"/>
                 <w:sz w:val="28"/>
                 <w:szCs w:val="28"/>
-                <w:rtl w:val="0"/>
+                <w:lang w:val="en-US"/>
               </w:rPr>
               <w:t xml:space="preserve">Ver Aluguel:</w:t>
             </w:r>
@@ -743,7 +768,7 @@
               <w:rPr>
                 <w:sz w:val="28"/>
                 <w:szCs w:val="28"/>
-                <w:rtl w:val="0"/>
+                <w:lang w:val="en-US"/>
               </w:rPr>
               <w:t xml:space="preserve"> Ator pressiona o botão "Ver aluguel" referente a um imóvel já alugado, e o sistema exibe os dados do aluguel e o histórico de pagamentos (</w:t>
             </w:r>
@@ -752,7 +777,7 @@
                 <w:color w:val="ff0000"/>
                 <w:sz w:val="28"/>
                 <w:szCs w:val="28"/>
-                <w:rtl w:val="0"/>
+                <w:lang w:val="en-US"/>
               </w:rPr>
               <w:t xml:space="preserve">Tela_012</w:t>
             </w:r>
@@ -760,7 +785,7 @@
               <w:rPr>
                 <w:sz w:val="28"/>
                 <w:szCs w:val="28"/>
-                <w:rtl w:val="0"/>
+                <w:lang w:val="en-US"/>
               </w:rPr>
               <w:t xml:space="preserve">); </w:t>
             </w:r>
@@ -770,20 +795,21 @@
               </w:rPr>
             </w:r>
           </w:p>
-          <w:p>
+          <w:p wp14:textId="77777777">
             <w:pPr>
               <w:ind w:left="360" w:firstLine="0"/>
               <w:rPr>
                 <w:color w:val="ff0000"/>
                 <w:sz w:val="28"/>
                 <w:szCs w:val="28"/>
-              </w:rPr>
-            </w:pPr>
-            <w:r>
-              <w:rPr>
-                <w:sz w:val="28"/>
-                <w:szCs w:val="28"/>
-                <w:rtl w:val="0"/>
+                <w:lang w:val="en-US"/>
+              </w:rPr>
+            </w:pPr>
+            <w:r>
+              <w:rPr>
+                <w:sz w:val="28"/>
+                <w:szCs w:val="28"/>
+                <w:lang w:val="en-US"/>
               </w:rPr>
               <w:t xml:space="preserve">c) </w:t>
             </w:r>
@@ -793,7 +819,7 @@
                 <w:bCs w:val="1"/>
                 <w:sz w:val="28"/>
                 <w:szCs w:val="28"/>
-                <w:rtl w:val="0"/>
+                <w:lang w:val="en-US"/>
               </w:rPr>
               <w:t xml:space="preserve">Editar Aluguel:</w:t>
             </w:r>
@@ -801,7 +827,7 @@
               <w:rPr>
                 <w:sz w:val="28"/>
                 <w:szCs w:val="28"/>
-                <w:rtl w:val="0"/>
+                <w:lang w:val="en-US"/>
               </w:rPr>
               <w:t xml:space="preserve"> Ator pressiona o botão "Ver aluguel" referente a um imóvel já alugado (</w:t>
             </w:r>
@@ -810,7 +836,7 @@
                 <w:color w:val="ff0000"/>
                 <w:sz w:val="28"/>
                 <w:szCs w:val="28"/>
-                <w:rtl w:val="0"/>
+                <w:lang w:val="en-US"/>
               </w:rPr>
               <w:t xml:space="preserve">Tela_012</w:t>
             </w:r>
@@ -818,7 +844,7 @@
               <w:rPr>
                 <w:sz w:val="28"/>
                 <w:szCs w:val="28"/>
-                <w:rtl w:val="0"/>
+                <w:lang w:val="en-US"/>
               </w:rPr>
               <w:t xml:space="preserve">) e edita os dados do inquilino exibidos; </w:t>
             </w:r>
@@ -828,19 +854,20 @@
               </w:rPr>
             </w:r>
           </w:p>
-          <w:p>
+          <w:p wp14:textId="77777777">
             <w:pPr>
               <w:ind w:left="360" w:firstLine="0"/>
               <w:rPr>
                 <w:sz w:val="28"/>
                 <w:szCs w:val="28"/>
-              </w:rPr>
-            </w:pPr>
-            <w:r>
-              <w:rPr>
-                <w:sz w:val="28"/>
-                <w:szCs w:val="28"/>
-                <w:rtl w:val="0"/>
+                <w:lang w:val="en-US"/>
+              </w:rPr>
+            </w:pPr>
+            <w:r>
+              <w:rPr>
+                <w:sz w:val="28"/>
+                <w:szCs w:val="28"/>
+                <w:lang w:val="en-US"/>
               </w:rPr>
               <w:t xml:space="preserve">d) </w:t>
             </w:r>
@@ -850,37 +877,37 @@
                 <w:bCs w:val="1"/>
                 <w:sz w:val="28"/>
                 <w:szCs w:val="28"/>
-                <w:rtl w:val="0"/>
-              </w:rPr>
-              <w:t xml:space="preserve">Cancelar Aluguel:</w:t>
-            </w:r>
-            <w:r>
-              <w:rPr>
-                <w:sz w:val="28"/>
-                <w:szCs w:val="28"/>
-                <w:rtl w:val="0"/>
+                <w:lang w:val="en-US"/>
+              </w:rPr>
+              <w:t>Cancelar Aluguel:</w:t>
+            </w:r>
+            <w:r>
+              <w:rPr>
+                <w:sz w:val="28"/>
+                <w:szCs w:val="28"/>
+                <w:lang w:val="en-US"/>
               </w:rPr>
               <w:t xml:space="preserve"> Ator pressiona o botão "Ver aluguel" referente a um imóvel já alugado (</w:t>
             </w:r>
             <w:r>
               <w:rPr>
-                <w:color w:val="ff0000"/>
-                <w:sz w:val="28"/>
-                <w:szCs w:val="28"/>
-                <w:rtl w:val="0"/>
-              </w:rPr>
-              <w:t xml:space="preserve">Tela_012</w:t>
-            </w:r>
-            <w:r>
-              <w:rPr>
-                <w:sz w:val="28"/>
-                <w:szCs w:val="28"/>
-                <w:rtl w:val="0"/>
+                <w:color w:val="FF0000"/>
+                <w:sz w:val="28"/>
+                <w:szCs w:val="28"/>
+                <w:lang w:val="en-US"/>
+              </w:rPr>
+              <w:t>Tela_012</w:t>
+            </w:r>
+            <w:r>
+              <w:rPr>
+                <w:sz w:val="28"/>
+                <w:szCs w:val="28"/>
+                <w:lang w:val="en-US"/>
               </w:rPr>
               <w:t xml:space="preserve">) e, em seguida, pressiona o botão "Cancelar Aluguel". </w:t>
             </w:r>
           </w:p>
-          <w:p>
+          <w:p wp14:textId="77777777">
             <w:pPr>
               <w:ind w:left="360" w:firstLine="0"/>
               <w:rPr>
@@ -894,7 +921,7 @@
               </w:rPr>
             </w:r>
           </w:p>
-          <w:p>
+          <w:p wp14:textId="77777777">
             <w:pPr>
               <w:numPr>
                 <w:ilvl w:val="0"/>
@@ -904,30 +931,31 @@
               <w:rPr>
                 <w:sz w:val="28"/>
                 <w:szCs w:val="28"/>
-              </w:rPr>
-            </w:pPr>
-            <w:r>
-              <w:rPr>
-                <w:sz w:val="28"/>
-                <w:szCs w:val="28"/>
-                <w:rtl w:val="0"/>
-              </w:rPr>
-              <w:t xml:space="preserve">Sistema retorna ao passo 2, exibindo a listagem de imóveis atualizada (</w:t>
-            </w:r>
-            <w:r>
-              <w:rPr>
-                <w:color w:val="ff0000"/>
-                <w:sz w:val="28"/>
-                <w:szCs w:val="28"/>
-                <w:rtl w:val="0"/>
-              </w:rPr>
-              <w:t xml:space="preserve">Tela 010</w:t>
-            </w:r>
-            <w:r>
-              <w:rPr>
-                <w:sz w:val="28"/>
-                <w:szCs w:val="28"/>
-                <w:rtl w:val="0"/>
+                <w:lang w:val="en-US"/>
+              </w:rPr>
+            </w:pPr>
+            <w:r>
+              <w:rPr>
+                <w:sz w:val="28"/>
+                <w:szCs w:val="28"/>
+                <w:lang w:val="en-US"/>
+              </w:rPr>
+              <w:t>Sistema retorna ao passo 2, exibindo a listagem de imóveis atualizada (</w:t>
+            </w:r>
+            <w:r>
+              <w:rPr>
+                <w:color w:val="FF0000"/>
+                <w:sz w:val="28"/>
+                <w:szCs w:val="28"/>
+                <w:lang w:val="en-US"/>
+              </w:rPr>
+              <w:t>Tela 010</w:t>
+            </w:r>
+            <w:r>
+              <w:rPr>
+                <w:sz w:val="28"/>
+                <w:szCs w:val="28"/>
+                <w:lang w:val="en-US"/>
               </w:rPr>
               <w:t xml:space="preserve">).  </w:t>
             </w:r>
@@ -935,7 +963,7 @@
         </w:tc>
       </w:tr>
     </w:tbl>
-    <w:p>
+    <w:p xmlns:wp14="http://schemas.microsoft.com/office/word/2010/wordml" wp14:textId="77777777">
       <w:pPr>
         <w:jc w:val="center"/>
         <w:rPr/>
@@ -946,7 +974,7 @@
         </w:rPr>
       </w:r>
     </w:p>
-    <w:p>
+    <w:p xmlns:wp14="http://schemas.microsoft.com/office/word/2010/wordml" wp14:textId="77777777">
       <w:pPr>
         <w:jc w:val="center"/>
         <w:rPr/>
@@ -957,7 +985,7 @@
         </w:rPr>
       </w:r>
     </w:p>
-    <w:p>
+    <w:p xmlns:wp14="http://schemas.microsoft.com/office/word/2010/wordml" wp14:textId="77777777">
       <w:pPr>
         <w:jc w:val="center"/>
         <w:rPr/>
@@ -968,14 +996,13 @@
         </w:rPr>
       </w:r>
     </w:p>
-    <w:p>
+    <w:p xmlns:wp14="http://schemas.microsoft.com/office/word/2010/wordml" wp14:textId="77777777">
       <w:pPr>
         <w:pStyle w:val="Heading1"/>
-        <w:rPr/>
       </w:pPr>
       <w:r>
         <w:rPr>
-          <w:rtl w:val="0"/>
+          <w:lang w:val="en-US"/>
         </w:rPr>
         <w:t xml:space="preserve">Seção: </w:t>
       </w:r>
@@ -983,7 +1010,7 @@
         <w:rPr>
           <w:b w:val="0"/>
           <w:bCs w:val="0"/>
-          <w:rtl w:val="0"/>
+          <w:lang w:val="en-US"/>
         </w:rPr>
         <w:t xml:space="preserve">Alugar Aluguel</w:t>
       </w:r>
@@ -996,44 +1023,43 @@
     <w:tbl>
       <w:tblPr>
         <w:tblStyle w:val="Table2"/>
-        <w:tblW w:w="10330.0" w:type="dxa"/>
+        <w:tblW w:w="10330" w:type="dxa"/>
         <w:jc w:val="left"/>
         <w:tblInd w:w="-70.0" w:type="dxa"/>
         <w:tblBorders>
-          <w:top w:color="000000" w:space="0" w:sz="4" w:val="single"/>
-          <w:left w:color="000000" w:space="0" w:sz="4" w:val="single"/>
-          <w:bottom w:color="000000" w:space="0" w:sz="4" w:val="single"/>
-          <w:right w:color="000000" w:space="0" w:sz="4" w:val="single"/>
-          <w:insideH w:color="000000" w:space="0" w:sz="4" w:val="single"/>
-          <w:insideV w:color="000000" w:space="0" w:sz="4" w:val="single"/>
+          <w:top w:val="single" w:color="000000" w:sz="4" w:space="0"/>
+          <w:left w:val="single" w:color="000000" w:sz="4" w:space="0"/>
+          <w:bottom w:val="single" w:color="000000" w:sz="4" w:space="0"/>
+          <w:right w:val="single" w:color="000000" w:sz="4" w:space="0"/>
+          <w:insideH w:val="single" w:color="000000" w:sz="4" w:space="0"/>
+          <w:insideV w:val="single" w:color="000000" w:sz="4" w:space="0"/>
         </w:tblBorders>
         <w:tblLayout w:type="fixed"/>
         <w:tblLook w:val="0000"/>
+        <w:tblPrChange w:author="" w:id="1561491163">
+          <w:tblPr/>
+        </w:tblPrChange>
       </w:tblPr>
       <w:tblGrid>
         <w:gridCol w:w="2905"/>
         <w:gridCol w:w="7425"/>
-        <w:tblGridChange w:id="0">
-          <w:tblGrid>
-            <w:gridCol w:w="2905"/>
-            <w:gridCol w:w="7425"/>
-          </w:tblGrid>
-        </w:tblGridChange>
       </w:tblGrid>
-      <w:tr>
+      <w:tr xmlns:wp14="http://schemas.microsoft.com/office/word/2010/wordml" wp14:textId="77777777">
         <w:trPr>
           <w:cantSplit w:val="0"/>
           <w:tblHeader w:val="0"/>
         </w:trPr>
         <w:tc>
           <w:tcPr>
-            <w:vAlign w:val="top"/>
-          </w:tcPr>
-          <w:p>
-            <w:pPr>
-              <w:rPr>
-                <w:sz w:val="28"/>
-                <w:szCs w:val="28"/>
+            <w:tcMar/>
+            <w:vAlign w:val="top"/>
+          </w:tcPr>
+          <w:p wp14:textId="77777777">
+            <w:pPr>
+              <w:rPr>
+                <w:sz w:val="28"/>
+                <w:szCs w:val="28"/>
+                <w:lang w:val="en-US"/>
               </w:rPr>
             </w:pPr>
             <w:r>
@@ -1042,7 +1068,7 @@
                 <w:bCs w:val="1"/>
                 <w:sz w:val="28"/>
                 <w:szCs w:val="28"/>
-                <w:rtl w:val="0"/>
+                <w:lang w:val="en-US"/>
               </w:rPr>
               <w:t xml:space="preserve">Sumário</w:t>
             </w:r>
@@ -1055,27 +1081,29 @@
         </w:tc>
         <w:tc>
           <w:tcPr>
-            <w:vAlign w:val="top"/>
-          </w:tcPr>
-          <w:p>
-            <w:pPr>
-              <w:rPr>
-                <w:sz w:val="28"/>
-                <w:szCs w:val="28"/>
-              </w:rPr>
-            </w:pPr>
-            <w:r>
-              <w:rPr>
-                <w:sz w:val="28"/>
-                <w:szCs w:val="28"/>
-                <w:rtl w:val="0"/>
+            <w:tcMar/>
+            <w:vAlign w:val="top"/>
+          </w:tcPr>
+          <w:p wp14:textId="77777777">
+            <w:pPr>
+              <w:rPr>
+                <w:sz w:val="28"/>
+                <w:szCs w:val="28"/>
+                <w:lang w:val="en-US"/>
+              </w:rPr>
+            </w:pPr>
+            <w:r>
+              <w:rPr>
+                <w:sz w:val="28"/>
+                <w:szCs w:val="28"/>
+                <w:lang w:val="en-US"/>
               </w:rPr>
               <w:t xml:space="preserve">Aluga imóvel disponível a um inquilino, registrando os dados do aluguel e do inquilino em meio persistente e atualizando o status do imóvel para "Alugado". </w:t>
             </w:r>
           </w:p>
         </w:tc>
       </w:tr>
-      <w:tr>
+      <w:tr xmlns:wp14="http://schemas.microsoft.com/office/word/2010/wordml" wp14:textId="77777777">
         <w:trPr>
           <w:cantSplit w:val="1"/>
           <w:tblHeader w:val="0"/>
@@ -1083,18 +1111,18 @@
         <w:tc>
           <w:tcPr>
             <w:gridSpan w:val="2"/>
-            <w:vAlign w:val="top"/>
-          </w:tcPr>
-          <w:p>
+            <w:tcMar/>
+            <w:vAlign w:val="top"/>
+          </w:tcPr>
+          <w:p wp14:textId="77777777">
             <w:pPr>
               <w:pStyle w:val="Heading2"/>
-              <w:rPr/>
             </w:pPr>
             <w:r>
               <w:rPr>
                 <w:b w:val="1"/>
                 <w:bCs w:val="1"/>
-                <w:rtl w:val="0"/>
+                <w:lang w:val="en-US"/>
               </w:rPr>
               <w:t xml:space="preserve">Fluxo PrincipalserirPagamento</w:t>
             </w:r>
@@ -1106,7 +1134,7 @@
           </w:p>
         </w:tc>
       </w:tr>
-      <w:tr>
+      <w:tr xmlns:wp14="http://schemas.microsoft.com/office/word/2010/wordml" wp14:textId="77777777">
         <w:trPr>
           <w:cantSplit w:val="0"/>
           <w:trHeight w:val="1615" w:hRule="atLeast"/>
@@ -1115,9 +1143,10 @@
         <w:tc>
           <w:tcPr>
             <w:gridSpan w:val="2"/>
-            <w:vAlign w:val="top"/>
-          </w:tcPr>
-          <w:p>
+            <w:tcMar/>
+            <w:vAlign w:val="top"/>
+          </w:tcPr>
+          <w:p wp14:textId="77777777">
             <w:pPr>
               <w:numPr>
                 <w:ilvl w:val="0"/>
@@ -1127,35 +1156,36 @@
               <w:rPr>
                 <w:sz w:val="28"/>
                 <w:szCs w:val="28"/>
-              </w:rPr>
-            </w:pPr>
-            <w:r>
-              <w:rPr>
-                <w:sz w:val="28"/>
-                <w:szCs w:val="28"/>
-                <w:rtl w:val="0"/>
-              </w:rPr>
-              <w:t xml:space="preserve">O Ator acessa a lista de imóveis (</w:t>
-            </w:r>
-            <w:r>
-              <w:rPr>
-                <w:color w:val="ff0000"/>
-                <w:sz w:val="28"/>
-                <w:szCs w:val="28"/>
-                <w:rtl w:val="0"/>
-              </w:rPr>
-              <w:t xml:space="preserve">Tela 010</w:t>
-            </w:r>
-            <w:r>
-              <w:rPr>
-                <w:sz w:val="28"/>
-                <w:szCs w:val="28"/>
-                <w:rtl w:val="0"/>
-              </w:rPr>
-              <w:t xml:space="preserve">).</w:t>
-            </w:r>
-          </w:p>
-          <w:p>
+                <w:lang w:val="en-US"/>
+              </w:rPr>
+            </w:pPr>
+            <w:r>
+              <w:rPr>
+                <w:sz w:val="28"/>
+                <w:szCs w:val="28"/>
+                <w:lang w:val="en-US"/>
+              </w:rPr>
+              <w:t>O Ator acessa a lista de imóveis (</w:t>
+            </w:r>
+            <w:r>
+              <w:rPr>
+                <w:color w:val="FF0000"/>
+                <w:sz w:val="28"/>
+                <w:szCs w:val="28"/>
+                <w:lang w:val="en-US"/>
+              </w:rPr>
+              <w:t>Tela 010</w:t>
+            </w:r>
+            <w:r>
+              <w:rPr>
+                <w:sz w:val="28"/>
+                <w:szCs w:val="28"/>
+                <w:lang w:val="en-US"/>
+              </w:rPr>
+              <w:t>).</w:t>
+            </w:r>
+          </w:p>
+          <w:p wp14:textId="77777777">
             <w:pPr>
               <w:numPr>
                 <w:ilvl w:val="0"/>
@@ -1166,13 +1196,14 @@
                 <w:sz w:val="28"/>
                 <w:szCs w:val="28"/>
                 <w:u w:val="none"/>
-              </w:rPr>
-            </w:pPr>
-            <w:r>
-              <w:rPr>
-                <w:sz w:val="28"/>
-                <w:szCs w:val="28"/>
-                <w:rtl w:val="0"/>
+                <w:lang w:val="en-US"/>
+              </w:rPr>
+            </w:pPr>
+            <w:r>
+              <w:rPr>
+                <w:sz w:val="28"/>
+                <w:szCs w:val="28"/>
+                <w:lang w:val="en-US"/>
               </w:rPr>
               <w:t xml:space="preserve">Ator seleciona um anúncio referente ao imóvel escolhido. </w:t>
             </w:r>
@@ -1182,7 +1213,7 @@
               </w:rPr>
             </w:r>
           </w:p>
-          <w:p>
+          <w:p wp14:textId="77777777">
             <w:pPr>
               <w:numPr>
                 <w:ilvl w:val="0"/>
@@ -1193,13 +1224,14 @@
                 <w:sz w:val="28"/>
                 <w:szCs w:val="28"/>
                 <w:u w:val="none"/>
-              </w:rPr>
-            </w:pPr>
-            <w:r>
-              <w:rPr>
-                <w:sz w:val="28"/>
-                <w:szCs w:val="28"/>
-                <w:rtl w:val="0"/>
+                <w:lang w:val="en-US"/>
+              </w:rPr>
+            </w:pPr>
+            <w:r>
+              <w:rPr>
+                <w:sz w:val="28"/>
+                <w:szCs w:val="28"/>
+                <w:lang w:val="en-US"/>
               </w:rPr>
               <w:t xml:space="preserve">Sistema exibe a tela de visão do proprietário com os dados do imóvel (</w:t>
             </w:r>
@@ -1208,7 +1240,7 @@
                 <w:color w:val="ff0000"/>
                 <w:sz w:val="28"/>
                 <w:szCs w:val="28"/>
-                <w:rtl w:val="0"/>
+                <w:lang w:val="en-US"/>
               </w:rPr>
               <w:t xml:space="preserve">Tela_007.1</w:t>
             </w:r>
@@ -1216,7 +1248,7 @@
               <w:rPr>
                 <w:sz w:val="28"/>
                 <w:szCs w:val="28"/>
-                <w:rtl w:val="0"/>
+                <w:lang w:val="en-US"/>
               </w:rPr>
               <w:t xml:space="preserve">). </w:t>
             </w:r>
@@ -1226,7 +1258,7 @@
               </w:rPr>
             </w:r>
           </w:p>
-          <w:p>
+          <w:p wp14:textId="77777777">
             <w:pPr>
               <w:numPr>
                 <w:ilvl w:val="0"/>
@@ -1237,13 +1269,14 @@
                 <w:sz w:val="28"/>
                 <w:szCs w:val="28"/>
                 <w:u w:val="none"/>
-              </w:rPr>
-            </w:pPr>
-            <w:r>
-              <w:rPr>
-                <w:sz w:val="28"/>
-                <w:szCs w:val="28"/>
-                <w:rtl w:val="0"/>
+                <w:lang w:val="en-US"/>
+              </w:rPr>
+            </w:pPr>
+            <w:r>
+              <w:rPr>
+                <w:sz w:val="28"/>
+                <w:szCs w:val="28"/>
+                <w:lang w:val="en-US"/>
               </w:rPr>
               <w:t xml:space="preserve">Ator pressiona o botão "</w:t>
             </w:r>
@@ -1252,7 +1285,7 @@
                 <w:color w:val="ff0000"/>
                 <w:sz w:val="28"/>
                 <w:szCs w:val="28"/>
-                <w:rtl w:val="0"/>
+                <w:lang w:val="en-US"/>
               </w:rPr>
               <w:t xml:space="preserve">Alugar</w:t>
             </w:r>
@@ -1260,7 +1293,7 @@
               <w:rPr>
                 <w:sz w:val="28"/>
                 <w:szCs w:val="28"/>
-                <w:rtl w:val="0"/>
+                <w:lang w:val="en-US"/>
               </w:rPr>
               <w:t xml:space="preserve">". </w:t>
             </w:r>
@@ -1270,7 +1303,7 @@
               </w:rPr>
             </w:r>
           </w:p>
-          <w:p>
+          <w:p wp14:textId="77777777">
             <w:pPr>
               <w:numPr>
                 <w:ilvl w:val="0"/>
@@ -1281,13 +1314,14 @@
                 <w:sz w:val="28"/>
                 <w:szCs w:val="28"/>
                 <w:u w:val="none"/>
-              </w:rPr>
-            </w:pPr>
-            <w:r>
-              <w:rPr>
-                <w:sz w:val="28"/>
-                <w:szCs w:val="28"/>
-                <w:rtl w:val="0"/>
+                <w:lang w:val="en-US"/>
+              </w:rPr>
+            </w:pPr>
+            <w:r>
+              <w:rPr>
+                <w:sz w:val="28"/>
+                <w:szCs w:val="28"/>
+                <w:lang w:val="en-US"/>
               </w:rPr>
               <w:t xml:space="preserve">Sistema exibe a tela para preenchimento dos dados do inquilino e do aluguel (</w:t>
             </w:r>
@@ -1296,7 +1330,7 @@
                 <w:color w:val="ff0000"/>
                 <w:sz w:val="28"/>
                 <w:szCs w:val="28"/>
-                <w:rtl w:val="0"/>
+                <w:lang w:val="en-US"/>
               </w:rPr>
               <w:t xml:space="preserve">Tela_011</w:t>
             </w:r>
@@ -1304,7 +1338,7 @@
               <w:rPr>
                 <w:sz w:val="28"/>
                 <w:szCs w:val="28"/>
-                <w:rtl w:val="0"/>
+                <w:lang w:val="en-US"/>
               </w:rPr>
               <w:t xml:space="preserve">). </w:t>
             </w:r>
@@ -1314,7 +1348,7 @@
               </w:rPr>
             </w:r>
           </w:p>
-          <w:p>
+          <w:p wp14:textId="77777777">
             <w:pPr>
               <w:numPr>
                 <w:ilvl w:val="0"/>
@@ -1325,13 +1359,14 @@
                 <w:sz w:val="28"/>
                 <w:szCs w:val="28"/>
                 <w:u w:val="none"/>
-              </w:rPr>
-            </w:pPr>
-            <w:r>
-              <w:rPr>
-                <w:sz w:val="28"/>
-                <w:szCs w:val="28"/>
-                <w:rtl w:val="0"/>
+                <w:lang w:val="en-US"/>
+              </w:rPr>
+            </w:pPr>
+            <w:r>
+              <w:rPr>
+                <w:sz w:val="28"/>
+                <w:szCs w:val="28"/>
+                <w:lang w:val="en-US"/>
               </w:rPr>
               <w:t xml:space="preserve">Ator anexa o contrato em PDF ou imagem (opcional). </w:t>
             </w:r>
@@ -1341,7 +1376,7 @@
               </w:rPr>
             </w:r>
           </w:p>
-          <w:p>
+          <w:p wp14:textId="35E25A72">
             <w:pPr>
               <w:numPr>
                 <w:ilvl w:val="0"/>
@@ -1352,40 +1387,32 @@
                 <w:sz w:val="28"/>
                 <w:szCs w:val="28"/>
                 <w:u w:val="none"/>
-              </w:rPr>
-            </w:pPr>
-            <w:r>
-              <w:rPr>
-                <w:sz w:val="28"/>
-                <w:szCs w:val="28"/>
-                <w:rtl w:val="0"/>
-              </w:rPr>
-              <w:t xml:space="preserve">Ator pressiona o botão "</w:t>
-            </w:r>
-            <w:r>
-              <w:rPr>
-                <w:color w:val="ff0000"/>
-                <w:sz w:val="28"/>
-                <w:szCs w:val="28"/>
-                <w:rtl w:val="0"/>
-              </w:rPr>
-              <w:t xml:space="preserve">Salvar</w:t>
-            </w:r>
-            <w:r>
-              <w:rPr>
-                <w:sz w:val="28"/>
-                <w:szCs w:val="28"/>
-                <w:rtl w:val="0"/>
-              </w:rPr>
-              <w:t xml:space="preserve">". </w:t>
-            </w:r>
-            <w:r>
-              <w:rPr>
-                <w:rtl w:val="0"/>
-              </w:rPr>
-            </w:r>
-          </w:p>
-          <w:p>
+                <w:lang w:val="en-US"/>
+              </w:rPr>
+            </w:pPr>
+            <w:r>
+              <w:rPr>
+                <w:sz w:val="28"/>
+                <w:szCs w:val="28"/>
+                <w:lang w:val="en-US"/>
+              </w:rPr>
+              <w:t>Ator pressiona o botão "Salvar alterações".</w:t>
+            </w:r>
+            <w:r>
+              <w:rPr>
+                <w:sz w:val="28"/>
+                <w:szCs w:val="28"/>
+                <w:lang w:val="en-US"/>
+              </w:rPr>
+              <w:t xml:space="preserve"> </w:t>
+            </w:r>
+            <w:r>
+              <w:rPr>
+                <w:rtl w:val="0"/>
+              </w:rPr>
+            </w:r>
+          </w:p>
+          <w:p wp14:textId="77777777">
             <w:pPr>
               <w:numPr>
                 <w:ilvl w:val="0"/>
@@ -1396,13 +1423,14 @@
                 <w:sz w:val="28"/>
                 <w:szCs w:val="28"/>
                 <w:u w:val="none"/>
-              </w:rPr>
-            </w:pPr>
-            <w:r>
-              <w:rPr>
-                <w:sz w:val="28"/>
-                <w:szCs w:val="28"/>
-                <w:rtl w:val="0"/>
+                <w:lang w:val="en-US"/>
+              </w:rPr>
+            </w:pPr>
+            <w:r>
+              <w:rPr>
+                <w:sz w:val="28"/>
+                <w:szCs w:val="28"/>
+                <w:lang w:val="en-US"/>
               </w:rPr>
               <w:t xml:space="preserve">Sistema verifica a validade dos dados.</w:t>
             </w:r>
@@ -1412,7 +1440,7 @@
               </w:rPr>
             </w:r>
           </w:p>
-          <w:p>
+          <w:p wp14:textId="77777777">
             <w:pPr>
               <w:numPr>
                 <w:ilvl w:val="0"/>
@@ -1423,13 +1451,14 @@
                 <w:sz w:val="28"/>
                 <w:szCs w:val="28"/>
                 <w:u w:val="none"/>
-              </w:rPr>
-            </w:pPr>
-            <w:r>
-              <w:rPr>
-                <w:sz w:val="28"/>
-                <w:szCs w:val="28"/>
-                <w:rtl w:val="0"/>
+                <w:lang w:val="en-US"/>
+              </w:rPr>
+            </w:pPr>
+            <w:r>
+              <w:rPr>
+                <w:sz w:val="28"/>
+                <w:szCs w:val="28"/>
+                <w:lang w:val="en-US"/>
               </w:rPr>
               <w:t xml:space="preserve">Sistema verifica se o CPF informado corresponde a um usuário já cadastrado na plataforma; em caso positivo, preenche automaticamente os campos nome e telefone do inquilino a partir do cadastro (RN04).</w:t>
             </w:r>
@@ -1439,7 +1468,7 @@
               </w:rPr>
             </w:r>
           </w:p>
-          <w:p>
+          <w:p wp14:textId="77777777">
             <w:pPr>
               <w:numPr>
                 <w:ilvl w:val="0"/>
@@ -1450,13 +1479,14 @@
                 <w:sz w:val="28"/>
                 <w:szCs w:val="28"/>
                 <w:u w:val="none"/>
-              </w:rPr>
-            </w:pPr>
-            <w:r>
-              <w:rPr>
-                <w:sz w:val="28"/>
-                <w:szCs w:val="28"/>
-                <w:rtl w:val="0"/>
+                <w:lang w:val="en-US"/>
+              </w:rPr>
+            </w:pPr>
+            <w:r>
+              <w:rPr>
+                <w:sz w:val="28"/>
+                <w:szCs w:val="28"/>
+                <w:lang w:val="en-US"/>
               </w:rPr>
               <w:t xml:space="preserve">Sistema grava os dados do inquilino e do aluguel em meio persistente, associando-os ao imóvel. </w:t>
             </w:r>
@@ -1466,7 +1496,7 @@
               </w:rPr>
             </w:r>
           </w:p>
-          <w:p>
+          <w:p wp14:textId="77777777">
             <w:pPr>
               <w:numPr>
                 <w:ilvl w:val="0"/>
@@ -1477,13 +1507,14 @@
                 <w:sz w:val="28"/>
                 <w:szCs w:val="28"/>
                 <w:u w:val="none"/>
-              </w:rPr>
-            </w:pPr>
-            <w:r>
-              <w:rPr>
-                <w:sz w:val="28"/>
-                <w:szCs w:val="28"/>
-                <w:rtl w:val="0"/>
+                <w:lang w:val="en-US"/>
+              </w:rPr>
+            </w:pPr>
+            <w:r>
+              <w:rPr>
+                <w:sz w:val="28"/>
+                <w:szCs w:val="28"/>
+                <w:lang w:val="en-US"/>
               </w:rPr>
               <w:t xml:space="preserve">Sistema atualiza o status do imóvel para "</w:t>
             </w:r>
@@ -1492,7 +1523,7 @@
                 <w:color w:val="ff0000"/>
                 <w:sz w:val="28"/>
                 <w:szCs w:val="28"/>
-                <w:rtl w:val="0"/>
+                <w:lang w:val="en-US"/>
               </w:rPr>
               <w:t xml:space="preserve">Alugado</w:t>
             </w:r>
@@ -1500,7 +1531,7 @@
               <w:rPr>
                 <w:sz w:val="28"/>
                 <w:szCs w:val="28"/>
-                <w:rtl w:val="0"/>
+                <w:lang w:val="en-US"/>
               </w:rPr>
               <w:t xml:space="preserve">". </w:t>
             </w:r>
@@ -1510,7 +1541,7 @@
               </w:rPr>
             </w:r>
           </w:p>
-          <w:p>
+          <w:p wp14:textId="77777777">
             <w:pPr>
               <w:numPr>
                 <w:ilvl w:val="0"/>
@@ -1521,13 +1552,14 @@
                 <w:sz w:val="28"/>
                 <w:szCs w:val="28"/>
                 <w:u w:val="none"/>
-              </w:rPr>
-            </w:pPr>
-            <w:r>
-              <w:rPr>
-                <w:sz w:val="28"/>
-                <w:szCs w:val="28"/>
-                <w:rtl w:val="0"/>
+                <w:lang w:val="en-US"/>
+              </w:rPr>
+            </w:pPr>
+            <w:r>
+              <w:rPr>
+                <w:sz w:val="28"/>
+                <w:szCs w:val="28"/>
+                <w:lang w:val="en-US"/>
               </w:rPr>
               <w:t xml:space="preserve">Sistema retorna para a tela de listagem de imóveis (</w:t>
             </w:r>
@@ -1536,7 +1568,7 @@
                 <w:color w:val="ff0000"/>
                 <w:sz w:val="28"/>
                 <w:szCs w:val="28"/>
-                <w:rtl w:val="0"/>
+                <w:lang w:val="en-US"/>
               </w:rPr>
               <w:t xml:space="preserve">Tela 010</w:t>
             </w:r>
@@ -1544,7 +1576,7 @@
               <w:rPr>
                 <w:sz w:val="28"/>
                 <w:szCs w:val="28"/>
-                <w:rtl w:val="0"/>
+                <w:lang w:val="en-US"/>
               </w:rPr>
               <w:t xml:space="preserve">). </w:t>
             </w:r>
@@ -1556,7 +1588,7 @@
           </w:p>
         </w:tc>
       </w:tr>
-      <w:tr>
+      <w:tr xmlns:wp14="http://schemas.microsoft.com/office/word/2010/wordml" wp14:textId="77777777">
         <w:trPr>
           <w:cantSplit w:val="0"/>
           <w:trHeight w:val="303" w:hRule="atLeast"/>
@@ -1565,14 +1597,16 @@
         <w:tc>
           <w:tcPr>
             <w:gridSpan w:val="2"/>
-            <w:vAlign w:val="top"/>
-          </w:tcPr>
-          <w:p>
+            <w:tcMar/>
+            <w:vAlign w:val="top"/>
+          </w:tcPr>
+          <w:p wp14:textId="77777777">
             <w:pPr>
               <w:jc w:val="center"/>
               <w:rPr>
                 <w:sz w:val="28"/>
                 <w:szCs w:val="28"/>
+                <w:lang w:val="en-US"/>
               </w:rPr>
             </w:pPr>
             <w:r>
@@ -1581,7 +1615,7 @@
                 <w:bCs w:val="1"/>
                 <w:sz w:val="28"/>
                 <w:szCs w:val="28"/>
-                <w:rtl w:val="0"/>
+                <w:lang w:val="en-US"/>
               </w:rPr>
               <w:t xml:space="preserve">Fluxo Exceção</w:t>
             </w:r>
@@ -1593,7 +1627,7 @@
           </w:p>
         </w:tc>
       </w:tr>
-      <w:tr>
+      <w:tr xmlns:wp14="http://schemas.microsoft.com/office/word/2010/wordml" wp14:textId="77777777">
         <w:trPr>
           <w:cantSplit w:val="0"/>
           <w:trHeight w:val="700" w:hRule="atLeast"/>
@@ -1602,13 +1636,15 @@
         <w:tc>
           <w:tcPr>
             <w:gridSpan w:val="2"/>
-            <w:vAlign w:val="top"/>
-          </w:tcPr>
-          <w:p>
-            <w:pPr>
-              <w:rPr>
-                <w:sz w:val="28"/>
-                <w:szCs w:val="28"/>
+            <w:tcMar/>
+            <w:vAlign w:val="top"/>
+          </w:tcPr>
+          <w:p wp14:textId="77777777">
+            <w:pPr>
+              <w:rPr>
+                <w:sz w:val="28"/>
+                <w:szCs w:val="28"/>
+                <w:lang w:val="en-US"/>
               </w:rPr>
             </w:pPr>
             <w:r>
@@ -1617,15 +1653,15 @@
                 <w:bCs w:val="1"/>
                 <w:sz w:val="28"/>
                 <w:szCs w:val="28"/>
-                <w:rtl w:val="0"/>
-              </w:rPr>
-              <w:t xml:space="preserve">Linha 9.</w:t>
-            </w:r>
-            <w:r>
-              <w:rPr>
-                <w:sz w:val="28"/>
-                <w:szCs w:val="28"/>
-                <w:rtl w:val="0"/>
+                <w:lang w:val="en-US"/>
+              </w:rPr>
+              <w:t>Linha 9.</w:t>
+            </w:r>
+            <w:r>
+              <w:rPr>
+                <w:sz w:val="28"/>
+                <w:szCs w:val="28"/>
+                <w:lang w:val="en-US"/>
               </w:rPr>
               <w:t xml:space="preserve"> Dados inválidos. Sistema exibe mensagem "Dados inválidos" e exibe os campos que estão com problemas, retornando ao passo 6. </w:t>
             </w:r>
@@ -1633,7 +1669,7 @@
         </w:tc>
       </w:tr>
     </w:tbl>
-    <w:p>
+    <w:p xmlns:wp14="http://schemas.microsoft.com/office/word/2010/wordml" wp14:textId="77777777">
       <w:pPr>
         <w:jc w:val="center"/>
         <w:rPr/>
@@ -1644,7 +1680,7 @@
         </w:rPr>
       </w:r>
     </w:p>
-    <w:p>
+    <w:p xmlns:wp14="http://schemas.microsoft.com/office/word/2010/wordml" wp14:textId="77777777">
       <w:pPr>
         <w:jc w:val="left"/>
         <w:rPr/>
@@ -1655,7 +1691,7 @@
         </w:rPr>
       </w:r>
     </w:p>
-    <w:p>
+    <w:p xmlns:wp14="http://schemas.microsoft.com/office/word/2010/wordml" wp14:textId="77777777">
       <w:pPr>
         <w:jc w:val="center"/>
         <w:rPr/>
@@ -1666,17 +1702,18 @@
         </w:rPr>
       </w:r>
     </w:p>
-    <w:p>
+    <w:p xmlns:wp14="http://schemas.microsoft.com/office/word/2010/wordml" wp14:textId="77777777">
       <w:pPr>
         <w:pStyle w:val="Heading1"/>
         <w:rPr>
           <w:b w:val="0"/>
           <w:bCs w:val="0"/>
+          <w:lang w:val="en-US"/>
         </w:rPr>
       </w:pPr>
       <w:r>
         <w:rPr>
-          <w:rtl w:val="0"/>
+          <w:lang w:val="en-US"/>
         </w:rPr>
         <w:t xml:space="preserve">Seção: </w:t>
       </w:r>
@@ -1684,39 +1721,36 @@
         <w:rPr>
           <w:b w:val="0"/>
           <w:bCs w:val="0"/>
-          <w:rtl w:val="0"/>
+          <w:lang w:val="en-US"/>
         </w:rPr>
-        <w:t xml:space="preserve">Ver Aluguel</w:t>
+        <w:t>Ver Aluguel</w:t>
       </w:r>
     </w:p>
     <w:tbl>
       <w:tblPr>
         <w:tblStyle w:val="Table3"/>
-        <w:tblW w:w="10330.0" w:type="dxa"/>
+        <w:tblW w:w="10330" w:type="dxa"/>
         <w:jc w:val="left"/>
         <w:tblInd w:w="-70.0" w:type="dxa"/>
         <w:tblBorders>
-          <w:top w:color="000000" w:space="0" w:sz="4" w:val="single"/>
-          <w:left w:color="000000" w:space="0" w:sz="4" w:val="single"/>
-          <w:bottom w:color="000000" w:space="0" w:sz="4" w:val="single"/>
-          <w:right w:color="000000" w:space="0" w:sz="4" w:val="single"/>
-          <w:insideH w:color="000000" w:space="0" w:sz="4" w:val="single"/>
-          <w:insideV w:color="000000" w:space="0" w:sz="4" w:val="single"/>
+          <w:top w:val="single" w:color="000000" w:sz="4" w:space="0"/>
+          <w:left w:val="single" w:color="000000" w:sz="4" w:space="0"/>
+          <w:bottom w:val="single" w:color="000000" w:sz="4" w:space="0"/>
+          <w:right w:val="single" w:color="000000" w:sz="4" w:space="0"/>
+          <w:insideH w:val="single" w:color="000000" w:sz="4" w:space="0"/>
+          <w:insideV w:val="single" w:color="000000" w:sz="4" w:space="0"/>
         </w:tblBorders>
         <w:tblLayout w:type="fixed"/>
         <w:tblLook w:val="0000"/>
+        <w:tblPrChange w:author="" w:id="981863544">
+          <w:tblPr/>
+        </w:tblPrChange>
       </w:tblPr>
       <w:tblGrid>
         <w:gridCol w:w="2905"/>
         <w:gridCol w:w="7425"/>
-        <w:tblGridChange w:id="0">
-          <w:tblGrid>
-            <w:gridCol w:w="2905"/>
-            <w:gridCol w:w="7425"/>
-          </w:tblGrid>
-        </w:tblGridChange>
       </w:tblGrid>
-      <w:tr>
+      <w:tr xmlns:wp14="http://schemas.microsoft.com/office/word/2010/wordml" wp14:textId="77777777">
         <w:trPr>
           <w:cantSplit w:val="0"/>
           <w:trHeight w:val="21.972656249999947" w:hRule="atLeast"/>
@@ -1724,13 +1758,15 @@
         </w:trPr>
         <w:tc>
           <w:tcPr>
-            <w:vAlign w:val="top"/>
-          </w:tcPr>
-          <w:p>
-            <w:pPr>
-              <w:rPr>
-                <w:sz w:val="28"/>
-                <w:szCs w:val="28"/>
+            <w:tcMar/>
+            <w:vAlign w:val="top"/>
+          </w:tcPr>
+          <w:p wp14:textId="77777777">
+            <w:pPr>
+              <w:rPr>
+                <w:sz w:val="28"/>
+                <w:szCs w:val="28"/>
+                <w:lang w:val="en-US"/>
               </w:rPr>
             </w:pPr>
             <w:r>
@@ -1739,7 +1775,7 @@
                 <w:bCs w:val="1"/>
                 <w:sz w:val="28"/>
                 <w:szCs w:val="28"/>
-                <w:rtl w:val="0"/>
+                <w:lang w:val="en-US"/>
               </w:rPr>
               <w:t xml:space="preserve">Sumário</w:t>
             </w:r>
@@ -1752,27 +1788,29 @@
         </w:tc>
         <w:tc>
           <w:tcPr>
-            <w:vAlign w:val="top"/>
-          </w:tcPr>
-          <w:p>
-            <w:pPr>
-              <w:rPr>
-                <w:sz w:val="28"/>
-                <w:szCs w:val="28"/>
-              </w:rPr>
-            </w:pPr>
-            <w:r>
-              <w:rPr>
-                <w:sz w:val="28"/>
-                <w:szCs w:val="28"/>
-                <w:rtl w:val="0"/>
+            <w:tcMar/>
+            <w:vAlign w:val="top"/>
+          </w:tcPr>
+          <w:p wp14:textId="77777777">
+            <w:pPr>
+              <w:rPr>
+                <w:sz w:val="28"/>
+                <w:szCs w:val="28"/>
+                <w:lang w:val="en-US"/>
+              </w:rPr>
+            </w:pPr>
+            <w:r>
+              <w:rPr>
+                <w:sz w:val="28"/>
+                <w:szCs w:val="28"/>
+                <w:lang w:val="en-US"/>
               </w:rPr>
               <w:t xml:space="preserve">Exibe os dados do aluguel vigente de um imóvel já alugado, permitindo ao proprietário consultar as informações do inquilino e do aluguel. </w:t>
             </w:r>
           </w:p>
         </w:tc>
       </w:tr>
-      <w:tr>
+      <w:tr xmlns:wp14="http://schemas.microsoft.com/office/word/2010/wordml" wp14:textId="77777777">
         <w:trPr>
           <w:cantSplit w:val="1"/>
           <w:tblHeader w:val="0"/>
@@ -1780,18 +1818,18 @@
         <w:tc>
           <w:tcPr>
             <w:gridSpan w:val="2"/>
-            <w:vAlign w:val="top"/>
-          </w:tcPr>
-          <w:p>
+            <w:tcMar/>
+            <w:vAlign w:val="top"/>
+          </w:tcPr>
+          <w:p wp14:textId="77777777">
             <w:pPr>
               <w:pStyle w:val="Heading2"/>
-              <w:rPr/>
             </w:pPr>
             <w:r>
               <w:rPr>
                 <w:b w:val="1"/>
                 <w:bCs w:val="1"/>
-                <w:rtl w:val="0"/>
+                <w:lang w:val="en-US"/>
               </w:rPr>
               <w:t xml:space="preserve">Fluxo Principal</w:t>
             </w:r>
@@ -1803,7 +1841,7 @@
           </w:p>
         </w:tc>
       </w:tr>
-      <w:tr>
+      <w:tr xmlns:wp14="http://schemas.microsoft.com/office/word/2010/wordml" wp14:textId="77777777">
         <w:trPr>
           <w:cantSplit w:val="0"/>
           <w:trHeight w:val="849" w:hRule="atLeast"/>
@@ -1812,9 +1850,10 @@
         <w:tc>
           <w:tcPr>
             <w:gridSpan w:val="2"/>
-            <w:vAlign w:val="top"/>
-          </w:tcPr>
-          <w:p>
+            <w:tcMar/>
+            <w:vAlign w:val="top"/>
+          </w:tcPr>
+          <w:p wp14:textId="77777777">
             <w:pPr>
               <w:numPr>
                 <w:ilvl w:val="0"/>
@@ -1824,35 +1863,36 @@
               <w:rPr>
                 <w:sz w:val="28"/>
                 <w:szCs w:val="28"/>
-              </w:rPr>
-            </w:pPr>
-            <w:r>
-              <w:rPr>
-                <w:sz w:val="28"/>
-                <w:szCs w:val="28"/>
-                <w:rtl w:val="0"/>
-              </w:rPr>
-              <w:t xml:space="preserve">Ator acessa a lista de imóveis (</w:t>
-            </w:r>
-            <w:r>
-              <w:rPr>
-                <w:color w:val="ff0000"/>
-                <w:sz w:val="28"/>
-                <w:szCs w:val="28"/>
-                <w:rtl w:val="0"/>
-              </w:rPr>
-              <w:t xml:space="preserve">Tela 010</w:t>
-            </w:r>
-            <w:r>
-              <w:rPr>
-                <w:sz w:val="28"/>
-                <w:szCs w:val="28"/>
-                <w:rtl w:val="0"/>
+                <w:lang w:val="en-US"/>
+              </w:rPr>
+            </w:pPr>
+            <w:r>
+              <w:rPr>
+                <w:sz w:val="28"/>
+                <w:szCs w:val="28"/>
+                <w:lang w:val="en-US"/>
+              </w:rPr>
+              <w:t>Ator acessa a lista de imóveis (</w:t>
+            </w:r>
+            <w:r>
+              <w:rPr>
+                <w:color w:val="FF0000"/>
+                <w:sz w:val="28"/>
+                <w:szCs w:val="28"/>
+                <w:lang w:val="en-US"/>
+              </w:rPr>
+              <w:t>Tela 010</w:t>
+            </w:r>
+            <w:r>
+              <w:rPr>
+                <w:sz w:val="28"/>
+                <w:szCs w:val="28"/>
+                <w:lang w:val="en-US"/>
               </w:rPr>
               <w:t xml:space="preserve">). </w:t>
             </w:r>
           </w:p>
-          <w:p>
+          <w:p wp14:textId="77777777">
             <w:pPr>
               <w:numPr>
                 <w:ilvl w:val="0"/>
@@ -1862,35 +1902,36 @@
               <w:rPr>
                 <w:sz w:val="28"/>
                 <w:szCs w:val="28"/>
-              </w:rPr>
-            </w:pPr>
-            <w:r>
-              <w:rPr>
-                <w:sz w:val="28"/>
-                <w:szCs w:val="28"/>
-                <w:rtl w:val="0"/>
-              </w:rPr>
-              <w:t xml:space="preserve">Sistema exibe os imóveis com status "Alugado" com o botão "</w:t>
-            </w:r>
-            <w:r>
-              <w:rPr>
-                <w:color w:val="ff0000"/>
-                <w:sz w:val="28"/>
-                <w:szCs w:val="28"/>
-                <w:rtl w:val="0"/>
-              </w:rPr>
-              <w:t xml:space="preserve">Ver aluguel</w:t>
-            </w:r>
-            <w:r>
-              <w:rPr>
-                <w:sz w:val="28"/>
-                <w:szCs w:val="28"/>
-                <w:rtl w:val="0"/>
-              </w:rPr>
-              <w:t xml:space="preserve">".</w:t>
-            </w:r>
-          </w:p>
-          <w:p>
+                <w:lang w:val="en-US"/>
+              </w:rPr>
+            </w:pPr>
+            <w:r>
+              <w:rPr>
+                <w:sz w:val="28"/>
+                <w:szCs w:val="28"/>
+                <w:lang w:val="en-US"/>
+              </w:rPr>
+              <w:t>Sistema exibe os imóveis com status "Alugado" com o botão "</w:t>
+            </w:r>
+            <w:r>
+              <w:rPr>
+                <w:color w:val="FF0000"/>
+                <w:sz w:val="28"/>
+                <w:szCs w:val="28"/>
+                <w:lang w:val="en-US"/>
+              </w:rPr>
+              <w:t>Ver aluguel</w:t>
+            </w:r>
+            <w:r>
+              <w:rPr>
+                <w:sz w:val="28"/>
+                <w:szCs w:val="28"/>
+                <w:lang w:val="en-US"/>
+              </w:rPr>
+              <w:t>".</w:t>
+            </w:r>
+          </w:p>
+          <w:p wp14:textId="77777777">
             <w:pPr>
               <w:numPr>
                 <w:ilvl w:val="0"/>
@@ -1901,13 +1942,14 @@
                 <w:sz w:val="28"/>
                 <w:szCs w:val="28"/>
                 <w:u w:val="none"/>
-              </w:rPr>
-            </w:pPr>
-            <w:r>
-              <w:rPr>
-                <w:sz w:val="28"/>
-                <w:szCs w:val="28"/>
-                <w:rtl w:val="0"/>
+                <w:lang w:val="en-US"/>
+              </w:rPr>
+            </w:pPr>
+            <w:r>
+              <w:rPr>
+                <w:sz w:val="28"/>
+                <w:szCs w:val="28"/>
+                <w:lang w:val="en-US"/>
               </w:rPr>
               <w:t xml:space="preserve">Ator pressiona o botão "</w:t>
             </w:r>
@@ -1916,7 +1958,7 @@
                 <w:color w:val="ff0000"/>
                 <w:sz w:val="28"/>
                 <w:szCs w:val="28"/>
-                <w:rtl w:val="0"/>
+                <w:lang w:val="en-US"/>
               </w:rPr>
               <w:t xml:space="preserve">Ver aluguel</w:t>
             </w:r>
@@ -1924,7 +1966,7 @@
               <w:rPr>
                 <w:sz w:val="28"/>
                 <w:szCs w:val="28"/>
-                <w:rtl w:val="0"/>
+                <w:lang w:val="en-US"/>
               </w:rPr>
               <w:t xml:space="preserve">" referente ao imóvel escolhido. </w:t>
             </w:r>
@@ -1934,7 +1976,7 @@
               </w:rPr>
             </w:r>
           </w:p>
-          <w:p>
+          <w:p wp14:textId="77777777">
             <w:pPr>
               <w:numPr>
                 <w:ilvl w:val="0"/>
@@ -1945,13 +1987,14 @@
                 <w:sz w:val="28"/>
                 <w:szCs w:val="28"/>
                 <w:u w:val="none"/>
-              </w:rPr>
-            </w:pPr>
-            <w:r>
-              <w:rPr>
-                <w:sz w:val="28"/>
-                <w:szCs w:val="28"/>
-                <w:rtl w:val="0"/>
+                <w:lang w:val="en-US"/>
+              </w:rPr>
+            </w:pPr>
+            <w:r>
+              <w:rPr>
+                <w:sz w:val="28"/>
+                <w:szCs w:val="28"/>
+                <w:lang w:val="en-US"/>
               </w:rPr>
               <w:t xml:space="preserve">Sistema exibe a tela "Gerenciar Aluguel" com os dados do inquilino e do aluguel (</w:t>
             </w:r>
@@ -1960,7 +2003,7 @@
                 <w:color w:val="ff0000"/>
                 <w:sz w:val="28"/>
                 <w:szCs w:val="28"/>
-                <w:rtl w:val="0"/>
+                <w:lang w:val="en-US"/>
               </w:rPr>
               <w:t xml:space="preserve">Tela 012</w:t>
             </w:r>
@@ -1968,7 +2011,7 @@
               <w:rPr>
                 <w:sz w:val="28"/>
                 <w:szCs w:val="28"/>
-                <w:rtl w:val="0"/>
+                <w:lang w:val="en-US"/>
               </w:rPr>
               <w:t xml:space="preserve">). </w:t>
             </w:r>
@@ -1978,7 +2021,7 @@
               </w:rPr>
             </w:r>
           </w:p>
-          <w:p>
+          <w:p wp14:textId="77777777">
             <w:pPr>
               <w:numPr>
                 <w:ilvl w:val="0"/>
@@ -1989,13 +2032,14 @@
                 <w:sz w:val="28"/>
                 <w:szCs w:val="28"/>
                 <w:u w:val="none"/>
-              </w:rPr>
-            </w:pPr>
-            <w:r>
-              <w:rPr>
-                <w:sz w:val="28"/>
-                <w:szCs w:val="28"/>
-                <w:rtl w:val="0"/>
+                <w:lang w:val="en-US"/>
+              </w:rPr>
+            </w:pPr>
+            <w:r>
+              <w:rPr>
+                <w:sz w:val="28"/>
+                <w:szCs w:val="28"/>
+                <w:lang w:val="en-US"/>
               </w:rPr>
               <w:t xml:space="preserve">Ator consulta as informações exibidas. </w:t>
             </w:r>
@@ -2005,7 +2049,7 @@
               </w:rPr>
             </w:r>
           </w:p>
-          <w:p>
+          <w:p wp14:textId="77777777">
             <w:pPr>
               <w:numPr>
                 <w:ilvl w:val="0"/>
@@ -2016,13 +2060,14 @@
                 <w:sz w:val="28"/>
                 <w:szCs w:val="28"/>
                 <w:u w:val="none"/>
-              </w:rPr>
-            </w:pPr>
-            <w:r>
-              <w:rPr>
-                <w:sz w:val="28"/>
-                <w:szCs w:val="28"/>
-                <w:rtl w:val="0"/>
+                <w:lang w:val="en-US"/>
+              </w:rPr>
+            </w:pPr>
+            <w:r>
+              <w:rPr>
+                <w:sz w:val="28"/>
+                <w:szCs w:val="28"/>
+                <w:lang w:val="en-US"/>
               </w:rPr>
               <w:t xml:space="preserve">Ator volta para a tela anterior. </w:t>
             </w:r>
@@ -2032,7 +2077,7 @@
               </w:rPr>
             </w:r>
           </w:p>
-          <w:p>
+          <w:p wp14:textId="77777777">
             <w:pPr>
               <w:numPr>
                 <w:ilvl w:val="0"/>
@@ -2043,13 +2088,14 @@
                 <w:sz w:val="28"/>
                 <w:szCs w:val="28"/>
                 <w:u w:val="none"/>
-              </w:rPr>
-            </w:pPr>
-            <w:r>
-              <w:rPr>
-                <w:sz w:val="28"/>
-                <w:szCs w:val="28"/>
-                <w:rtl w:val="0"/>
+                <w:lang w:val="en-US"/>
+              </w:rPr>
+            </w:pPr>
+            <w:r>
+              <w:rPr>
+                <w:sz w:val="28"/>
+                <w:szCs w:val="28"/>
+                <w:lang w:val="en-US"/>
               </w:rPr>
               <w:t xml:space="preserve">Sistema retorna para a tela de listagem de imóveis (</w:t>
             </w:r>
@@ -2058,7 +2104,7 @@
                 <w:color w:val="ff0000"/>
                 <w:sz w:val="28"/>
                 <w:szCs w:val="28"/>
-                <w:rtl w:val="0"/>
+                <w:lang w:val="en-US"/>
               </w:rPr>
               <w:t xml:space="preserve">Tela 010</w:t>
             </w:r>
@@ -2066,7 +2112,7 @@
               <w:rPr>
                 <w:sz w:val="28"/>
                 <w:szCs w:val="28"/>
-                <w:rtl w:val="0"/>
+                <w:lang w:val="en-US"/>
               </w:rPr>
               <w:t xml:space="preserve">). </w:t>
             </w:r>
@@ -2078,7 +2124,7 @@
           </w:p>
         </w:tc>
       </w:tr>
-      <w:tr>
+      <w:tr xmlns:wp14="http://schemas.microsoft.com/office/word/2010/wordml" wp14:textId="77777777">
         <w:trPr>
           <w:cantSplit w:val="0"/>
           <w:trHeight w:val="585" w:hRule="atLeast"/>
@@ -2087,23 +2133,25 @@
         <w:tc>
           <w:tcPr>
             <w:gridSpan w:val="2"/>
-            <w:vAlign w:val="top"/>
-          </w:tcPr>
-          <w:p>
+            <w:tcMar/>
+            <w:vAlign w:val="top"/>
+          </w:tcPr>
+          <w:p wp14:textId="77777777">
             <w:pPr>
               <w:pStyle w:val="Heading2"/>
               <w:rPr>
                 <w:sz w:val="28"/>
                 <w:szCs w:val="28"/>
-              </w:rPr>
-            </w:pPr>
-            <w:bookmarkStart w:colFirst="0" w:colLast="0" w:name="_heading=h.87up5gj5ydnn" w:id="0"/>
+                <w:lang w:val="en-US"/>
+              </w:rPr>
+            </w:pPr>
+            <w:bookmarkStart w:name="_heading=h.87up5gj5ydnn" w:colFirst="0" w:colLast="0" w:id="0"/>
             <w:bookmarkEnd w:id="0"/>
             <w:r>
               <w:rPr>
                 <w:b w:val="1"/>
                 <w:bCs w:val="1"/>
-                <w:rtl w:val="0"/>
+                <w:lang w:val="en-US"/>
               </w:rPr>
               <w:t xml:space="preserve">Fluxo Alternativo</w:t>
             </w:r>
@@ -2115,7 +2163,7 @@
           </w:p>
         </w:tc>
       </w:tr>
-      <w:tr>
+      <w:tr xmlns:wp14="http://schemas.microsoft.com/office/word/2010/wordml" wp14:textId="77777777">
         <w:trPr>
           <w:cantSplit w:val="0"/>
           <w:trHeight w:val="849" w:hRule="atLeast"/>
@@ -2124,32 +2172,32 @@
         <w:tc>
           <w:tcPr>
             <w:gridSpan w:val="2"/>
-            <w:vAlign w:val="top"/>
-          </w:tcPr>
-          <w:p>
+            <w:tcMar/>
+            <w:vAlign w:val="top"/>
+          </w:tcPr>
+          <w:p wp14:textId="77777777">
             <w:pPr>
               <w:pStyle w:val="Heading2"/>
               <w:jc w:val="left"/>
-              <w:rPr/>
             </w:pPr>
             <w:r>
               <w:rPr>
                 <w:b w:val="1"/>
                 <w:bCs w:val="1"/>
-                <w:rtl w:val="0"/>
-              </w:rPr>
-              <w:t xml:space="preserve">Linha 3.</w:t>
-            </w:r>
-            <w:r>
-              <w:rPr>
-                <w:rtl w:val="0"/>
+                <w:lang w:val="en-US"/>
+              </w:rPr>
+              <w:t>Linha 3.</w:t>
+            </w:r>
+            <w:r>
+              <w:rPr>
+                <w:lang w:val="en-US"/>
               </w:rPr>
               <w:t xml:space="preserve"> Ator pressiona o botão "Cancelar" no modal. Sistema descarta as alterações e fecha o modal, retornando ao passo 2, sem gravar dados. </w:t>
             </w:r>
           </w:p>
         </w:tc>
       </w:tr>
-      <w:tr>
+      <w:tr xmlns:wp14="http://schemas.microsoft.com/office/word/2010/wordml" wp14:textId="77777777">
         <w:trPr>
           <w:cantSplit w:val="0"/>
           <w:trHeight w:val="405" w:hRule="atLeast"/>
@@ -2158,20 +2206,20 @@
         <w:tc>
           <w:tcPr>
             <w:gridSpan w:val="2"/>
-            <w:vAlign w:val="top"/>
-          </w:tcPr>
-          <w:p>
+            <w:tcMar/>
+            <w:vAlign w:val="top"/>
+          </w:tcPr>
+          <w:p wp14:textId="77777777">
             <w:pPr>
               <w:pStyle w:val="Heading2"/>
-              <w:rPr/>
-            </w:pPr>
-            <w:bookmarkStart w:colFirst="0" w:colLast="0" w:name="_heading=h.gq9vxftg9o39" w:id="1"/>
+            </w:pPr>
+            <w:bookmarkStart w:name="_heading=h.gq9vxftg9o39" w:colFirst="0" w:colLast="0" w:id="1"/>
             <w:bookmarkEnd w:id="1"/>
             <w:r>
               <w:rPr>
                 <w:b w:val="1"/>
                 <w:bCs w:val="1"/>
-                <w:rtl w:val="0"/>
+                <w:lang w:val="en-US"/>
               </w:rPr>
               <w:t xml:space="preserve">Fluxo Exceção</w:t>
             </w:r>
@@ -2183,7 +2231,7 @@
           </w:p>
         </w:tc>
       </w:tr>
-      <w:tr>
+      <w:tr xmlns:wp14="http://schemas.microsoft.com/office/word/2010/wordml" wp14:textId="77777777">
         <w:trPr>
           <w:cantSplit w:val="0"/>
           <w:trHeight w:val="405" w:hRule="atLeast"/>
@@ -2192,25 +2240,25 @@
         <w:tc>
           <w:tcPr>
             <w:gridSpan w:val="2"/>
-            <w:vAlign w:val="top"/>
-          </w:tcPr>
-          <w:p>
+            <w:tcMar/>
+            <w:vAlign w:val="top"/>
+          </w:tcPr>
+          <w:p wp14:textId="77777777">
             <w:pPr>
               <w:pStyle w:val="Heading2"/>
               <w:jc w:val="left"/>
-              <w:rPr/>
             </w:pPr>
             <w:r>
               <w:rPr>
                 <w:b w:val="1"/>
                 <w:bCs w:val="1"/>
-                <w:rtl w:val="0"/>
-              </w:rPr>
-              <w:t xml:space="preserve">Linha 8</w:t>
-            </w:r>
-            <w:r>
-              <w:rPr>
-                <w:rtl w:val="0"/>
+                <w:lang w:val="en-US"/>
+              </w:rPr>
+              <w:t>Linha 8</w:t>
+            </w:r>
+            <w:r>
+              <w:rPr>
+                <w:lang w:val="en-US"/>
               </w:rPr>
               <w:t xml:space="preserve">. Dados inválidos. Sistema exibe mensagem "Dados inválidos" e mantém o modal aberto, retornando ao passo 5. </w:t>
             </w:r>
@@ -2218,7 +2266,7 @@
         </w:tc>
       </w:tr>
     </w:tbl>
-    <w:p>
+    <w:p xmlns:wp14="http://schemas.microsoft.com/office/word/2010/wordml" wp14:textId="77777777">
       <w:pPr>
         <w:jc w:val="left"/>
         <w:rPr/>
@@ -2229,7 +2277,7 @@
         </w:rPr>
       </w:r>
     </w:p>
-    <w:p>
+    <w:p xmlns:wp14="http://schemas.microsoft.com/office/word/2010/wordml" wp14:textId="77777777">
       <w:pPr>
         <w:jc w:val="center"/>
         <w:rPr/>
@@ -2240,14 +2288,13 @@
         </w:rPr>
       </w:r>
     </w:p>
-    <w:p>
+    <w:p xmlns:wp14="http://schemas.microsoft.com/office/word/2010/wordml" wp14:textId="77777777">
       <w:pPr>
         <w:pStyle w:val="Heading1"/>
-        <w:rPr/>
       </w:pPr>
       <w:r>
         <w:rPr>
-          <w:rtl w:val="0"/>
+          <w:lang w:val="en-US"/>
         </w:rPr>
         <w:t xml:space="preserve">Seção: </w:t>
       </w:r>
@@ -2255,7 +2302,7 @@
         <w:rPr>
           <w:b w:val="0"/>
           <w:bCs w:val="0"/>
-          <w:rtl w:val="0"/>
+          <w:lang w:val="en-US"/>
         </w:rPr>
         <w:t xml:space="preserve">Cancelar Aluguel</w:t>
       </w:r>
@@ -2268,44 +2315,43 @@
     <w:tbl>
       <w:tblPr>
         <w:tblStyle w:val="Table4"/>
-        <w:tblW w:w="10330.0" w:type="dxa"/>
+        <w:tblW w:w="10330" w:type="dxa"/>
         <w:jc w:val="left"/>
         <w:tblInd w:w="-70.0" w:type="dxa"/>
         <w:tblBorders>
-          <w:top w:color="000000" w:space="0" w:sz="4" w:val="single"/>
-          <w:left w:color="000000" w:space="0" w:sz="4" w:val="single"/>
-          <w:bottom w:color="000000" w:space="0" w:sz="4" w:val="single"/>
-          <w:right w:color="000000" w:space="0" w:sz="4" w:val="single"/>
-          <w:insideH w:color="000000" w:space="0" w:sz="4" w:val="single"/>
-          <w:insideV w:color="000000" w:space="0" w:sz="4" w:val="single"/>
+          <w:top w:val="single" w:color="000000" w:sz="4" w:space="0"/>
+          <w:left w:val="single" w:color="000000" w:sz="4" w:space="0"/>
+          <w:bottom w:val="single" w:color="000000" w:sz="4" w:space="0"/>
+          <w:right w:val="single" w:color="000000" w:sz="4" w:space="0"/>
+          <w:insideH w:val="single" w:color="000000" w:sz="4" w:space="0"/>
+          <w:insideV w:val="single" w:color="000000" w:sz="4" w:space="0"/>
         </w:tblBorders>
         <w:tblLayout w:type="fixed"/>
         <w:tblLook w:val="0000"/>
+        <w:tblPrChange w:author="" w:id="543080497">
+          <w:tblPr/>
+        </w:tblPrChange>
       </w:tblPr>
       <w:tblGrid>
         <w:gridCol w:w="2905"/>
         <w:gridCol w:w="7425"/>
-        <w:tblGridChange w:id="0">
-          <w:tblGrid>
-            <w:gridCol w:w="2905"/>
-            <w:gridCol w:w="7425"/>
-          </w:tblGrid>
-        </w:tblGridChange>
       </w:tblGrid>
-      <w:tr>
+      <w:tr xmlns:wp14="http://schemas.microsoft.com/office/word/2010/wordml" wp14:textId="77777777">
         <w:trPr>
           <w:cantSplit w:val="0"/>
           <w:tblHeader w:val="0"/>
         </w:trPr>
         <w:tc>
           <w:tcPr>
-            <w:vAlign w:val="top"/>
-          </w:tcPr>
-          <w:p>
-            <w:pPr>
-              <w:rPr>
-                <w:sz w:val="28"/>
-                <w:szCs w:val="28"/>
+            <w:tcMar/>
+            <w:vAlign w:val="top"/>
+          </w:tcPr>
+          <w:p wp14:textId="77777777">
+            <w:pPr>
+              <w:rPr>
+                <w:sz w:val="28"/>
+                <w:szCs w:val="28"/>
+                <w:lang w:val="en-US"/>
               </w:rPr>
             </w:pPr>
             <w:r>
@@ -2314,7 +2360,7 @@
                 <w:bCs w:val="1"/>
                 <w:sz w:val="28"/>
                 <w:szCs w:val="28"/>
-                <w:rtl w:val="0"/>
+                <w:lang w:val="en-US"/>
               </w:rPr>
               <w:t xml:space="preserve">Sumário</w:t>
             </w:r>
@@ -2327,27 +2373,29 @@
         </w:tc>
         <w:tc>
           <w:tcPr>
-            <w:vAlign w:val="top"/>
-          </w:tcPr>
-          <w:p>
-            <w:pPr>
-              <w:rPr>
-                <w:sz w:val="28"/>
-                <w:szCs w:val="28"/>
-              </w:rPr>
-            </w:pPr>
-            <w:r>
-              <w:rPr>
-                <w:sz w:val="28"/>
-                <w:szCs w:val="28"/>
-                <w:rtl w:val="0"/>
+            <w:tcMar/>
+            <w:vAlign w:val="top"/>
+          </w:tcPr>
+          <w:p wp14:textId="77777777">
+            <w:pPr>
+              <w:rPr>
+                <w:sz w:val="28"/>
+                <w:szCs w:val="28"/>
+                <w:lang w:val="en-US"/>
+              </w:rPr>
+            </w:pPr>
+            <w:r>
+              <w:rPr>
+                <w:sz w:val="28"/>
+                <w:szCs w:val="28"/>
+                <w:lang w:val="en-US"/>
               </w:rPr>
               <w:t xml:space="preserve">Permite ao proprietário encerrar o vínculo do inquilino com o imóvel, marcando o registro do aluguel como "Encerrado" (preservando seu histórico) e retornando o imóvel ao status "Disponível". </w:t>
             </w:r>
           </w:p>
         </w:tc>
       </w:tr>
-      <w:tr>
+      <w:tr xmlns:wp14="http://schemas.microsoft.com/office/word/2010/wordml" wp14:textId="77777777">
         <w:trPr>
           <w:cantSplit w:val="1"/>
           <w:tblHeader w:val="0"/>
@@ -2355,18 +2403,18 @@
         <w:tc>
           <w:tcPr>
             <w:gridSpan w:val="2"/>
-            <w:vAlign w:val="top"/>
-          </w:tcPr>
-          <w:p>
+            <w:tcMar/>
+            <w:vAlign w:val="top"/>
+          </w:tcPr>
+          <w:p wp14:textId="77777777">
             <w:pPr>
               <w:pStyle w:val="Heading2"/>
-              <w:rPr/>
             </w:pPr>
             <w:r>
               <w:rPr>
                 <w:b w:val="1"/>
                 <w:bCs w:val="1"/>
-                <w:rtl w:val="0"/>
+                <w:lang w:val="en-US"/>
               </w:rPr>
               <w:t xml:space="preserve">Fluxo Principal</w:t>
             </w:r>
@@ -2378,7 +2426,7 @@
           </w:p>
         </w:tc>
       </w:tr>
-      <w:tr>
+      <w:tr xmlns:wp14="http://schemas.microsoft.com/office/word/2010/wordml" wp14:textId="77777777">
         <w:trPr>
           <w:cantSplit w:val="0"/>
           <w:trHeight w:val="2987.75390625" w:hRule="atLeast"/>
@@ -2387,9 +2435,10 @@
         <w:tc>
           <w:tcPr>
             <w:gridSpan w:val="2"/>
-            <w:vAlign w:val="top"/>
-          </w:tcPr>
-          <w:p>
+            <w:tcMar/>
+            <w:vAlign w:val="top"/>
+          </w:tcPr>
+          <w:p wp14:textId="77777777">
             <w:pPr>
               <w:numPr>
                 <w:ilvl w:val="0"/>
@@ -2399,52 +2448,53 @@
               <w:rPr>
                 <w:sz w:val="28"/>
                 <w:szCs w:val="28"/>
-              </w:rPr>
-            </w:pPr>
-            <w:r>
-              <w:rPr>
-                <w:sz w:val="28"/>
-                <w:szCs w:val="28"/>
-                <w:rtl w:val="0"/>
-              </w:rPr>
-              <w:t xml:space="preserve">Ator acessa a tela "</w:t>
-            </w:r>
-            <w:r>
-              <w:rPr>
-                <w:color w:val="ff0000"/>
-                <w:sz w:val="28"/>
-                <w:szCs w:val="28"/>
-                <w:rtl w:val="0"/>
-              </w:rPr>
-              <w:t xml:space="preserve">Ver Aluguel</w:t>
-            </w:r>
-            <w:r>
-              <w:rPr>
-                <w:sz w:val="28"/>
-                <w:szCs w:val="28"/>
-                <w:rtl w:val="0"/>
-              </w:rPr>
-              <w:t xml:space="preserve">" de um imóvel alugado (</w:t>
-            </w:r>
-            <w:r>
-              <w:rPr>
-                <w:color w:val="ff0000"/>
-                <w:sz w:val="28"/>
-                <w:szCs w:val="28"/>
-                <w:rtl w:val="0"/>
-              </w:rPr>
-              <w:t xml:space="preserve">Tela_012</w:t>
-            </w:r>
-            <w:r>
-              <w:rPr>
-                <w:sz w:val="28"/>
-                <w:szCs w:val="28"/>
-                <w:rtl w:val="0"/>
+                <w:lang w:val="en-US"/>
+              </w:rPr>
+            </w:pPr>
+            <w:r>
+              <w:rPr>
+                <w:sz w:val="28"/>
+                <w:szCs w:val="28"/>
+                <w:lang w:val="en-US"/>
+              </w:rPr>
+              <w:t>Ator acessa a tela "</w:t>
+            </w:r>
+            <w:r>
+              <w:rPr>
+                <w:color w:val="FF0000"/>
+                <w:sz w:val="28"/>
+                <w:szCs w:val="28"/>
+                <w:lang w:val="en-US"/>
+              </w:rPr>
+              <w:t>Ver Aluguel</w:t>
+            </w:r>
+            <w:r>
+              <w:rPr>
+                <w:sz w:val="28"/>
+                <w:szCs w:val="28"/>
+                <w:lang w:val="en-US"/>
+              </w:rPr>
+              <w:t>" de um imóvel alugado (</w:t>
+            </w:r>
+            <w:r>
+              <w:rPr>
+                <w:color w:val="FF0000"/>
+                <w:sz w:val="28"/>
+                <w:szCs w:val="28"/>
+                <w:lang w:val="en-US"/>
+              </w:rPr>
+              <w:t>Tela_012</w:t>
+            </w:r>
+            <w:r>
+              <w:rPr>
+                <w:sz w:val="28"/>
+                <w:szCs w:val="28"/>
+                <w:lang w:val="en-US"/>
               </w:rPr>
               <w:t xml:space="preserve">). </w:t>
             </w:r>
           </w:p>
-          <w:p>
+          <w:p wp14:textId="77777777">
             <w:pPr>
               <w:numPr>
                 <w:ilvl w:val="0"/>
@@ -2455,13 +2505,14 @@
                 <w:sz w:val="28"/>
                 <w:szCs w:val="28"/>
                 <w:u w:val="none"/>
-              </w:rPr>
-            </w:pPr>
-            <w:r>
-              <w:rPr>
-                <w:sz w:val="28"/>
-                <w:szCs w:val="28"/>
-                <w:rtl w:val="0"/>
+                <w:lang w:val="en-US"/>
+              </w:rPr>
+            </w:pPr>
+            <w:r>
+              <w:rPr>
+                <w:sz w:val="28"/>
+                <w:szCs w:val="28"/>
+                <w:lang w:val="en-US"/>
               </w:rPr>
               <w:t xml:space="preserve">Ator pressiona o botão "</w:t>
             </w:r>
@@ -2470,7 +2521,7 @@
                 <w:color w:val="ff0000"/>
                 <w:sz w:val="28"/>
                 <w:szCs w:val="28"/>
-                <w:rtl w:val="0"/>
+                <w:lang w:val="en-US"/>
               </w:rPr>
               <w:t xml:space="preserve">Cancelar Aluguel</w:t>
             </w:r>
@@ -2478,7 +2529,7 @@
               <w:rPr>
                 <w:sz w:val="28"/>
                 <w:szCs w:val="28"/>
-                <w:rtl w:val="0"/>
+                <w:lang w:val="en-US"/>
               </w:rPr>
               <w:t xml:space="preserve">". </w:t>
             </w:r>
@@ -2488,7 +2539,7 @@
               </w:rPr>
             </w:r>
           </w:p>
-          <w:p>
+          <w:p wp14:textId="77777777">
             <w:pPr>
               <w:numPr>
                 <w:ilvl w:val="0"/>
@@ -2499,13 +2550,14 @@
                 <w:sz w:val="28"/>
                 <w:szCs w:val="28"/>
                 <w:u w:val="none"/>
-              </w:rPr>
-            </w:pPr>
-            <w:r>
-              <w:rPr>
-                <w:sz w:val="28"/>
-                <w:szCs w:val="28"/>
-                <w:rtl w:val="0"/>
+                <w:lang w:val="en-US"/>
+              </w:rPr>
+            </w:pPr>
+            <w:r>
+              <w:rPr>
+                <w:sz w:val="28"/>
+                <w:szCs w:val="28"/>
+                <w:lang w:val="en-US"/>
               </w:rPr>
               <w:t xml:space="preserve">Sistema exibe um modal de confirmação, solicitando que o ator confirme o encerramento do vínculo do inquilino. </w:t>
             </w:r>
@@ -2515,7 +2567,7 @@
               </w:rPr>
             </w:r>
           </w:p>
-          <w:p>
+          <w:p wp14:textId="77777777">
             <w:pPr>
               <w:numPr>
                 <w:ilvl w:val="0"/>
@@ -2526,13 +2578,14 @@
                 <w:sz w:val="28"/>
                 <w:szCs w:val="28"/>
                 <w:u w:val="none"/>
-              </w:rPr>
-            </w:pPr>
-            <w:r>
-              <w:rPr>
-                <w:sz w:val="28"/>
-                <w:szCs w:val="28"/>
-                <w:rtl w:val="0"/>
+                <w:lang w:val="en-US"/>
+              </w:rPr>
+            </w:pPr>
+            <w:r>
+              <w:rPr>
+                <w:sz w:val="28"/>
+                <w:szCs w:val="28"/>
+                <w:lang w:val="en-US"/>
               </w:rPr>
               <w:t xml:space="preserve">O ator confirma a ação.</w:t>
             </w:r>
@@ -2542,7 +2595,7 @@
               </w:rPr>
             </w:r>
           </w:p>
-          <w:p>
+          <w:p wp14:textId="77777777">
             <w:pPr>
               <w:numPr>
                 <w:ilvl w:val="0"/>
@@ -2553,13 +2606,14 @@
                 <w:sz w:val="28"/>
                 <w:szCs w:val="28"/>
                 <w:u w:val="none"/>
-              </w:rPr>
-            </w:pPr>
-            <w:r>
-              <w:rPr>
-                <w:sz w:val="28"/>
-                <w:szCs w:val="28"/>
-                <w:rtl w:val="0"/>
+                <w:lang w:val="en-US"/>
+              </w:rPr>
+            </w:pPr>
+            <w:r>
+              <w:rPr>
+                <w:sz w:val="28"/>
+                <w:szCs w:val="28"/>
+                <w:lang w:val="en-US"/>
               </w:rPr>
               <w:t xml:space="preserve">Sistema marca o registro do aluguel como "Encerrado" em meio persistente, preservando seu histórico para consulta futura (Tela_007.3), e remove o vínculo do inquilino com o imóvel. </w:t>
             </w:r>
@@ -2569,7 +2623,7 @@
               </w:rPr>
             </w:r>
           </w:p>
-          <w:p>
+          <w:p wp14:textId="77777777">
             <w:pPr>
               <w:numPr>
                 <w:ilvl w:val="0"/>
@@ -2580,13 +2634,14 @@
                 <w:sz w:val="28"/>
                 <w:szCs w:val="28"/>
                 <w:u w:val="none"/>
-              </w:rPr>
-            </w:pPr>
-            <w:r>
-              <w:rPr>
-                <w:sz w:val="28"/>
-                <w:szCs w:val="28"/>
-                <w:rtl w:val="0"/>
+                <w:lang w:val="en-US"/>
+              </w:rPr>
+            </w:pPr>
+            <w:r>
+              <w:rPr>
+                <w:sz w:val="28"/>
+                <w:szCs w:val="28"/>
+                <w:lang w:val="en-US"/>
               </w:rPr>
               <w:t xml:space="preserve">Sistema atualiza o status do imóvel para "</w:t>
             </w:r>
@@ -2595,7 +2650,7 @@
                 <w:color w:val="ff0000"/>
                 <w:sz w:val="28"/>
                 <w:szCs w:val="28"/>
-                <w:rtl w:val="0"/>
+                <w:lang w:val="en-US"/>
               </w:rPr>
               <w:t xml:space="preserve">Disponível</w:t>
             </w:r>
@@ -2603,7 +2658,7 @@
               <w:rPr>
                 <w:sz w:val="28"/>
                 <w:szCs w:val="28"/>
-                <w:rtl w:val="0"/>
+                <w:lang w:val="en-US"/>
               </w:rPr>
               <w:t xml:space="preserve">". </w:t>
             </w:r>
@@ -2613,7 +2668,7 @@
               </w:rPr>
             </w:r>
           </w:p>
-          <w:p>
+          <w:p wp14:textId="77777777">
             <w:pPr>
               <w:numPr>
                 <w:ilvl w:val="0"/>
@@ -2624,13 +2679,14 @@
                 <w:sz w:val="28"/>
                 <w:szCs w:val="28"/>
                 <w:u w:val="none"/>
-              </w:rPr>
-            </w:pPr>
-            <w:r>
-              <w:rPr>
-                <w:sz w:val="28"/>
-                <w:szCs w:val="28"/>
-                <w:rtl w:val="0"/>
+                <w:lang w:val="en-US"/>
+              </w:rPr>
+            </w:pPr>
+            <w:r>
+              <w:rPr>
+                <w:sz w:val="28"/>
+                <w:szCs w:val="28"/>
+                <w:lang w:val="en-US"/>
               </w:rPr>
               <w:t xml:space="preserve">Sistema retorna para a tela de listagem de imóveis (</w:t>
             </w:r>
@@ -2639,7 +2695,7 @@
                 <w:color w:val="ff0000"/>
                 <w:sz w:val="28"/>
                 <w:szCs w:val="28"/>
-                <w:rtl w:val="0"/>
+                <w:lang w:val="en-US"/>
               </w:rPr>
               <w:t xml:space="preserve">Tela_010</w:t>
             </w:r>
@@ -2647,7 +2703,7 @@
               <w:rPr>
                 <w:sz w:val="28"/>
                 <w:szCs w:val="28"/>
-                <w:rtl w:val="0"/>
+                <w:lang w:val="en-US"/>
               </w:rPr>
               <w:t xml:space="preserve">). </w:t>
             </w:r>
@@ -2659,7 +2715,7 @@
           </w:p>
         </w:tc>
       </w:tr>
-      <w:tr>
+      <w:tr xmlns:wp14="http://schemas.microsoft.com/office/word/2010/wordml" wp14:textId="77777777">
         <w:trPr>
           <w:cantSplit w:val="0"/>
           <w:trHeight w:val="303" w:hRule="atLeast"/>
@@ -2668,14 +2724,16 @@
         <w:tc>
           <w:tcPr>
             <w:gridSpan w:val="2"/>
-            <w:vAlign w:val="top"/>
-          </w:tcPr>
-          <w:p>
+            <w:tcMar/>
+            <w:vAlign w:val="top"/>
+          </w:tcPr>
+          <w:p wp14:textId="77777777">
             <w:pPr>
               <w:jc w:val="center"/>
               <w:rPr>
                 <w:sz w:val="28"/>
                 <w:szCs w:val="28"/>
+                <w:lang w:val="en-US"/>
               </w:rPr>
             </w:pPr>
             <w:r>
@@ -2684,7 +2742,7 @@
                 <w:bCs w:val="1"/>
                 <w:sz w:val="28"/>
                 <w:szCs w:val="28"/>
-                <w:rtl w:val="0"/>
+                <w:lang w:val="en-US"/>
               </w:rPr>
               <w:t xml:space="preserve">Fluxo Alternativo</w:t>
             </w:r>
@@ -2696,7 +2754,7 @@
           </w:p>
         </w:tc>
       </w:tr>
-      <w:tr>
+      <w:tr xmlns:wp14="http://schemas.microsoft.com/office/word/2010/wordml" wp14:textId="77777777">
         <w:trPr>
           <w:cantSplit w:val="0"/>
           <w:trHeight w:val="303" w:hRule="atLeast"/>
@@ -2705,14 +2763,16 @@
         <w:tc>
           <w:tcPr>
             <w:gridSpan w:val="2"/>
-            <w:vAlign w:val="top"/>
-          </w:tcPr>
-          <w:p>
+            <w:tcMar/>
+            <w:vAlign w:val="top"/>
+          </w:tcPr>
+          <w:p wp14:textId="77777777">
             <w:pPr>
               <w:jc w:val="both"/>
               <w:rPr>
                 <w:sz w:val="28"/>
                 <w:szCs w:val="28"/>
+                <w:lang w:val="en-US"/>
               </w:rPr>
             </w:pPr>
             <w:r>
@@ -2721,22 +2781,22 @@
                 <w:bCs w:val="1"/>
                 <w:sz w:val="28"/>
                 <w:szCs w:val="28"/>
-                <w:rtl w:val="0"/>
-              </w:rPr>
-              <w:t xml:space="preserve">Linha 5.</w:t>
-            </w:r>
-            <w:r>
-              <w:rPr>
-                <w:sz w:val="28"/>
-                <w:szCs w:val="28"/>
-                <w:rtl w:val="0"/>
+                <w:lang w:val="en-US"/>
+              </w:rPr>
+              <w:t>Linha 5.</w:t>
+            </w:r>
+            <w:r>
+              <w:rPr>
+                <w:sz w:val="28"/>
+                <w:szCs w:val="28"/>
+                <w:lang w:val="en-US"/>
               </w:rPr>
               <w:t xml:space="preserve"> Falha ao registrar o encerramento do aluguel. Sistema exibe mensagem "Não foi possível cancelar o aluguel" e retorna ao passo 1. </w:t>
             </w:r>
           </w:p>
         </w:tc>
       </w:tr>
-      <w:tr>
+      <w:tr xmlns:wp14="http://schemas.microsoft.com/office/word/2010/wordml" wp14:textId="77777777">
         <w:trPr>
           <w:cantSplit w:val="0"/>
           <w:trHeight w:val="303" w:hRule="atLeast"/>
@@ -2745,14 +2805,16 @@
         <w:tc>
           <w:tcPr>
             <w:gridSpan w:val="2"/>
-            <w:vAlign w:val="top"/>
-          </w:tcPr>
-          <w:p>
+            <w:tcMar/>
+            <w:vAlign w:val="top"/>
+          </w:tcPr>
+          <w:p wp14:textId="77777777">
             <w:pPr>
               <w:jc w:val="center"/>
               <w:rPr>
                 <w:sz w:val="28"/>
                 <w:szCs w:val="28"/>
+                <w:lang w:val="en-US"/>
               </w:rPr>
             </w:pPr>
             <w:r>
@@ -2761,7 +2823,7 @@
                 <w:bCs w:val="1"/>
                 <w:sz w:val="28"/>
                 <w:szCs w:val="28"/>
-                <w:rtl w:val="0"/>
+                <w:lang w:val="en-US"/>
               </w:rPr>
               <w:t xml:space="preserve">Fluxo Exceção</w:t>
             </w:r>
@@ -2773,7 +2835,7 @@
           </w:p>
         </w:tc>
       </w:tr>
-      <w:tr>
+      <w:tr xmlns:wp14="http://schemas.microsoft.com/office/word/2010/wordml" wp14:textId="77777777">
         <w:trPr>
           <w:cantSplit w:val="0"/>
           <w:trHeight w:val="700" w:hRule="atLeast"/>
@@ -2782,22 +2844,24 @@
         <w:tc>
           <w:tcPr>
             <w:gridSpan w:val="2"/>
-            <w:vAlign w:val="top"/>
-          </w:tcPr>
-          <w:p>
-            <w:pPr>
-              <w:rPr>
-                <w:sz w:val="28"/>
-                <w:szCs w:val="28"/>
-              </w:rPr>
-            </w:pPr>
-            <w:r>
-              <w:rPr>
-                <w:sz w:val="28"/>
-                <w:szCs w:val="28"/>
-                <w:rtl w:val="0"/>
-              </w:rPr>
-              <w:t xml:space="preserve">.</w:t>
+            <w:tcMar/>
+            <w:vAlign w:val="top"/>
+          </w:tcPr>
+          <w:p wp14:textId="77777777">
+            <w:pPr>
+              <w:rPr>
+                <w:sz w:val="28"/>
+                <w:szCs w:val="28"/>
+                <w:lang w:val="en-US"/>
+              </w:rPr>
+            </w:pPr>
+            <w:r>
+              <w:rPr>
+                <w:sz w:val="28"/>
+                <w:szCs w:val="28"/>
+                <w:lang w:val="en-US"/>
+              </w:rPr>
+              <w:t>.</w:t>
             </w:r>
             <w:r>
               <w:rPr>
@@ -2805,15 +2869,15 @@
                 <w:bCs w:val="1"/>
                 <w:sz w:val="28"/>
                 <w:szCs w:val="28"/>
-                <w:rtl w:val="0"/>
-              </w:rPr>
-              <w:t xml:space="preserve">Linha 3.</w:t>
-            </w:r>
-            <w:r>
-              <w:rPr>
-                <w:sz w:val="28"/>
-                <w:szCs w:val="28"/>
-                <w:rtl w:val="0"/>
+                <w:lang w:val="en-US"/>
+              </w:rPr>
+              <w:t>Linha 3.</w:t>
+            </w:r>
+            <w:r>
+              <w:rPr>
+                <w:sz w:val="28"/>
+                <w:szCs w:val="28"/>
+                <w:lang w:val="en-US"/>
               </w:rPr>
               <w:t xml:space="preserve"> Ator pressiona "Cancelar" no modal de confirmação. Sistema descarta a ação e fecha o modal, retornando ao passo 1, sem alterar dados. </w:t>
             </w:r>
@@ -2821,7 +2885,7 @@
         </w:tc>
       </w:tr>
     </w:tbl>
-    <w:p>
+    <w:p xmlns:wp14="http://schemas.microsoft.com/office/word/2010/wordml" wp14:textId="77777777">
       <w:pPr>
         <w:jc w:val="center"/>
         <w:rPr/>
@@ -2832,14 +2896,13 @@
         </w:rPr>
       </w:r>
     </w:p>
-    <w:p>
+    <w:p xmlns:wp14="http://schemas.microsoft.com/office/word/2010/wordml" wp14:textId="77777777">
       <w:pPr>
         <w:pStyle w:val="Heading1"/>
-        <w:rPr/>
       </w:pPr>
       <w:r>
         <w:rPr>
-          <w:rtl w:val="0"/>
+          <w:lang w:val="en-US"/>
         </w:rPr>
         <w:t xml:space="preserve">Seção: </w:t>
       </w:r>
@@ -2847,7 +2910,7 @@
         <w:rPr>
           <w:b w:val="0"/>
           <w:bCs w:val="0"/>
-          <w:rtl w:val="0"/>
+          <w:lang w:val="en-US"/>
         </w:rPr>
         <w:t xml:space="preserve">Alterar Dados do aluguel</w:t>
       </w:r>
@@ -2860,44 +2923,43 @@
     <w:tbl>
       <w:tblPr>
         <w:tblStyle w:val="Table5"/>
-        <w:tblW w:w="10330.0" w:type="dxa"/>
+        <w:tblW w:w="10330" w:type="dxa"/>
         <w:jc w:val="left"/>
         <w:tblInd w:w="-70.0" w:type="dxa"/>
         <w:tblBorders>
-          <w:top w:color="000000" w:space="0" w:sz="4" w:val="single"/>
-          <w:left w:color="000000" w:space="0" w:sz="4" w:val="single"/>
-          <w:bottom w:color="000000" w:space="0" w:sz="4" w:val="single"/>
-          <w:right w:color="000000" w:space="0" w:sz="4" w:val="single"/>
-          <w:insideH w:color="000000" w:space="0" w:sz="4" w:val="single"/>
-          <w:insideV w:color="000000" w:space="0" w:sz="4" w:val="single"/>
+          <w:top w:val="single" w:color="000000" w:sz="4" w:space="0"/>
+          <w:left w:val="single" w:color="000000" w:sz="4" w:space="0"/>
+          <w:bottom w:val="single" w:color="000000" w:sz="4" w:space="0"/>
+          <w:right w:val="single" w:color="000000" w:sz="4" w:space="0"/>
+          <w:insideH w:val="single" w:color="000000" w:sz="4" w:space="0"/>
+          <w:insideV w:val="single" w:color="000000" w:sz="4" w:space="0"/>
         </w:tblBorders>
         <w:tblLayout w:type="fixed"/>
         <w:tblLook w:val="0000"/>
+        <w:tblPrChange w:author="" w:id="1425904314">
+          <w:tblPr/>
+        </w:tblPrChange>
       </w:tblPr>
       <w:tblGrid>
         <w:gridCol w:w="2905"/>
         <w:gridCol w:w="7425"/>
-        <w:tblGridChange w:id="0">
-          <w:tblGrid>
-            <w:gridCol w:w="2905"/>
-            <w:gridCol w:w="7425"/>
-          </w:tblGrid>
-        </w:tblGridChange>
       </w:tblGrid>
-      <w:tr>
+      <w:tr xmlns:wp14="http://schemas.microsoft.com/office/word/2010/wordml" wp14:textId="77777777">
         <w:trPr>
           <w:cantSplit w:val="0"/>
           <w:tblHeader w:val="0"/>
         </w:trPr>
         <w:tc>
           <w:tcPr>
-            <w:vAlign w:val="top"/>
-          </w:tcPr>
-          <w:p>
-            <w:pPr>
-              <w:rPr>
-                <w:sz w:val="28"/>
-                <w:szCs w:val="28"/>
+            <w:tcMar/>
+            <w:vAlign w:val="top"/>
+          </w:tcPr>
+          <w:p wp14:textId="77777777">
+            <w:pPr>
+              <w:rPr>
+                <w:sz w:val="28"/>
+                <w:szCs w:val="28"/>
+                <w:lang w:val="en-US"/>
               </w:rPr>
             </w:pPr>
             <w:r>
@@ -2906,7 +2968,7 @@
                 <w:bCs w:val="1"/>
                 <w:sz w:val="28"/>
                 <w:szCs w:val="28"/>
-                <w:rtl w:val="0"/>
+                <w:lang w:val="en-US"/>
               </w:rPr>
               <w:t xml:space="preserve">Sumário</w:t>
             </w:r>
@@ -2919,27 +2981,29 @@
         </w:tc>
         <w:tc>
           <w:tcPr>
-            <w:vAlign w:val="top"/>
-          </w:tcPr>
-          <w:p>
-            <w:pPr>
-              <w:rPr>
-                <w:sz w:val="28"/>
-                <w:szCs w:val="28"/>
-              </w:rPr>
-            </w:pPr>
-            <w:r>
-              <w:rPr>
-                <w:sz w:val="28"/>
-                <w:szCs w:val="28"/>
-                <w:rtl w:val="0"/>
+            <w:tcMar/>
+            <w:vAlign w:val="top"/>
+          </w:tcPr>
+          <w:p wp14:textId="77777777">
+            <w:pPr>
+              <w:rPr>
+                <w:sz w:val="28"/>
+                <w:szCs w:val="28"/>
+                <w:lang w:val="en-US"/>
+              </w:rPr>
+            </w:pPr>
+            <w:r>
+              <w:rPr>
+                <w:sz w:val="28"/>
+                <w:szCs w:val="28"/>
+                <w:lang w:val="en-US"/>
               </w:rPr>
               <w:t xml:space="preserve">Permite ao proprietário editar os dados do inquilino vinculado ao imóvel, como nome, CPF, telefone e próximo vencimento. </w:t>
             </w:r>
           </w:p>
         </w:tc>
       </w:tr>
-      <w:tr>
+      <w:tr xmlns:wp14="http://schemas.microsoft.com/office/word/2010/wordml" wp14:textId="77777777">
         <w:trPr>
           <w:cantSplit w:val="1"/>
           <w:tblHeader w:val="0"/>
@@ -2947,18 +3011,18 @@
         <w:tc>
           <w:tcPr>
             <w:gridSpan w:val="2"/>
-            <w:vAlign w:val="top"/>
-          </w:tcPr>
-          <w:p>
+            <w:tcMar/>
+            <w:vAlign w:val="top"/>
+          </w:tcPr>
+          <w:p wp14:textId="77777777">
             <w:pPr>
               <w:pStyle w:val="Heading2"/>
-              <w:rPr/>
             </w:pPr>
             <w:r>
               <w:rPr>
                 <w:b w:val="1"/>
                 <w:bCs w:val="1"/>
-                <w:rtl w:val="0"/>
+                <w:lang w:val="en-US"/>
               </w:rPr>
               <w:t xml:space="preserve">Fluxo Principal</w:t>
             </w:r>
@@ -2970,7 +3034,7 @@
           </w:p>
         </w:tc>
       </w:tr>
-      <w:tr>
+      <w:tr xmlns:wp14="http://schemas.microsoft.com/office/word/2010/wordml" wp14:textId="77777777">
         <w:trPr>
           <w:cantSplit w:val="0"/>
           <w:trHeight w:val="1615" w:hRule="atLeast"/>
@@ -2979,9 +3043,10 @@
         <w:tc>
           <w:tcPr>
             <w:gridSpan w:val="2"/>
-            <w:vAlign w:val="top"/>
-          </w:tcPr>
-          <w:p>
+            <w:tcMar/>
+            <w:vAlign w:val="top"/>
+          </w:tcPr>
+          <w:p wp14:textId="77777777">
             <w:pPr>
               <w:numPr>
                 <w:ilvl w:val="0"/>
@@ -2991,47 +3056,48 @@
               <w:rPr>
                 <w:sz w:val="28"/>
                 <w:szCs w:val="28"/>
-              </w:rPr>
-            </w:pPr>
-            <w:r>
-              <w:rPr>
-                <w:sz w:val="28"/>
-                <w:szCs w:val="28"/>
-                <w:rtl w:val="0"/>
-              </w:rPr>
-              <w:t xml:space="preserve">Ator acessa a tela "</w:t>
-            </w:r>
-            <w:r>
-              <w:rPr>
-                <w:color w:val="ff0000"/>
-                <w:sz w:val="28"/>
-                <w:szCs w:val="28"/>
-                <w:rtl w:val="0"/>
-              </w:rPr>
-              <w:t xml:space="preserve">Ver Aluguel</w:t>
-            </w:r>
-            <w:r>
-              <w:rPr>
-                <w:sz w:val="28"/>
-                <w:szCs w:val="28"/>
-                <w:rtl w:val="0"/>
-              </w:rPr>
-              <w:t xml:space="preserve">" de um imóvel alugado (</w:t>
-            </w:r>
-            <w:r>
-              <w:rPr>
-                <w:color w:val="ff0000"/>
-                <w:sz w:val="28"/>
-                <w:szCs w:val="28"/>
-                <w:rtl w:val="0"/>
-              </w:rPr>
-              <w:t xml:space="preserve">Tela_012</w:t>
-            </w:r>
-            <w:r>
-              <w:rPr>
-                <w:sz w:val="28"/>
-                <w:szCs w:val="28"/>
-                <w:rtl w:val="0"/>
+                <w:lang w:val="en-US"/>
+              </w:rPr>
+            </w:pPr>
+            <w:r>
+              <w:rPr>
+                <w:sz w:val="28"/>
+                <w:szCs w:val="28"/>
+                <w:lang w:val="en-US"/>
+              </w:rPr>
+              <w:t>Ator acessa a tela "</w:t>
+            </w:r>
+            <w:r>
+              <w:rPr>
+                <w:color w:val="FF0000"/>
+                <w:sz w:val="28"/>
+                <w:szCs w:val="28"/>
+                <w:lang w:val="en-US"/>
+              </w:rPr>
+              <w:t>Ver Aluguel</w:t>
+            </w:r>
+            <w:r>
+              <w:rPr>
+                <w:sz w:val="28"/>
+                <w:szCs w:val="28"/>
+                <w:lang w:val="en-US"/>
+              </w:rPr>
+              <w:t>" de um imóvel alugado (</w:t>
+            </w:r>
+            <w:r>
+              <w:rPr>
+                <w:color w:val="FF0000"/>
+                <w:sz w:val="28"/>
+                <w:szCs w:val="28"/>
+                <w:lang w:val="en-US"/>
+              </w:rPr>
+              <w:t>Tela_012</w:t>
+            </w:r>
+            <w:r>
+              <w:rPr>
+                <w:sz w:val="28"/>
+                <w:szCs w:val="28"/>
+                <w:lang w:val="en-US"/>
               </w:rPr>
               <w:t xml:space="preserve">). </w:t>
             </w:r>
@@ -3047,23 +3113,111 @@
                 <w:sz w:val="28"/>
                 <w:szCs w:val="28"/>
                 <w:u w:val="none"/>
-              </w:rPr>
-            </w:pPr>
-            <w:r>
-              <w:rPr>
-                <w:sz w:val="28"/>
-                <w:szCs w:val="28"/>
-                <w:rtl w:val="0"/>
-              </w:rPr>
-              <w:t xml:space="preserve">Sistema exibe os dados do inquilino nos campos "Nome", "CPF", "Telefone" e "Próximo vencimento", habilitados para edição. </w:t>
-            </w:r>
-            <w:r>
-              <w:rPr>
-                <w:rtl w:val="0"/>
-              </w:rPr>
-            </w:r>
-          </w:p>
-          <w:p>
+                <w:lang w:val="en-US"/>
+              </w:rPr>
+            </w:pPr>
+            <w:r>
+              <w:rPr>
+                <w:sz w:val="28"/>
+                <w:szCs w:val="28"/>
+                <w:u w:val="none"/>
+                <w:lang w:val="en-US"/>
+              </w:rPr>
+              <w:t xml:space="preserve">Sistema </w:t>
+            </w:r>
+            <w:r>
+              <w:rPr>
+                <w:sz w:val="28"/>
+                <w:szCs w:val="28"/>
+                <w:u w:val="none"/>
+                <w:lang w:val="en-US"/>
+              </w:rPr>
+              <w:t>exibe</w:t>
+            </w:r>
+            <w:r>
+              <w:rPr>
+                <w:sz w:val="28"/>
+                <w:szCs w:val="28"/>
+                <w:u w:val="none"/>
+                <w:lang w:val="en-US"/>
+              </w:rPr>
+              <w:t xml:space="preserve"> </w:t>
+            </w:r>
+            <w:r>
+              <w:rPr>
+                <w:sz w:val="28"/>
+                <w:szCs w:val="28"/>
+                <w:u w:val="none"/>
+                <w:lang w:val="en-US"/>
+              </w:rPr>
+              <w:t>os</w:t>
+            </w:r>
+            <w:r>
+              <w:rPr>
+                <w:sz w:val="28"/>
+                <w:szCs w:val="28"/>
+                <w:u w:val="none"/>
+                <w:lang w:val="en-US"/>
+              </w:rPr>
+              <w:t xml:space="preserve"> dados do inquilino e do </w:t>
+            </w:r>
+            <w:r>
+              <w:rPr>
+                <w:sz w:val="28"/>
+                <w:szCs w:val="28"/>
+                <w:u w:val="none"/>
+                <w:lang w:val="en-US"/>
+              </w:rPr>
+              <w:t>aluguel</w:t>
+            </w:r>
+            <w:r>
+              <w:rPr>
+                <w:sz w:val="28"/>
+                <w:szCs w:val="28"/>
+                <w:u w:val="none"/>
+                <w:lang w:val="en-US"/>
+              </w:rPr>
+              <w:t xml:space="preserve"> para </w:t>
+            </w:r>
+            <w:r>
+              <w:rPr>
+                <w:sz w:val="28"/>
+                <w:szCs w:val="28"/>
+                <w:u w:val="none"/>
+                <w:lang w:val="en-US"/>
+              </w:rPr>
+              <w:t>edição</w:t>
+            </w:r>
+            <w:r>
+              <w:rPr>
+                <w:sz w:val="28"/>
+                <w:szCs w:val="28"/>
+                <w:u w:val="none"/>
+                <w:lang w:val="en-US"/>
+              </w:rPr>
+              <w:t xml:space="preserve"> (</w:t>
+            </w:r>
+            <w:r>
+              <w:rPr>
+                <w:color w:val="FF0000"/>
+                <w:sz w:val="28"/>
+                <w:szCs w:val="28"/>
+                <w:u w:val="none"/>
+                <w:lang w:val="en-US"/>
+              </w:rPr>
+              <w:t>Tela_012</w:t>
+            </w:r>
+            <w:r>
+              <w:rPr>
+                <w:sz w:val="28"/>
+                <w:szCs w:val="28"/>
+                <w:u w:val="none"/>
+                <w:lang w:val="en-US"/>
+              </w:rPr>
+              <w:t>).</w:t>
+            </w:r>
+          </w:p>
+          <w:p wp14:textId="77777777">
             <w:pPr>
               <w:numPr>
                 <w:ilvl w:val="0"/>
@@ -3074,13 +3228,14 @@
                 <w:sz w:val="28"/>
                 <w:szCs w:val="28"/>
                 <w:u w:val="none"/>
-              </w:rPr>
-            </w:pPr>
-            <w:r>
-              <w:rPr>
-                <w:sz w:val="28"/>
-                <w:szCs w:val="28"/>
-                <w:rtl w:val="0"/>
+                <w:lang w:val="en-US"/>
+              </w:rPr>
+            </w:pPr>
+            <w:r>
+              <w:rPr>
+                <w:sz w:val="28"/>
+                <w:szCs w:val="28"/>
+                <w:lang w:val="en-US"/>
               </w:rPr>
               <w:t xml:space="preserve">Ator altera um ou mais campos com os novos dados do inquilino. </w:t>
             </w:r>
@@ -3090,7 +3245,7 @@
               </w:rPr>
             </w:r>
           </w:p>
-          <w:p>
+          <w:p wp14:textId="77777777">
             <w:pPr>
               <w:numPr>
                 <w:ilvl w:val="0"/>
@@ -3101,13 +3256,14 @@
                 <w:sz w:val="28"/>
                 <w:szCs w:val="28"/>
                 <w:u w:val="none"/>
-              </w:rPr>
-            </w:pPr>
-            <w:r>
-              <w:rPr>
-                <w:sz w:val="28"/>
-                <w:szCs w:val="28"/>
-                <w:rtl w:val="0"/>
+                <w:lang w:val="en-US"/>
+              </w:rPr>
+            </w:pPr>
+            <w:r>
+              <w:rPr>
+                <w:sz w:val="28"/>
+                <w:szCs w:val="28"/>
+                <w:lang w:val="en-US"/>
               </w:rPr>
               <w:t xml:space="preserve">Ator pressiona o botão "</w:t>
             </w:r>
@@ -3116,7 +3272,7 @@
                 <w:color w:val="ff0000"/>
                 <w:sz w:val="28"/>
                 <w:szCs w:val="28"/>
-                <w:rtl w:val="0"/>
+                <w:lang w:val="en-US"/>
               </w:rPr>
               <w:t xml:space="preserve">Salvar</w:t>
             </w:r>
@@ -3124,7 +3280,7 @@
               <w:rPr>
                 <w:sz w:val="28"/>
                 <w:szCs w:val="28"/>
-                <w:rtl w:val="0"/>
+                <w:lang w:val="en-US"/>
               </w:rPr>
               <w:t xml:space="preserve">". </w:t>
             </w:r>
@@ -3134,7 +3290,7 @@
               </w:rPr>
             </w:r>
           </w:p>
-          <w:p>
+          <w:p wp14:textId="77777777">
             <w:pPr>
               <w:numPr>
                 <w:ilvl w:val="0"/>
@@ -3145,13 +3301,14 @@
                 <w:sz w:val="28"/>
                 <w:szCs w:val="28"/>
                 <w:u w:val="none"/>
-              </w:rPr>
-            </w:pPr>
-            <w:r>
-              <w:rPr>
-                <w:sz w:val="28"/>
-                <w:szCs w:val="28"/>
-                <w:rtl w:val="0"/>
+                <w:lang w:val="en-US"/>
+              </w:rPr>
+            </w:pPr>
+            <w:r>
+              <w:rPr>
+                <w:sz w:val="28"/>
+                <w:szCs w:val="28"/>
+                <w:lang w:val="en-US"/>
               </w:rPr>
               <w:t xml:space="preserve">Sistema verifica a validade dos dados. </w:t>
             </w:r>
@@ -3161,7 +3318,7 @@
               </w:rPr>
             </w:r>
           </w:p>
-          <w:p>
+          <w:p wp14:textId="77777777">
             <w:pPr>
               <w:numPr>
                 <w:ilvl w:val="0"/>
@@ -3172,13 +3329,14 @@
                 <w:sz w:val="28"/>
                 <w:szCs w:val="28"/>
                 <w:u w:val="none"/>
-              </w:rPr>
-            </w:pPr>
-            <w:r>
-              <w:rPr>
-                <w:sz w:val="28"/>
-                <w:szCs w:val="28"/>
-                <w:rtl w:val="0"/>
+                <w:lang w:val="en-US"/>
+              </w:rPr>
+            </w:pPr>
+            <w:r>
+              <w:rPr>
+                <w:sz w:val="28"/>
+                <w:szCs w:val="28"/>
+                <w:lang w:val="en-US"/>
               </w:rPr>
               <w:t xml:space="preserve">Sistema grava as alterações em meio persistente, atualizando os dados do inquilino vinculado ao imóvel. </w:t>
             </w:r>
@@ -3188,7 +3346,7 @@
               </w:rPr>
             </w:r>
           </w:p>
-          <w:p>
+          <w:p wp14:textId="77777777">
             <w:pPr>
               <w:numPr>
                 <w:ilvl w:val="0"/>
@@ -3199,13 +3357,14 @@
                 <w:sz w:val="28"/>
                 <w:szCs w:val="28"/>
                 <w:u w:val="none"/>
-              </w:rPr>
-            </w:pPr>
-            <w:r>
-              <w:rPr>
-                <w:sz w:val="28"/>
-                <w:szCs w:val="28"/>
-                <w:rtl w:val="0"/>
+                <w:lang w:val="en-US"/>
+              </w:rPr>
+            </w:pPr>
+            <w:r>
+              <w:rPr>
+                <w:sz w:val="28"/>
+                <w:szCs w:val="28"/>
+                <w:lang w:val="en-US"/>
               </w:rPr>
               <w:t xml:space="preserve">Sistema exibe mensagem de confirmação "Dados atualizados com sucesso" e mantém o ator na tela "</w:t>
             </w:r>
@@ -3214,7 +3373,7 @@
                 <w:color w:val="ff0000"/>
                 <w:sz w:val="28"/>
                 <w:szCs w:val="28"/>
-                <w:rtl w:val="0"/>
+                <w:lang w:val="en-US"/>
               </w:rPr>
               <w:t xml:space="preserve">Ver Aluguel</w:t>
             </w:r>
@@ -3222,7 +3381,7 @@
               <w:rPr>
                 <w:sz w:val="28"/>
                 <w:szCs w:val="28"/>
-                <w:rtl w:val="0"/>
+                <w:lang w:val="en-US"/>
               </w:rPr>
               <w:t xml:space="preserve">" (</w:t>
             </w:r>
@@ -3231,7 +3390,7 @@
                 <w:color w:val="ff0000"/>
                 <w:sz w:val="28"/>
                 <w:szCs w:val="28"/>
-                <w:rtl w:val="0"/>
+                <w:lang w:val="en-US"/>
               </w:rPr>
               <w:t xml:space="preserve">Tela_012</w:t>
             </w:r>
@@ -3239,7 +3398,7 @@
               <w:rPr>
                 <w:sz w:val="28"/>
                 <w:szCs w:val="28"/>
-                <w:rtl w:val="0"/>
+                <w:lang w:val="en-US"/>
               </w:rPr>
               <w:t xml:space="preserve">), com os dados atualizados. </w:t>
             </w:r>
@@ -3251,7 +3410,7 @@
           </w:p>
         </w:tc>
       </w:tr>
-      <w:tr>
+      <w:tr xmlns:wp14="http://schemas.microsoft.com/office/word/2010/wordml" wp14:textId="77777777">
         <w:trPr>
           <w:cantSplit w:val="0"/>
           <w:trHeight w:val="303" w:hRule="atLeast"/>
@@ -3260,14 +3419,16 @@
         <w:tc>
           <w:tcPr>
             <w:gridSpan w:val="2"/>
-            <w:vAlign w:val="top"/>
-          </w:tcPr>
-          <w:p>
+            <w:tcMar/>
+            <w:vAlign w:val="top"/>
+          </w:tcPr>
+          <w:p wp14:textId="77777777">
             <w:pPr>
               <w:jc w:val="center"/>
               <w:rPr>
                 <w:sz w:val="28"/>
                 <w:szCs w:val="28"/>
+                <w:lang w:val="en-US"/>
               </w:rPr>
             </w:pPr>
             <w:r>
@@ -3276,7 +3437,7 @@
                 <w:bCs w:val="1"/>
                 <w:sz w:val="28"/>
                 <w:szCs w:val="28"/>
-                <w:rtl w:val="0"/>
+                <w:lang w:val="en-US"/>
               </w:rPr>
               <w:t xml:space="preserve">Fluxo Exceção</w:t>
             </w:r>
@@ -3288,7 +3449,7 @@
           </w:p>
         </w:tc>
       </w:tr>
-      <w:tr>
+      <w:tr xmlns:wp14="http://schemas.microsoft.com/office/word/2010/wordml" wp14:textId="77777777">
         <w:trPr>
           <w:cantSplit w:val="0"/>
           <w:trHeight w:val="700" w:hRule="atLeast"/>
@@ -3297,13 +3458,15 @@
         <w:tc>
           <w:tcPr>
             <w:gridSpan w:val="2"/>
-            <w:vAlign w:val="top"/>
-          </w:tcPr>
-          <w:p>
-            <w:pPr>
-              <w:rPr>
-                <w:sz w:val="28"/>
-                <w:szCs w:val="28"/>
+            <w:tcMar/>
+            <w:vAlign w:val="top"/>
+          </w:tcPr>
+          <w:p wp14:textId="77777777">
+            <w:pPr>
+              <w:rPr>
+                <w:sz w:val="28"/>
+                <w:szCs w:val="28"/>
+                <w:lang w:val="en-US"/>
               </w:rPr>
             </w:pPr>
             <w:r>
@@ -3312,7 +3475,7 @@
                 <w:bCs w:val="1"/>
                 <w:sz w:val="28"/>
                 <w:szCs w:val="28"/>
-                <w:rtl w:val="0"/>
+                <w:lang w:val="en-US"/>
               </w:rPr>
               <w:t xml:space="preserve">Linha 4. </w:t>
             </w:r>
@@ -3320,15 +3483,15 @@
               <w:rPr>
                 <w:sz w:val="28"/>
                 <w:szCs w:val="28"/>
-                <w:rtl w:val="0"/>
-              </w:rPr>
-              <w:t xml:space="preserve">Dados não válidos. Sistema exibe mensagem “Dados inválidos” e exibe os campos que estão com problemas retornando ao passo 3.</w:t>
+                <w:lang w:val="en-US"/>
+              </w:rPr>
+              <w:t>Dados não válidos. Sistema exibe mensagem “Dados inválidos” e exibe os campos que estão com problemas retornando ao passo 3.</w:t>
             </w:r>
           </w:p>
         </w:tc>
       </w:tr>
     </w:tbl>
-    <w:p>
+    <w:p xmlns:wp14="http://schemas.microsoft.com/office/word/2010/wordml" wp14:textId="77777777">
       <w:pPr>
         <w:rPr/>
       </w:pPr>
@@ -3341,33 +3504,29 @@
     <w:tbl>
       <w:tblPr>
         <w:tblStyle w:val="Table6"/>
-        <w:tblW w:w="10305.0" w:type="dxa"/>
+        <w:tblW w:w="10305" w:type="dxa"/>
         <w:jc w:val="left"/>
         <w:tblInd w:w="-108.0" w:type="dxa"/>
         <w:tblBorders>
-          <w:top w:color="000000" w:space="0" w:sz="4" w:val="single"/>
-          <w:left w:color="000000" w:space="0" w:sz="4" w:val="single"/>
-          <w:bottom w:color="000000" w:space="0" w:sz="4" w:val="single"/>
-          <w:right w:color="000000" w:space="0" w:sz="4" w:val="single"/>
-          <w:insideH w:color="000000" w:space="0" w:sz="4" w:val="single"/>
-          <w:insideV w:color="000000" w:space="0" w:sz="4" w:val="single"/>
+          <w:top w:val="single" w:color="000000" w:sz="4" w:space="0"/>
+          <w:left w:val="single" w:color="000000" w:sz="4" w:space="0"/>
+          <w:bottom w:val="single" w:color="000000" w:sz="4" w:space="0"/>
+          <w:right w:val="single" w:color="000000" w:sz="4" w:space="0"/>
+          <w:insideH w:val="single" w:color="000000" w:sz="4" w:space="0"/>
+          <w:insideV w:val="single" w:color="000000" w:sz="4" w:space="0"/>
         </w:tblBorders>
         <w:tblLayout w:type="fixed"/>
         <w:tblLook w:val="0000"/>
+        <w:tblPrChange w:author="" w:id="548877301">
+          <w:tblPr/>
+        </w:tblPrChange>
       </w:tblPr>
       <w:tblGrid>
         <w:gridCol w:w="2625"/>
         <w:gridCol w:w="1800"/>
         <w:gridCol w:w="5880"/>
-        <w:tblGridChange w:id="0">
-          <w:tblGrid>
-            <w:gridCol w:w="2625"/>
-            <w:gridCol w:w="1800"/>
-            <w:gridCol w:w="5880"/>
-          </w:tblGrid>
-        </w:tblGridChange>
       </w:tblGrid>
-      <w:tr>
+      <w:tr xmlns:wp14="http://schemas.microsoft.com/office/word/2010/wordml" wp14:textId="77777777">
         <w:trPr>
           <w:cantSplit w:val="0"/>
           <w:tblHeader w:val="0"/>
@@ -3376,14 +3535,15 @@
           <w:tcPr>
             <w:gridSpan w:val="3"/>
             <w:tcBorders>
-              <w:top w:color="000000" w:space="0" w:sz="4" w:val="single"/>
-              <w:left w:color="000000" w:space="0" w:sz="4" w:val="single"/>
-              <w:bottom w:color="000000" w:space="0" w:sz="4" w:val="single"/>
-              <w:right w:color="000000" w:space="0" w:sz="4" w:val="single"/>
+              <w:top w:val="single" w:color="000000" w:themeColor="text1" w:sz="4" w:space="0"/>
+              <w:left w:val="single" w:color="000000" w:themeColor="text1" w:sz="4" w:space="0"/>
+              <w:bottom w:val="single" w:color="000000" w:themeColor="text1" w:sz="4" w:space="0"/>
+              <w:right w:val="single" w:color="000000" w:themeColor="text1" w:sz="4" w:space="0"/>
             </w:tcBorders>
-            <w:vAlign w:val="top"/>
-          </w:tcPr>
-          <w:p>
+            <w:tcMar/>
+            <w:vAlign w:val="top"/>
+          </w:tcPr>
+          <w:p wp14:textId="77777777">
             <w:pPr>
               <w:jc w:val="center"/>
               <w:rPr>
@@ -3409,7 +3569,7 @@
           </w:p>
         </w:tc>
       </w:tr>
-      <w:tr>
+      <w:tr xmlns:wp14="http://schemas.microsoft.com/office/word/2010/wordml" wp14:textId="77777777">
         <w:trPr>
           <w:cantSplit w:val="0"/>
           <w:tblHeader w:val="0"/>
@@ -3417,14 +3577,15 @@
         <w:tc>
           <w:tcPr>
             <w:tcBorders>
-              <w:top w:color="000000" w:space="0" w:sz="4" w:val="single"/>
-              <w:left w:color="000000" w:space="0" w:sz="4" w:val="single"/>
-              <w:bottom w:color="000000" w:space="0" w:sz="4" w:val="single"/>
-              <w:right w:color="000000" w:space="0" w:sz="4" w:val="single"/>
+              <w:top w:val="single" w:color="000000" w:themeColor="text1" w:sz="4" w:space="0"/>
+              <w:left w:val="single" w:color="000000" w:themeColor="text1" w:sz="4" w:space="0"/>
+              <w:bottom w:val="single" w:color="000000" w:themeColor="text1" w:sz="4" w:space="0"/>
+              <w:right w:val="single" w:color="000000" w:themeColor="text1" w:sz="4" w:space="0"/>
             </w:tcBorders>
-            <w:vAlign w:val="top"/>
-          </w:tcPr>
-          <w:p>
+            <w:tcMar/>
+            <w:vAlign w:val="top"/>
+          </w:tcPr>
+          <w:p wp14:textId="77777777">
             <w:pPr>
               <w:jc w:val="center"/>
               <w:rPr/>
@@ -3440,14 +3601,15 @@
         <w:tc>
           <w:tcPr>
             <w:tcBorders>
-              <w:top w:color="000000" w:space="0" w:sz="4" w:val="single"/>
-              <w:left w:color="000000" w:space="0" w:sz="4" w:val="single"/>
-              <w:bottom w:color="000000" w:space="0" w:sz="4" w:val="single"/>
-              <w:right w:color="000000" w:space="0" w:sz="4" w:val="single"/>
+              <w:top w:val="single" w:color="000000" w:themeColor="text1" w:sz="4" w:space="0"/>
+              <w:left w:val="single" w:color="000000" w:themeColor="text1" w:sz="4" w:space="0"/>
+              <w:bottom w:val="single" w:color="000000" w:themeColor="text1" w:sz="4" w:space="0"/>
+              <w:right w:val="single" w:color="000000" w:themeColor="text1" w:sz="4" w:space="0"/>
             </w:tcBorders>
-            <w:vAlign w:val="top"/>
-          </w:tcPr>
-          <w:p>
+            <w:tcMar/>
+            <w:vAlign w:val="top"/>
+          </w:tcPr>
+          <w:p wp14:textId="77777777">
             <w:pPr>
               <w:jc w:val="center"/>
               <w:rPr/>
@@ -3463,28 +3625,28 @@
         <w:tc>
           <w:tcPr>
             <w:tcBorders>
-              <w:top w:color="000000" w:space="0" w:sz="4" w:val="single"/>
-              <w:left w:color="000000" w:space="0" w:sz="4" w:val="single"/>
-              <w:bottom w:color="000000" w:space="0" w:sz="4" w:val="single"/>
-              <w:right w:color="000000" w:space="0" w:sz="4" w:val="single"/>
+              <w:top w:val="single" w:color="000000" w:themeColor="text1" w:sz="4" w:space="0"/>
+              <w:left w:val="single" w:color="000000" w:themeColor="text1" w:sz="4" w:space="0"/>
+              <w:bottom w:val="single" w:color="000000" w:themeColor="text1" w:sz="4" w:space="0"/>
+              <w:right w:val="single" w:color="000000" w:themeColor="text1" w:sz="4" w:space="0"/>
             </w:tcBorders>
-            <w:vAlign w:val="top"/>
-          </w:tcPr>
-          <w:p>
+            <w:tcMar/>
+            <w:vAlign w:val="top"/>
+          </w:tcPr>
+          <w:p wp14:textId="77777777">
             <w:pPr>
               <w:jc w:val="center"/>
-              <w:rPr/>
-            </w:pPr>
-            <w:r>
-              <w:rPr>
-                <w:rtl w:val="0"/>
-              </w:rPr>
-              <w:t xml:space="preserve">Alteração</w:t>
+            </w:pPr>
+            <w:r>
+              <w:rPr>
+                <w:lang w:val="en-US"/>
+              </w:rPr>
+              <w:t>Alteração</w:t>
             </w:r>
           </w:p>
         </w:tc>
       </w:tr>
-      <w:tr>
+      <w:tr xmlns:wp14="http://schemas.microsoft.com/office/word/2010/wordml" wp14:textId="77777777">
         <w:trPr>
           <w:cantSplit w:val="0"/>
           <w:tblHeader w:val="0"/>
@@ -3492,14 +3654,15 @@
         <w:tc>
           <w:tcPr>
             <w:tcBorders>
-              <w:top w:color="000000" w:space="0" w:sz="4" w:val="single"/>
-              <w:left w:color="000000" w:space="0" w:sz="4" w:val="single"/>
-              <w:bottom w:color="000000" w:space="0" w:sz="4" w:val="single"/>
-              <w:right w:color="000000" w:space="0" w:sz="4" w:val="single"/>
+              <w:top w:val="single" w:color="000000" w:themeColor="text1" w:sz="4" w:space="0"/>
+              <w:left w:val="single" w:color="000000" w:themeColor="text1" w:sz="4" w:space="0"/>
+              <w:bottom w:val="single" w:color="000000" w:themeColor="text1" w:sz="4" w:space="0"/>
+              <w:right w:val="single" w:color="000000" w:themeColor="text1" w:sz="4" w:space="0"/>
             </w:tcBorders>
-            <w:vAlign w:val="top"/>
-          </w:tcPr>
-          <w:p>
+            <w:tcMar/>
+            <w:vAlign w:val="top"/>
+          </w:tcPr>
+          <w:p wp14:textId="77777777">
             <w:pPr>
               <w:jc w:val="center"/>
               <w:rPr/>
@@ -3515,14 +3678,15 @@
         <w:tc>
           <w:tcPr>
             <w:tcBorders>
-              <w:top w:color="000000" w:space="0" w:sz="4" w:val="single"/>
-              <w:left w:color="000000" w:space="0" w:sz="4" w:val="single"/>
-              <w:bottom w:color="000000" w:space="0" w:sz="4" w:val="single"/>
-              <w:right w:color="000000" w:space="0" w:sz="4" w:val="single"/>
+              <w:top w:val="single" w:color="000000" w:themeColor="text1" w:sz="4" w:space="0"/>
+              <w:left w:val="single" w:color="000000" w:themeColor="text1" w:sz="4" w:space="0"/>
+              <w:bottom w:val="single" w:color="000000" w:themeColor="text1" w:sz="4" w:space="0"/>
+              <w:right w:val="single" w:color="000000" w:themeColor="text1" w:sz="4" w:space="0"/>
             </w:tcBorders>
-            <w:vAlign w:val="top"/>
-          </w:tcPr>
-          <w:p>
+            <w:tcMar/>
+            <w:vAlign w:val="top"/>
+          </w:tcPr>
+          <w:p wp14:textId="77777777">
             <w:pPr>
               <w:jc w:val="left"/>
               <w:rPr/>
@@ -3538,14 +3702,26 @@
         <w:tc>
           <w:tcPr>
             <w:tcBorders>
-              <w:top w:color="000000" w:space="0" w:sz="4" w:val="single"/>
-              <w:left w:color="000000" w:space="0" w:sz="4" w:val="single"/>
-              <w:bottom w:color="000000" w:space="0" w:sz="4" w:val="single"/>
-              <w:right w:color="000000" w:space="0" w:sz="4" w:val="single"/>
+              <w:top w:val="single" w:color="000000" w:themeColor="text1" w:sz="4" w:space="0"/>
+              <w:left w:val="single" w:color="000000" w:themeColor="text1" w:sz="4" w:space="0"/>
+              <w:bottom w:val="single" w:color="000000" w:themeColor="text1" w:sz="4" w:space="0"/>
+              <w:right w:val="single" w:color="000000" w:themeColor="text1" w:sz="4" w:space="0"/>
             </w:tcBorders>
-            <w:vAlign w:val="top"/>
-          </w:tcPr>
-          <w:p>
+            <w:tcMar/>
+            <w:vAlign w:val="top"/>
+          </w:tcPr>
+          <w:p wp14:textId="77777777">
+            <w:pPr>
+              <w:jc w:val="center"/>
+            </w:pPr>
+            <w:r>
+              <w:rPr>
+                <w:lang w:val="en-US"/>
+              </w:rPr>
+              <w:t>Criação do Caso de Uso</w:t>
+            </w:r>
+          </w:p>
+          <w:p wp14:textId="77777777">
             <w:pPr>
               <w:jc w:val="center"/>
               <w:rPr/>
@@ -3554,23 +3730,11 @@
               <w:rPr>
                 <w:rtl w:val="0"/>
               </w:rPr>
-              <w:t xml:space="preserve">Criação do Caso de Uso</w:t>
-            </w:r>
-          </w:p>
-          <w:p>
-            <w:pPr>
-              <w:jc w:val="center"/>
-              <w:rPr/>
-            </w:pPr>
-            <w:r>
-              <w:rPr>
-                <w:rtl w:val="0"/>
-              </w:rPr>
             </w:r>
           </w:p>
         </w:tc>
       </w:tr>
-      <w:tr>
+      <w:tr xmlns:wp14="http://schemas.microsoft.com/office/word/2010/wordml" wp14:textId="77777777">
         <w:trPr>
           <w:cantSplit w:val="0"/>
           <w:trHeight w:val="485.9765625" w:hRule="atLeast"/>
@@ -3579,14 +3743,15 @@
         <w:tc>
           <w:tcPr>
             <w:tcBorders>
-              <w:top w:color="000000" w:space="0" w:sz="4" w:val="single"/>
-              <w:left w:color="000000" w:space="0" w:sz="4" w:val="single"/>
-              <w:bottom w:color="000000" w:space="0" w:sz="4" w:val="single"/>
-              <w:right w:color="000000" w:space="0" w:sz="4" w:val="single"/>
+              <w:top w:val="single" w:color="000000" w:themeColor="text1" w:sz="4" w:space="0"/>
+              <w:left w:val="single" w:color="000000" w:themeColor="text1" w:sz="4" w:space="0"/>
+              <w:bottom w:val="single" w:color="000000" w:themeColor="text1" w:sz="4" w:space="0"/>
+              <w:right w:val="single" w:color="000000" w:themeColor="text1" w:sz="4" w:space="0"/>
             </w:tcBorders>
-            <w:vAlign w:val="top"/>
-          </w:tcPr>
-          <w:p>
+            <w:tcMar/>
+            <w:vAlign w:val="top"/>
+          </w:tcPr>
+          <w:p wp14:textId="77777777">
             <w:pPr>
               <w:jc w:val="center"/>
               <w:rPr/>
@@ -3602,14 +3767,15 @@
         <w:tc>
           <w:tcPr>
             <w:tcBorders>
-              <w:top w:color="000000" w:space="0" w:sz="4" w:val="single"/>
-              <w:left w:color="000000" w:space="0" w:sz="4" w:val="single"/>
-              <w:bottom w:color="000000" w:space="0" w:sz="4" w:val="single"/>
-              <w:right w:color="000000" w:space="0" w:sz="4" w:val="single"/>
+              <w:top w:val="single" w:color="000000" w:themeColor="text1" w:sz="4" w:space="0"/>
+              <w:left w:val="single" w:color="000000" w:themeColor="text1" w:sz="4" w:space="0"/>
+              <w:bottom w:val="single" w:color="000000" w:themeColor="text1" w:sz="4" w:space="0"/>
+              <w:right w:val="single" w:color="000000" w:themeColor="text1" w:sz="4" w:space="0"/>
             </w:tcBorders>
-            <w:vAlign w:val="top"/>
-          </w:tcPr>
-          <w:p>
+            <w:tcMar/>
+            <w:vAlign w:val="top"/>
+          </w:tcPr>
+          <w:p wp14:textId="77777777">
             <w:pPr>
               <w:jc w:val="left"/>
               <w:rPr/>
@@ -3625,28 +3791,28 @@
         <w:tc>
           <w:tcPr>
             <w:tcBorders>
-              <w:top w:color="000000" w:space="0" w:sz="4" w:val="single"/>
-              <w:left w:color="000000" w:space="0" w:sz="4" w:val="single"/>
-              <w:bottom w:color="000000" w:space="0" w:sz="4" w:val="single"/>
-              <w:right w:color="000000" w:space="0" w:sz="4" w:val="single"/>
+              <w:top w:val="single" w:color="000000" w:themeColor="text1" w:sz="4" w:space="0"/>
+              <w:left w:val="single" w:color="000000" w:themeColor="text1" w:sz="4" w:space="0"/>
+              <w:bottom w:val="single" w:color="000000" w:themeColor="text1" w:sz="4" w:space="0"/>
+              <w:right w:val="single" w:color="000000" w:themeColor="text1" w:sz="4" w:space="0"/>
             </w:tcBorders>
-            <w:vAlign w:val="top"/>
-          </w:tcPr>
-          <w:p>
+            <w:tcMar/>
+            <w:vAlign w:val="top"/>
+          </w:tcPr>
+          <w:p wp14:textId="77777777">
             <w:pPr>
               <w:jc w:val="center"/>
-              <w:rPr/>
-            </w:pPr>
-            <w:r>
-              <w:rPr>
-                <w:rtl w:val="0"/>
-              </w:rPr>
-              <w:t xml:space="preserve">Atualização do CSU de Visualizar Aluguel para Manter Aluguel</w:t>
+            </w:pPr>
+            <w:r>
+              <w:rPr>
+                <w:lang w:val="en-US"/>
+              </w:rPr>
+              <w:t>Atualização do CSU de Visualizar Aluguel para Manter Aluguel</w:t>
             </w:r>
           </w:p>
         </w:tc>
       </w:tr>
-      <w:tr>
+      <w:tr xmlns:wp14="http://schemas.microsoft.com/office/word/2010/wordml" wp14:textId="77777777">
         <w:trPr>
           <w:cantSplit w:val="0"/>
           <w:trHeight w:val="485.9765625" w:hRule="atLeast"/>
@@ -3655,14 +3821,15 @@
         <w:tc>
           <w:tcPr>
             <w:tcBorders>
-              <w:top w:color="000000" w:space="0" w:sz="4" w:val="single"/>
-              <w:left w:color="000000" w:space="0" w:sz="4" w:val="single"/>
-              <w:bottom w:color="000000" w:space="0" w:sz="4" w:val="single"/>
-              <w:right w:color="000000" w:space="0" w:sz="4" w:val="single"/>
+              <w:top w:val="single" w:color="000000" w:themeColor="text1" w:sz="4" w:space="0"/>
+              <w:left w:val="single" w:color="000000" w:themeColor="text1" w:sz="4" w:space="0"/>
+              <w:bottom w:val="single" w:color="000000" w:themeColor="text1" w:sz="4" w:space="0"/>
+              <w:right w:val="single" w:color="000000" w:themeColor="text1" w:sz="4" w:space="0"/>
             </w:tcBorders>
-            <w:vAlign w:val="top"/>
-          </w:tcPr>
-          <w:p>
+            <w:tcMar/>
+            <w:vAlign w:val="top"/>
+          </w:tcPr>
+          <w:p wp14:textId="77777777">
             <w:pPr>
               <w:jc w:val="center"/>
               <w:rPr/>
@@ -3678,14 +3845,15 @@
         <w:tc>
           <w:tcPr>
             <w:tcBorders>
-              <w:top w:color="000000" w:space="0" w:sz="4" w:val="single"/>
-              <w:left w:color="000000" w:space="0" w:sz="4" w:val="single"/>
-              <w:bottom w:color="000000" w:space="0" w:sz="4" w:val="single"/>
-              <w:right w:color="000000" w:space="0" w:sz="4" w:val="single"/>
+              <w:top w:val="single" w:color="000000" w:themeColor="text1" w:sz="4" w:space="0"/>
+              <w:left w:val="single" w:color="000000" w:themeColor="text1" w:sz="4" w:space="0"/>
+              <w:bottom w:val="single" w:color="000000" w:themeColor="text1" w:sz="4" w:space="0"/>
+              <w:right w:val="single" w:color="000000" w:themeColor="text1" w:sz="4" w:space="0"/>
             </w:tcBorders>
-            <w:vAlign w:val="top"/>
-          </w:tcPr>
-          <w:p>
+            <w:tcMar/>
+            <w:vAlign w:val="top"/>
+          </w:tcPr>
+          <w:p wp14:textId="77777777">
             <w:pPr>
               <w:jc w:val="left"/>
               <w:rPr/>
@@ -3701,28 +3869,28 @@
         <w:tc>
           <w:tcPr>
             <w:tcBorders>
-              <w:top w:color="000000" w:space="0" w:sz="4" w:val="single"/>
-              <w:left w:color="000000" w:space="0" w:sz="4" w:val="single"/>
-              <w:bottom w:color="000000" w:space="0" w:sz="4" w:val="single"/>
-              <w:right w:color="000000" w:space="0" w:sz="4" w:val="single"/>
+              <w:top w:val="single" w:color="000000" w:themeColor="text1" w:sz="4" w:space="0"/>
+              <w:left w:val="single" w:color="000000" w:themeColor="text1" w:sz="4" w:space="0"/>
+              <w:bottom w:val="single" w:color="000000" w:themeColor="text1" w:sz="4" w:space="0"/>
+              <w:right w:val="single" w:color="000000" w:themeColor="text1" w:sz="4" w:space="0"/>
             </w:tcBorders>
-            <w:vAlign w:val="top"/>
-          </w:tcPr>
-          <w:p>
+            <w:tcMar/>
+            <w:vAlign w:val="top"/>
+          </w:tcPr>
+          <w:p wp14:textId="77777777">
             <w:pPr>
               <w:jc w:val="center"/>
-              <w:rPr/>
-            </w:pPr>
-            <w:r>
-              <w:rPr>
-                <w:rtl w:val="0"/>
-              </w:rPr>
-              <w:t xml:space="preserve">Correção do Caso de Uso</w:t>
+            </w:pPr>
+            <w:r>
+              <w:rPr>
+                <w:lang w:val="en-US"/>
+              </w:rPr>
+              <w:t>Correção do Caso de Uso</w:t>
             </w:r>
           </w:p>
         </w:tc>
       </w:tr>
-      <w:tr>
+      <w:tr xmlns:wp14="http://schemas.microsoft.com/office/word/2010/wordml" wp14:textId="77777777">
         <w:trPr>
           <w:cantSplit w:val="0"/>
           <w:tblHeader w:val="0"/>
@@ -3730,72 +3898,69 @@
         <w:tc>
           <w:tcPr>
             <w:tcBorders>
-              <w:top w:color="000000" w:space="0" w:sz="4" w:val="single"/>
-              <w:left w:color="000000" w:space="0" w:sz="4" w:val="single"/>
-              <w:bottom w:color="000000" w:space="0" w:sz="4" w:val="single"/>
-              <w:right w:color="000000" w:space="0" w:sz="4" w:val="single"/>
+              <w:top w:val="single" w:color="000000" w:themeColor="text1" w:sz="4" w:space="0"/>
+              <w:left w:val="single" w:color="000000" w:themeColor="text1" w:sz="4" w:space="0"/>
+              <w:bottom w:val="single" w:color="000000" w:themeColor="text1" w:sz="4" w:space="0"/>
+              <w:right w:val="single" w:color="000000" w:themeColor="text1" w:sz="4" w:space="0"/>
             </w:tcBorders>
-            <w:vAlign w:val="top"/>
-          </w:tcPr>
-          <w:p>
+            <w:tcMar/>
+            <w:vAlign w:val="top"/>
+          </w:tcPr>
+          <w:p wp14:textId="6453F280">
             <w:pPr>
               <w:jc w:val="center"/>
+            </w:pPr>
+            <w:r>
               <w:rPr/>
-            </w:pPr>
-            <w:r>
-              <w:rPr>
-                <w:rtl w:val="0"/>
-              </w:rPr>
+              <w:t>15/10/2026</w:t>
             </w:r>
           </w:p>
         </w:tc>
         <w:tc>
           <w:tcPr>
             <w:tcBorders>
-              <w:top w:color="000000" w:space="0" w:sz="4" w:val="single"/>
-              <w:left w:color="000000" w:space="0" w:sz="4" w:val="single"/>
-              <w:bottom w:color="000000" w:space="0" w:sz="4" w:val="single"/>
-              <w:right w:color="000000" w:space="0" w:sz="4" w:val="single"/>
+              <w:top w:val="single" w:color="000000" w:themeColor="text1" w:sz="4" w:space="0"/>
+              <w:left w:val="single" w:color="000000" w:themeColor="text1" w:sz="4" w:space="0"/>
+              <w:bottom w:val="single" w:color="000000" w:themeColor="text1" w:sz="4" w:space="0"/>
+              <w:right w:val="single" w:color="000000" w:themeColor="text1" w:sz="4" w:space="0"/>
             </w:tcBorders>
-            <w:vAlign w:val="top"/>
-          </w:tcPr>
-          <w:p>
+            <w:tcMar/>
+            <w:vAlign w:val="top"/>
+          </w:tcPr>
+          <w:p wp14:textId="79665DC9">
             <w:pPr>
               <w:jc w:val="left"/>
+            </w:pPr>
+            <w:r>
               <w:rPr/>
-            </w:pPr>
-            <w:r>
-              <w:rPr>
-                <w:rtl w:val="0"/>
-              </w:rPr>
+              <w:t>Juliano Carlos</w:t>
             </w:r>
           </w:p>
         </w:tc>
         <w:tc>
           <w:tcPr>
             <w:tcBorders>
-              <w:top w:color="000000" w:space="0" w:sz="4" w:val="single"/>
-              <w:left w:color="000000" w:space="0" w:sz="4" w:val="single"/>
-              <w:bottom w:color="000000" w:space="0" w:sz="4" w:val="single"/>
-              <w:right w:color="000000" w:space="0" w:sz="4" w:val="single"/>
+              <w:top w:val="single" w:color="000000" w:themeColor="text1" w:sz="4" w:space="0"/>
+              <w:left w:val="single" w:color="000000" w:themeColor="text1" w:sz="4" w:space="0"/>
+              <w:bottom w:val="single" w:color="000000" w:themeColor="text1" w:sz="4" w:space="0"/>
+              <w:right w:val="single" w:color="000000" w:themeColor="text1" w:sz="4" w:space="0"/>
             </w:tcBorders>
-            <w:vAlign w:val="top"/>
-          </w:tcPr>
-          <w:p>
+            <w:tcMar/>
+            <w:vAlign w:val="top"/>
+          </w:tcPr>
+          <w:p wp14:textId="3B0D0D39">
             <w:pPr>
               <w:jc w:val="center"/>
+            </w:pPr>
+            <w:r>
               <w:rPr/>
-            </w:pPr>
-            <w:r>
-              <w:rPr>
-                <w:rtl w:val="0"/>
-              </w:rPr>
+              <w:t>Limpeza de elementos de interface</w:t>
             </w:r>
           </w:p>
         </w:tc>
       </w:tr>
     </w:tbl>
-    <w:p>
+    <w:p xmlns:wp14="http://schemas.microsoft.com/office/word/2010/wordml" wp14:textId="77777777">
       <w:pPr>
         <w:rPr>
           <w:b w:val="1"/>
@@ -3812,9 +3977,10 @@
       </w:r>
     </w:p>
     <w:sectPr>
-      <w:pgSz w:h="16838" w:w="11906" w:orient="portrait"/>
-      <w:pgMar w:bottom="1418" w:top="1418" w:left="851" w:right="851" w:header="709" w:footer="709"/>
+      <w:pgSz w:w="11906" w:h="16838" w:orient="portrait"/>
+      <w:pgMar w:top="1418" w:right="851" w:bottom="1418" w:left="851" w:header="709" w:footer="709"/>
       <w:pgNumType w:start="1"/>
+      <w:cols w:num="1"/>
     </w:sectPr>
   </w:body>
 </w:document>
@@ -3931,6 +4097,7 @@
         <w:vertAlign w:val="baseline"/>
       </w:rPr>
     </w:lvl>
+    <w:nsid w:val="13f3732c"/>
   </w:abstractNum>
   <w:abstractNum w:abstractNumId="2">
     <w:lvl w:ilvl="0">
@@ -4041,6 +4208,7 @@
         <w:vertAlign w:val="baseline"/>
       </w:rPr>
     </w:lvl>
+    <w:nsid w:val="38b3152e"/>
   </w:abstractNum>
   <w:abstractNum w:abstractNumId="3">
     <w:lvl w:ilvl="0">
@@ -4151,6 +4319,7 @@
         <w:vertAlign w:val="baseline"/>
       </w:rPr>
     </w:lvl>
+    <w:nsid w:val="32ab02a1"/>
   </w:abstractNum>
   <w:abstractNum w:abstractNumId="4">
     <w:lvl w:ilvl="0">
@@ -4261,6 +4430,7 @@
         <w:vertAlign w:val="baseline"/>
       </w:rPr>
     </w:lvl>
+    <w:nsid w:val="39427f43"/>
   </w:abstractNum>
   <w:abstractNum w:abstractNumId="5">
     <w:lvl w:ilvl="0">
@@ -4371,6 +4541,7 @@
         <w:vertAlign w:val="baseline"/>
       </w:rPr>
     </w:lvl>
+    <w:nsid w:val="10446082"/>
   </w:abstractNum>
   <w:num w:numId="1">
     <w:abstractNumId w:val="1"/>
@@ -4391,7 +4562,7 @@
 </file>
 
 <file path=word/styles.xml><?xml version="1.0" encoding="utf-8"?>
-<w:styles xmlns:mc="http://schemas.openxmlformats.org/markup-compatibility/2006" xmlns:o="urn:schemas-microsoft-com:office:office" xmlns:r="http://schemas.openxmlformats.org/officeDocument/2006/relationships" xmlns:m="http://schemas.openxmlformats.org/officeDocument/2006/math" xmlns:v="urn:schemas-microsoft-com:vml" xmlns:wp="http://schemas.openxmlformats.org/drawingml/2006/wordprocessingDrawing" xmlns:w10="urn:schemas-microsoft-com:office:word" xmlns:w="http://schemas.openxmlformats.org/wordprocessingml/2006/main" xmlns:wne="http://schemas.microsoft.com/office/word/2006/wordml" xmlns:sl="http://schemas.openxmlformats.org/schemaLibrary/2006/main" xmlns:a="http://schemas.openxmlformats.org/drawingml/2006/main" xmlns:pic="http://schemas.openxmlformats.org/drawingml/2006/picture" xmlns:c="http://schemas.openxmlformats.org/drawingml/2006/chart" xmlns:lc="http://schemas.openxmlformats.org/drawingml/2006/lockedCanvas" xmlns:dgm="http://schemas.openxmlformats.org/drawingml/2006/diagram" xmlns:wps="http://schemas.microsoft.com/office/word/2010/wordprocessingShape" xmlns:wpg="http://schemas.microsoft.com/office/word/2010/wordprocessingGroup" xmlns:w14="http://schemas.microsoft.com/office/word/2010/wordml" xmlns:w15="http://schemas.microsoft.com/office/word/2012/wordml" xmlns:w16="http://schemas.microsoft.com/office/word/2018/wordml" xmlns:w16cex="http://schemas.microsoft.com/office/word/2018/wordml/cex" xmlns:w16cid="http://schemas.microsoft.com/office/word/2016/wordml/cid" xmlns="http://schemas.microsoft.com/office/tasks/2019/documenttasks" xmlns:cr="http://schemas.microsoft.com/office/comments/2020/reactions">
+<w:styles xmlns:wp14="http://schemas.microsoft.com/office/word/2010/wordprocessingDrawing" xmlns:mc="http://schemas.openxmlformats.org/markup-compatibility/2006" xmlns:o="urn:schemas-microsoft-com:office:office" xmlns:r="http://schemas.openxmlformats.org/officeDocument/2006/relationships" xmlns:m="http://schemas.openxmlformats.org/officeDocument/2006/math" xmlns:v="urn:schemas-microsoft-com:vml" xmlns:wp="http://schemas.openxmlformats.org/drawingml/2006/wordprocessingDrawing" xmlns:w10="urn:schemas-microsoft-com:office:word" xmlns:w="http://schemas.openxmlformats.org/wordprocessingml/2006/main" xmlns:wne="http://schemas.microsoft.com/office/word/2006/wordml" xmlns:sl="http://schemas.openxmlformats.org/schemaLibrary/2006/main" xmlns:a="http://schemas.openxmlformats.org/drawingml/2006/main" xmlns:pic="http://schemas.openxmlformats.org/drawingml/2006/picture" xmlns:c="http://schemas.openxmlformats.org/drawingml/2006/chart" xmlns:lc="http://schemas.openxmlformats.org/drawingml/2006/lockedCanvas" xmlns:dgm="http://schemas.openxmlformats.org/drawingml/2006/diagram" xmlns:wps="http://schemas.microsoft.com/office/word/2010/wordprocessingShape" xmlns:wpg="http://schemas.microsoft.com/office/word/2010/wordprocessingGroup" xmlns:w14="http://schemas.microsoft.com/office/word/2010/wordml" xmlns:w15="http://schemas.microsoft.com/office/word/2012/wordml" xmlns:w16="http://schemas.microsoft.com/office/word/2018/wordml" xmlns:w16cex="http://schemas.microsoft.com/office/word/2018/wordml/cex" xmlns:w16cid="http://schemas.microsoft.com/office/word/2016/wordml/cid" xmlns="http://schemas.microsoft.com/office/tasks/2019/documenttasks" xmlns:cr="http://schemas.microsoft.com/office/comments/2020/reactions" mc:Ignorable="wp14">
   <w:docDefaults>
     <w:rPrDefault>
       <w:rPr>
@@ -4405,7 +4576,7 @@
     </w:pPrDefault>
   </w:docDefaults>
   <w:style w:type="table" w:styleId="TableNormal" w:default="1">
-    <w:name w:val="TableNormal"/>
+    <w:name w:val="Normal Table"/>
     <w:tblPr>
       <w:tblCellMar>
         <w:top w:w="100.0" w:type="dxa"/>
@@ -4416,7 +4587,7 @@
     </w:tblPr>
   </w:style>
   <w:style w:type="paragraph" w:styleId="Normal" w:default="1">
-    <w:name w:val="normal"/>
+    <w:name w:val="Normal"/>
   </w:style>
   <w:style w:type="paragraph" w:styleId="Heading1">
     <w:name w:val="heading 1"/>
@@ -4455,7 +4626,7 @@
       <w:keepNext w:val="1"/>
       <w:keepLines w:val="1"/>
       <w:pageBreakBefore w:val="0"/>
-      <w:spacing w:after="80" w:before="280" w:lineRule="auto"/>
+      <w:spacing w:before="280" w:after="80" w:lineRule="auto"/>
     </w:pPr>
     <w:rPr>
       <w:b w:val="1"/>
@@ -4472,7 +4643,7 @@
       <w:keepNext w:val="1"/>
       <w:keepLines w:val="1"/>
       <w:pageBreakBefore w:val="0"/>
-      <w:spacing w:after="40" w:before="240" w:lineRule="auto"/>
+      <w:spacing w:before="240" w:after="40" w:lineRule="auto"/>
     </w:pPr>
     <w:rPr>
       <w:b w:val="1"/>
@@ -4489,7 +4660,7 @@
       <w:keepNext w:val="1"/>
       <w:keepLines w:val="1"/>
       <w:pageBreakBefore w:val="0"/>
-      <w:spacing w:after="40" w:before="220" w:lineRule="auto"/>
+      <w:spacing w:before="220" w:after="40" w:lineRule="auto"/>
     </w:pPr>
     <w:rPr>
       <w:b w:val="1"/>
@@ -4506,7 +4677,7 @@
       <w:keepNext w:val="1"/>
       <w:keepLines w:val="1"/>
       <w:pageBreakBefore w:val="0"/>
-      <w:spacing w:after="40" w:before="200" w:lineRule="auto"/>
+      <w:spacing w:before="200" w:after="40" w:lineRule="auto"/>
     </w:pPr>
     <w:rPr>
       <w:b w:val="1"/>
@@ -4538,10 +4709,10 @@
       <w:keepNext w:val="1"/>
       <w:keepLines w:val="1"/>
       <w:pageBreakBefore w:val="0"/>
-      <w:spacing w:after="80" w:before="360" w:lineRule="auto"/>
+      <w:spacing w:before="360" w:after="80" w:lineRule="auto"/>
     </w:pPr>
     <w:rPr>
-      <w:rFonts w:ascii="Georgia" w:cs="Georgia" w:eastAsia="Georgia" w:hAnsi="Georgia"/>
+      <w:rFonts w:ascii="Georgia" w:hAnsi="Georgia" w:eastAsia="Georgia" w:cs="Georgia"/>
       <w:i w:val="1"/>
       <w:iCs w:val="1"/>
       <w:color w:val="666666"/>

</xml_diff>

<commit_message>
docs: retira os detalhes de tela do fluxo principal do caso de uso de manter aluguel. Resolves #62
</commit_message>
<xml_diff>
--- a/Requisitos/Documentos de Casos de Uso/CSU05-Manter Aluguel Imóvel.docx
+++ b/Requisitos/Documentos de Casos de Uso/CSU05-Manter Aluguel Imóvel.docx
@@ -551,19 +551,11 @@
             </w:pPr>
             <w:r>
               <w:rPr>
-                <w:sz w:val="14"/>
-                <w:szCs w:val="14"/>
-                <w:lang w:val="en-US"/>
-              </w:rPr>
-              <w:t xml:space="preserve"> </w:t>
-            </w:r>
-            <w:r>
-              <w:rPr>
-                <w:sz w:val="28"/>
-                <w:szCs w:val="28"/>
-                <w:lang w:val="en-US"/>
-              </w:rPr>
-              <w:t>Ator seleciona a opção do menu do sistema (ícone com três linhas horizontais) (</w:t>
+                <w:sz w:val="28"/>
+                <w:szCs w:val="28"/>
+                <w:lang w:val="en-US"/>
+              </w:rPr>
+              <w:t xml:space="preserve">Ator seleciona a opção "Gestão de Imóveis" no menu (</w:t>
             </w:r>
             <w:r>
               <w:rPr>
@@ -572,24 +564,7 @@
                 <w:szCs w:val="28"/>
                 <w:lang w:val="en-US"/>
               </w:rPr>
-              <w:t>Tela_001</w:t>
-            </w:r>
-            <w:r>
-              <w:rPr>
-                <w:sz w:val="28"/>
-                <w:szCs w:val="28"/>
-                <w:lang w:val="en-US"/>
-              </w:rPr>
-              <w:t>) e, em seguida, seleciona a opção "Gestão de Imóveis" (</w:t>
-            </w:r>
-            <w:r>
-              <w:rPr>
-                <w:color w:val="FF0000"/>
-                <w:sz w:val="28"/>
-                <w:szCs w:val="28"/>
-                <w:lang w:val="en-US"/>
-              </w:rPr>
-              <w:t>Tela_001.1</w:t>
+              <w:t xml:space="preserve">Tela_001.1</w:t>
             </w:r>
             <w:r>
               <w:rPr>
@@ -619,7 +594,7 @@
                 <w:szCs w:val="28"/>
                 <w:lang w:val="en-US"/>
               </w:rPr>
-              <w:t>Sistema exibe tela listando todos os anúncios de imóveis cadastrados pelo proprietário, com opção de busca (</w:t>
+              <w:t xml:space="preserve">Sistema exibe os imóveis do proprietário (</w:t>
             </w:r>
             <w:r>
               <w:rPr>
@@ -628,7 +603,7 @@
                 <w:szCs w:val="28"/>
                 <w:lang w:val="en-US"/>
               </w:rPr>
-              <w:t>Tela_010</w:t>
+              <w:t xml:space="preserve">Tela_010</w:t>
             </w:r>
             <w:r>
               <w:rPr>
@@ -658,7 +633,7 @@
                 <w:szCs w:val="28"/>
                 <w:lang w:val="en-US"/>
               </w:rPr>
-              <w:t>Ator seleciona uma das opções disponibilizadas pelo sistema para o imóvel escolhido: vincular inquilino, ver aluguel, editar aluguel ou cancelar aluguel.</w:t>
+              <w:t xml:space="preserve">Ator seleciona uma das opções disponibilizadas pelo sistema para o imóvel escolhido.</w:t>
             </w:r>
           </w:p>
           <w:p wp14:textId="77777777">
@@ -680,7 +655,7 @@
                 <w:szCs w:val="28"/>
                 <w:lang w:val="en-US"/>
               </w:rPr>
-              <w:t>4. Caso a opção seja:</w:t>
+              <w:t xml:space="preserve">Caso a opção seja:</w:t>
             </w:r>
           </w:p>
           <w:p wp14:textId="77777777">
@@ -708,32 +683,15 @@
                 <w:szCs w:val="28"/>
                 <w:lang w:val="en-US"/>
               </w:rPr>
-              <w:t>Alugar:</w:t>
-            </w:r>
-            <w:r>
-              <w:rPr>
-                <w:sz w:val="28"/>
-                <w:szCs w:val="28"/>
-                <w:lang w:val="en-US"/>
-              </w:rPr>
-              <w:t xml:space="preserve"> Ator pressiona o botão referente ao imóvel disponível escolhido, e o sistema exibe a tela de vínculo do inquilino (</w:t>
-            </w:r>
-            <w:r>
-              <w:rPr>
-                <w:color w:val="FF0000"/>
-                <w:sz w:val="28"/>
-                <w:szCs w:val="28"/>
-                <w:lang w:val="en-US"/>
-              </w:rPr>
-              <w:t>Tela_011</w:t>
-            </w:r>
-            <w:r>
-              <w:rPr>
-                <w:sz w:val="28"/>
-                <w:szCs w:val="28"/>
-                <w:lang w:val="en-US"/>
-              </w:rPr>
-              <w:t xml:space="preserve">); </w:t>
+              <w:t xml:space="preserve">Alugar:</w:t>
+            </w:r>
+            <w:r>
+              <w:rPr>
+                <w:sz w:val="28"/>
+                <w:szCs w:val="28"/>
+                <w:lang w:val="en-US"/>
+              </w:rPr>
+              <w:t xml:space="preserve"> Ver Seção Alugar Aluguel;</w:t>
             </w:r>
           </w:p>
           <w:p wp14:textId="77777777">
@@ -770,24 +728,7 @@
                 <w:szCs w:val="28"/>
                 <w:lang w:val="en-US"/>
               </w:rPr>
-              <w:t xml:space="preserve"> Ator pressiona o botão "Ver aluguel" referente a um imóvel já alugado, e o sistema exibe os dados do aluguel e o histórico de pagamentos (</w:t>
-            </w:r>
-            <w:r>
-              <w:rPr>
-                <w:color w:val="ff0000"/>
-                <w:sz w:val="28"/>
-                <w:szCs w:val="28"/>
-                <w:lang w:val="en-US"/>
-              </w:rPr>
-              <w:t xml:space="preserve">Tela_012</w:t>
-            </w:r>
-            <w:r>
-              <w:rPr>
-                <w:sz w:val="28"/>
-                <w:szCs w:val="28"/>
-                <w:lang w:val="en-US"/>
-              </w:rPr>
-              <w:t xml:space="preserve">); </w:t>
+              <w:t xml:space="preserve"> Ver Seção Ver Aluguel;</w:t>
             </w:r>
             <w:r>
               <w:rPr>
@@ -829,24 +770,7 @@
                 <w:szCs w:val="28"/>
                 <w:lang w:val="en-US"/>
               </w:rPr>
-              <w:t xml:space="preserve"> Ator pressiona o botão "Ver aluguel" referente a um imóvel já alugado (</w:t>
-            </w:r>
-            <w:r>
-              <w:rPr>
-                <w:color w:val="ff0000"/>
-                <w:sz w:val="28"/>
-                <w:szCs w:val="28"/>
-                <w:lang w:val="en-US"/>
-              </w:rPr>
-              <w:t xml:space="preserve">Tela_012</w:t>
-            </w:r>
-            <w:r>
-              <w:rPr>
-                <w:sz w:val="28"/>
-                <w:szCs w:val="28"/>
-                <w:lang w:val="en-US"/>
-              </w:rPr>
-              <w:t xml:space="preserve">) e edita os dados do inquilino exibidos; </w:t>
+              <w:t xml:space="preserve"> Ver Seção Alterar Dados do Aluguel;</w:t>
             </w:r>
             <w:r>
               <w:rPr>
@@ -879,32 +803,15 @@
                 <w:szCs w:val="28"/>
                 <w:lang w:val="en-US"/>
               </w:rPr>
-              <w:t>Cancelar Aluguel:</w:t>
-            </w:r>
-            <w:r>
-              <w:rPr>
-                <w:sz w:val="28"/>
-                <w:szCs w:val="28"/>
-                <w:lang w:val="en-US"/>
-              </w:rPr>
-              <w:t xml:space="preserve"> Ator pressiona o botão "Ver aluguel" referente a um imóvel já alugado (</w:t>
-            </w:r>
-            <w:r>
-              <w:rPr>
-                <w:color w:val="FF0000"/>
-                <w:sz w:val="28"/>
-                <w:szCs w:val="28"/>
-                <w:lang w:val="en-US"/>
-              </w:rPr>
-              <w:t>Tela_012</w:t>
-            </w:r>
-            <w:r>
-              <w:rPr>
-                <w:sz w:val="28"/>
-                <w:szCs w:val="28"/>
-                <w:lang w:val="en-US"/>
-              </w:rPr>
-              <w:t xml:space="preserve">) e, em seguida, pressiona o botão "Cancelar Aluguel". </w:t>
+              <w:t xml:space="preserve">Cancelar Aluguel:</w:t>
+            </w:r>
+            <w:r>
+              <w:rPr>
+                <w:sz w:val="28"/>
+                <w:szCs w:val="28"/>
+                <w:lang w:val="en-US"/>
+              </w:rPr>
+              <w:t xml:space="preserve"> Ver Seção Cancelar Aluguel.</w:t>
             </w:r>
           </w:p>
           <w:p wp14:textId="77777777">
@@ -4030,6 +3937,77 @@
                 <w:lang w:val="en-US"/>
               </w:rPr>
               <w:t>Limpeza de elementos de interface</w:t>
+            </w:r>
+          </w:p>
+        </w:tc>
+      </w:tr>
+      <w:tr>
+        <w:trPr>
+          <w:cantSplit w:val="0"/>
+          <w:tblHeader w:val="0"/>
+        </w:trPr>
+        <w:tc>
+          <w:tcPr>
+            <w:tcBorders>
+              <w:top w:val="single" w:color="000000" w:themeColor="text1" w:sz="4" w:space="0"/>
+              <w:left w:val="single" w:color="000000" w:themeColor="text1" w:sz="4" w:space="0"/>
+              <w:bottom w:val="single" w:color="000000" w:themeColor="text1" w:sz="4" w:space="0"/>
+              <w:right w:val="single" w:color="000000" w:themeColor="text1" w:sz="4" w:space="0"/>
+            </w:tcBorders>
+            <w:tcMar/>
+            <w:vAlign w:val="top"/>
+          </w:tcPr>
+          <w:p>
+            <w:pPr>
+              <w:jc w:val="center"/>
+            </w:pPr>
+            <w:r>
+              <w:rPr/>
+              <w:t>15/10/2026</w:t>
+            </w:r>
+          </w:p>
+        </w:tc>
+        <w:tc>
+          <w:tcPr>
+            <w:tcBorders>
+              <w:top w:val="single" w:color="000000" w:themeColor="text1" w:sz="4" w:space="0"/>
+              <w:left w:val="single" w:color="000000" w:themeColor="text1" w:sz="4" w:space="0"/>
+              <w:bottom w:val="single" w:color="000000" w:themeColor="text1" w:sz="4" w:space="0"/>
+              <w:right w:val="single" w:color="000000" w:themeColor="text1" w:sz="4" w:space="0"/>
+            </w:tcBorders>
+            <w:tcMar/>
+            <w:vAlign w:val="top"/>
+          </w:tcPr>
+          <w:p>
+            <w:pPr>
+              <w:jc w:val="left"/>
+            </w:pPr>
+            <w:r>
+              <w:rPr/>
+              <w:t>Yasmim Passos</w:t>
+            </w:r>
+          </w:p>
+        </w:tc>
+        <w:tc>
+          <w:tcPr>
+            <w:tcBorders>
+              <w:top w:val="single" w:color="000000" w:themeColor="text1" w:sz="4" w:space="0"/>
+              <w:left w:val="single" w:color="000000" w:themeColor="text1" w:sz="4" w:space="0"/>
+              <w:bottom w:val="single" w:color="000000" w:themeColor="text1" w:sz="4" w:space="0"/>
+              <w:right w:val="single" w:color="000000" w:themeColor="text1" w:sz="4" w:space="0"/>
+            </w:tcBorders>
+            <w:tcMar/>
+            <w:vAlign w:val="top"/>
+          </w:tcPr>
+          <w:p>
+            <w:pPr>
+              <w:jc w:val="center"/>
+            </w:pPr>
+            <w:r>
+              <w:rPr>
+                <w:lang w:val="en-US"/>
+              </w:rPr>
+              <w:t>Remoção de detalhes de tela do fluxo principal</w:t>
             </w:r>
           </w:p>
         </w:tc>

</xml_diff>